<commit_message>
Updated to v8.3 with Climate Library v6
</commit_message>
<xml_diff>
--- a/docs/LANDIS-II Net Ecosystem CN Succession v8 User Guide.docx
+++ b/docs/LANDIS-II Net Ecosystem CN Succession v8 User Guide.docx
@@ -1,6 +1,6 @@
 
 <file path=word/document.xml><?xml version="1.0" encoding="utf-8"?>
-<w:document xmlns:wpc="http://schemas.microsoft.com/office/word/2010/wordprocessingCanvas" xmlns:cx="http://schemas.microsoft.com/office/drawing/2014/chartex" xmlns:cx1="http://schemas.microsoft.com/office/drawing/2015/9/8/chartex" xmlns:cx2="http://schemas.microsoft.com/office/drawing/2015/10/21/chartex" xmlns:cx3="http://schemas.microsoft.com/office/drawing/2016/5/9/chartex" xmlns:cx4="http://schemas.microsoft.com/office/drawing/2016/5/10/chartex" xmlns:cx5="http://schemas.microsoft.com/office/drawing/2016/5/11/chartex" xmlns:cx6="http://schemas.microsoft.com/office/drawing/2016/5/12/chartex" xmlns:cx7="http://schemas.microsoft.com/office/drawing/2016/5/13/chartex" xmlns:cx8="http://schemas.microsoft.com/office/drawing/2016/5/14/chartex" xmlns:mc="http://schemas.openxmlformats.org/markup-compatibility/2006" xmlns:aink="http://schemas.microsoft.com/office/drawing/2016/ink" xmlns:am3d="http://schemas.microsoft.com/office/drawing/2017/model3d" xmlns:o="urn:schemas-microsoft-com:office:office" xmlns:oel="http://schemas.microsoft.com/office/2019/extlst" xmlns:r="http://schemas.openxmlformats.org/officeDocument/2006/relationships" xmlns:m="http://schemas.openxmlformats.org/officeDocument/2006/math" xmlns:v="urn:schemas-microsoft-com:vml" xmlns:wp14="http://schemas.microsoft.com/office/word/2010/wordprocessingDrawing" xmlns:wp="http://schemas.openxmlformats.org/drawingml/2006/wordprocessingDrawing" xmlns:w10="urn:schemas-microsoft-com:office:word" xmlns:w="http://schemas.openxmlformats.org/wordprocessingml/2006/main" xmlns:w14="http://schemas.microsoft.com/office/word/2010/wordml" xmlns:w15="http://schemas.microsoft.com/office/word/2012/wordml" xmlns:w16cex="http://schemas.microsoft.com/office/word/2018/wordml/cex" xmlns:w16cid="http://schemas.microsoft.com/office/word/2016/wordml/cid" xmlns:w16="http://schemas.microsoft.com/office/word/2018/wordml" xmlns:w16du="http://schemas.microsoft.com/office/word/2023/wordml/word16du" xmlns:w16sdtdh="http://schemas.microsoft.com/office/word/2020/wordml/sdtdatahash" xmlns:w16sdtfl="http://schemas.microsoft.com/office/word/2024/wordml/sdtformatlock" xmlns:w16se="http://schemas.microsoft.com/office/word/2015/wordml/symex" xmlns:wpg="http://schemas.microsoft.com/office/word/2010/wordprocessingGroup" xmlns:wpi="http://schemas.microsoft.com/office/word/2010/wordprocessingInk" xmlns:wne="http://schemas.microsoft.com/office/word/2006/wordml" xmlns:wps="http://schemas.microsoft.com/office/word/2010/wordprocessingShape" mc:Ignorable="w14 w15 w16se w16cid w16 w16cex w16sdtdh w16sdtfl w16du wp14">
+<w:document xmlns:wpc="http://schemas.microsoft.com/office/word/2010/wordprocessingCanvas" xmlns:cx="http://schemas.microsoft.com/office/drawing/2014/chartex" xmlns:cx1="http://schemas.microsoft.com/office/drawing/2015/9/8/chartex" xmlns:cx2="http://schemas.microsoft.com/office/drawing/2015/10/21/chartex" xmlns:cx3="http://schemas.microsoft.com/office/drawing/2016/5/9/chartex" xmlns:cx4="http://schemas.microsoft.com/office/drawing/2016/5/10/chartex" xmlns:cx5="http://schemas.microsoft.com/office/drawing/2016/5/11/chartex" xmlns:cx6="http://schemas.microsoft.com/office/drawing/2016/5/12/chartex" xmlns:cx7="http://schemas.microsoft.com/office/drawing/2016/5/13/chartex" xmlns:cx8="http://schemas.microsoft.com/office/drawing/2016/5/14/chartex" xmlns:mc="http://schemas.openxmlformats.org/markup-compatibility/2006" xmlns:aink="http://schemas.microsoft.com/office/drawing/2016/ink" xmlns:am3d="http://schemas.microsoft.com/office/drawing/2017/model3d" xmlns:o="urn:schemas-microsoft-com:office:office" xmlns:oel="http://schemas.microsoft.com/office/2019/extlst" xmlns:r="http://schemas.openxmlformats.org/officeDocument/2006/relationships" xmlns:m="http://schemas.openxmlformats.org/officeDocument/2006/math" xmlns:v="urn:schemas-microsoft-com:vml" xmlns:wp14="http://schemas.microsoft.com/office/word/2010/wordprocessingDrawing" xmlns:wp="http://schemas.openxmlformats.org/drawingml/2006/wordprocessingDrawing" xmlns:w10="urn:schemas-microsoft-com:office:word" xmlns:w="http://schemas.openxmlformats.org/wordprocessingml/2006/main" xmlns:w14="http://schemas.microsoft.com/office/word/2010/wordml" xmlns:w15="http://schemas.microsoft.com/office/word/2012/wordml" xmlns:w16cei="http://schemas.microsoft.com/office/word/2026/wordml/cei" xmlns:w16cex="http://schemas.microsoft.com/office/word/2018/wordml/cex" xmlns:w16cid="http://schemas.microsoft.com/office/word/2016/wordml/cid" xmlns:w16="http://schemas.microsoft.com/office/word/2018/wordml" xmlns:w16du="http://schemas.microsoft.com/office/word/2023/wordml/word16du" xmlns:w16sdtdh="http://schemas.microsoft.com/office/word/2020/wordml/sdtdatahash" xmlns:w16sdtfl="http://schemas.microsoft.com/office/word/2024/wordml/sdtformatlock" xmlns:w16se="http://schemas.microsoft.com/office/word/2015/wordml/symex" xmlns:wpg="http://schemas.microsoft.com/office/word/2010/wordprocessingGroup" xmlns:wpi="http://schemas.microsoft.com/office/word/2010/wordprocessingInk" xmlns:wne="http://schemas.microsoft.com/office/word/2006/wordml" xmlns:wps="http://schemas.microsoft.com/office/word/2010/wordprocessingShape" mc:Ignorable="w14 w15 w16se w16cid w16 w16cex w16sdtdh w16sdtfl w16du wp14">
   <w:body>
     <w:p>
       <w:pPr>
@@ -89,7 +89,7 @@
         <w:rPr>
           <w:rStyle w:val="titleline1Char"/>
         </w:rPr>
-        <w:t>8.2</w:t>
+        <w:t>8.3</w:t>
       </w:r>
       <w:r>
         <w:rPr>
@@ -322,7 +322,7 @@
         <w:rPr>
           <w:noProof/>
         </w:rPr>
-        <w:t>March 27, 2026</w:t>
+        <w:t>September 8, 2026</w:t>
       </w:r>
       <w:r>
         <w:rPr>
@@ -403,7 +403,7 @@
       <w:r>
         <w:fldChar w:fldCharType="separate"/>
       </w:r>
-      <w:hyperlink w:anchor="_Toc225506449" w:history="1">
+      <w:hyperlink w:anchor="_Toc239765730" w:history="1">
         <w:r>
           <w:rPr>
             <w:rStyle w:val="Hyperlink"/>
@@ -451,7 +451,7 @@
             <w:noProof/>
             <w:webHidden/>
           </w:rPr>
-          <w:instrText xml:space="preserve"> PAGEREF _Toc225506449 \h </w:instrText>
+          <w:instrText xml:space="preserve"> PAGEREF _Toc239765730 \h </w:instrText>
         </w:r>
         <w:r>
           <w:rPr>
@@ -494,7 +494,7 @@
           <w14:ligatures w14:val="standardContextual"/>
         </w:rPr>
       </w:pPr>
-      <w:hyperlink w:anchor="_Toc225506450" w:history="1">
+      <w:hyperlink w:anchor="_Toc239765731" w:history="1">
         <w:r>
           <w:rPr>
             <w:rStyle w:val="Hyperlink"/>
@@ -539,7 +539,7 @@
             <w:noProof/>
             <w:webHidden/>
           </w:rPr>
-          <w:instrText xml:space="preserve"> PAGEREF _Toc225506450 \h </w:instrText>
+          <w:instrText xml:space="preserve"> PAGEREF _Toc239765731 \h </w:instrText>
         </w:r>
         <w:r>
           <w:rPr>
@@ -582,7 +582,7 @@
           <w14:ligatures w14:val="standardContextual"/>
         </w:rPr>
       </w:pPr>
-      <w:hyperlink w:anchor="_Toc225506451" w:history="1">
+      <w:hyperlink w:anchor="_Toc239765732" w:history="1">
         <w:r>
           <w:rPr>
             <w:rStyle w:val="Hyperlink"/>
@@ -627,7 +627,7 @@
             <w:noProof/>
             <w:webHidden/>
           </w:rPr>
-          <w:instrText xml:space="preserve"> PAGEREF _Toc225506451 \h </w:instrText>
+          <w:instrText xml:space="preserve"> PAGEREF _Toc239765732 \h </w:instrText>
         </w:r>
         <w:r>
           <w:rPr>
@@ -670,7 +670,7 @@
           <w14:ligatures w14:val="standardContextual"/>
         </w:rPr>
       </w:pPr>
-      <w:hyperlink w:anchor="_Toc225506452" w:history="1">
+      <w:hyperlink w:anchor="_Toc239765733" w:history="1">
         <w:r>
           <w:rPr>
             <w:rStyle w:val="Hyperlink"/>
@@ -715,7 +715,7 @@
             <w:noProof/>
             <w:webHidden/>
           </w:rPr>
-          <w:instrText xml:space="preserve"> PAGEREF _Toc225506452 \h </w:instrText>
+          <w:instrText xml:space="preserve"> PAGEREF _Toc239765733 \h </w:instrText>
         </w:r>
         <w:r>
           <w:rPr>
@@ -760,7 +760,7 @@
           <w14:ligatures w14:val="standardContextual"/>
         </w:rPr>
       </w:pPr>
-      <w:hyperlink w:anchor="_Toc225506453" w:history="1">
+      <w:hyperlink w:anchor="_Toc239765734" w:history="1">
         <w:r>
           <w:rPr>
             <w:rStyle w:val="Hyperlink"/>
@@ -807,7 +807,7 @@
             <w:noProof/>
             <w:webHidden/>
           </w:rPr>
-          <w:instrText xml:space="preserve"> PAGEREF _Toc225506453 \h </w:instrText>
+          <w:instrText xml:space="preserve"> PAGEREF _Toc239765734 \h </w:instrText>
         </w:r>
         <w:r>
           <w:rPr>
@@ -852,7 +852,7 @@
           <w14:ligatures w14:val="standardContextual"/>
         </w:rPr>
       </w:pPr>
-      <w:hyperlink w:anchor="_Toc225506454" w:history="1">
+      <w:hyperlink w:anchor="_Toc239765735" w:history="1">
         <w:r>
           <w:rPr>
             <w:rStyle w:val="Hyperlink"/>
@@ -899,7 +899,7 @@
             <w:noProof/>
             <w:webHidden/>
           </w:rPr>
-          <w:instrText xml:space="preserve"> PAGEREF _Toc225506454 \h </w:instrText>
+          <w:instrText xml:space="preserve"> PAGEREF _Toc239765735 \h </w:instrText>
         </w:r>
         <w:r>
           <w:rPr>
@@ -942,7 +942,7 @@
           <w14:ligatures w14:val="standardContextual"/>
         </w:rPr>
       </w:pPr>
-      <w:hyperlink w:anchor="_Toc225506455" w:history="1">
+      <w:hyperlink w:anchor="_Toc239765736" w:history="1">
         <w:r>
           <w:rPr>
             <w:rStyle w:val="Hyperlink"/>
@@ -987,7 +987,7 @@
             <w:noProof/>
             <w:webHidden/>
           </w:rPr>
-          <w:instrText xml:space="preserve"> PAGEREF _Toc225506455 \h </w:instrText>
+          <w:instrText xml:space="preserve"> PAGEREF _Toc239765736 \h </w:instrText>
         </w:r>
         <w:r>
           <w:rPr>
@@ -1030,7 +1030,7 @@
           <w14:ligatures w14:val="standardContextual"/>
         </w:rPr>
       </w:pPr>
-      <w:hyperlink w:anchor="_Toc225506456" w:history="1">
+      <w:hyperlink w:anchor="_Toc239765737" w:history="1">
         <w:r>
           <w:rPr>
             <w:rStyle w:val="Hyperlink"/>
@@ -1075,7 +1075,7 @@
             <w:noProof/>
             <w:webHidden/>
           </w:rPr>
-          <w:instrText xml:space="preserve"> PAGEREF _Toc225506456 \h </w:instrText>
+          <w:instrText xml:space="preserve"> PAGEREF _Toc239765737 \h </w:instrText>
         </w:r>
         <w:r>
           <w:rPr>
@@ -1118,7 +1118,7 @@
           <w14:ligatures w14:val="standardContextual"/>
         </w:rPr>
       </w:pPr>
-      <w:hyperlink w:anchor="_Toc225506457" w:history="1">
+      <w:hyperlink w:anchor="_Toc239765738" w:history="1">
         <w:r>
           <w:rPr>
             <w:rStyle w:val="Hyperlink"/>
@@ -1163,7 +1163,7 @@
             <w:noProof/>
             <w:webHidden/>
           </w:rPr>
-          <w:instrText xml:space="preserve"> PAGEREF _Toc225506457 \h </w:instrText>
+          <w:instrText xml:space="preserve"> PAGEREF _Toc239765738 \h </w:instrText>
         </w:r>
         <w:r>
           <w:rPr>
@@ -1206,7 +1206,7 @@
           <w14:ligatures w14:val="standardContextual"/>
         </w:rPr>
       </w:pPr>
-      <w:hyperlink w:anchor="_Toc225506458" w:history="1">
+      <w:hyperlink w:anchor="_Toc239765739" w:history="1">
         <w:r>
           <w:rPr>
             <w:rStyle w:val="Hyperlink"/>
@@ -1251,7 +1251,7 @@
             <w:noProof/>
             <w:webHidden/>
           </w:rPr>
-          <w:instrText xml:space="preserve"> PAGEREF _Toc225506458 \h </w:instrText>
+          <w:instrText xml:space="preserve"> PAGEREF _Toc239765739 \h </w:instrText>
         </w:r>
         <w:r>
           <w:rPr>
@@ -1294,7 +1294,7 @@
           <w14:ligatures w14:val="standardContextual"/>
         </w:rPr>
       </w:pPr>
-      <w:hyperlink w:anchor="_Toc225506459" w:history="1">
+      <w:hyperlink w:anchor="_Toc239765740" w:history="1">
         <w:r>
           <w:rPr>
             <w:rStyle w:val="Hyperlink"/>
@@ -1339,7 +1339,7 @@
             <w:noProof/>
             <w:webHidden/>
           </w:rPr>
-          <w:instrText xml:space="preserve"> PAGEREF _Toc225506459 \h </w:instrText>
+          <w:instrText xml:space="preserve"> PAGEREF _Toc239765740 \h </w:instrText>
         </w:r>
         <w:r>
           <w:rPr>
@@ -1382,7 +1382,7 @@
           <w14:ligatures w14:val="standardContextual"/>
         </w:rPr>
       </w:pPr>
-      <w:hyperlink w:anchor="_Toc225506460" w:history="1">
+      <w:hyperlink w:anchor="_Toc239765741" w:history="1">
         <w:r>
           <w:rPr>
             <w:rStyle w:val="Hyperlink"/>
@@ -1427,7 +1427,7 @@
             <w:noProof/>
             <w:webHidden/>
           </w:rPr>
-          <w:instrText xml:space="preserve"> PAGEREF _Toc225506460 \h </w:instrText>
+          <w:instrText xml:space="preserve"> PAGEREF _Toc239765741 \h </w:instrText>
         </w:r>
         <w:r>
           <w:rPr>
@@ -1470,7 +1470,7 @@
           <w14:ligatures w14:val="standardContextual"/>
         </w:rPr>
       </w:pPr>
-      <w:hyperlink w:anchor="_Toc225506461" w:history="1">
+      <w:hyperlink w:anchor="_Toc239765742" w:history="1">
         <w:r>
           <w:rPr>
             <w:rStyle w:val="Hyperlink"/>
@@ -1515,7 +1515,7 @@
             <w:noProof/>
             <w:webHidden/>
           </w:rPr>
-          <w:instrText xml:space="preserve"> PAGEREF _Toc225506461 \h </w:instrText>
+          <w:instrText xml:space="preserve"> PAGEREF _Toc239765742 \h </w:instrText>
         </w:r>
         <w:r>
           <w:rPr>
@@ -1558,7 +1558,7 @@
           <w14:ligatures w14:val="standardContextual"/>
         </w:rPr>
       </w:pPr>
-      <w:hyperlink w:anchor="_Toc225506462" w:history="1">
+      <w:hyperlink w:anchor="_Toc239765743" w:history="1">
         <w:r>
           <w:rPr>
             <w:rStyle w:val="Hyperlink"/>
@@ -1603,7 +1603,7 @@
             <w:noProof/>
             <w:webHidden/>
           </w:rPr>
-          <w:instrText xml:space="preserve"> PAGEREF _Toc225506462 \h </w:instrText>
+          <w:instrText xml:space="preserve"> PAGEREF _Toc239765743 \h </w:instrText>
         </w:r>
         <w:r>
           <w:rPr>
@@ -1648,7 +1648,7 @@
           <w14:ligatures w14:val="standardContextual"/>
         </w:rPr>
       </w:pPr>
-      <w:hyperlink w:anchor="_Toc225506463" w:history="1">
+      <w:hyperlink w:anchor="_Toc239765744" w:history="1">
         <w:r>
           <w:rPr>
             <w:rStyle w:val="Hyperlink"/>
@@ -1674,7 +1674,7 @@
             <w:rStyle w:val="Hyperlink"/>
             <w:noProof/>
           </w:rPr>
-          <w:t>Version 8.2 (March 2026)</w:t>
+          <w:t>Version 8.3 (September 2026)</w:t>
         </w:r>
         <w:r>
           <w:rPr>
@@ -1695,7 +1695,7 @@
             <w:noProof/>
             <w:webHidden/>
           </w:rPr>
-          <w:instrText xml:space="preserve"> PAGEREF _Toc225506463 \h </w:instrText>
+          <w:instrText xml:space="preserve"> PAGEREF _Toc239765744 \h </w:instrText>
         </w:r>
         <w:r>
           <w:rPr>
@@ -1740,7 +1740,7 @@
           <w14:ligatures w14:val="standardContextual"/>
         </w:rPr>
       </w:pPr>
-      <w:hyperlink w:anchor="_Toc225506464" w:history="1">
+      <w:hyperlink w:anchor="_Toc239765745" w:history="1">
         <w:r>
           <w:rPr>
             <w:rStyle w:val="Hyperlink"/>
@@ -1766,7 +1766,7 @@
             <w:rStyle w:val="Hyperlink"/>
             <w:noProof/>
           </w:rPr>
-          <w:t>Version 8.1 (October 2025)</w:t>
+          <w:t>Version 8.2 (March 2026)</w:t>
         </w:r>
         <w:r>
           <w:rPr>
@@ -1787,7 +1787,7 @@
             <w:noProof/>
             <w:webHidden/>
           </w:rPr>
-          <w:instrText xml:space="preserve"> PAGEREF _Toc225506464 \h </w:instrText>
+          <w:instrText xml:space="preserve"> PAGEREF _Toc239765745 \h </w:instrText>
         </w:r>
         <w:r>
           <w:rPr>
@@ -1832,7 +1832,7 @@
           <w14:ligatures w14:val="standardContextual"/>
         </w:rPr>
       </w:pPr>
-      <w:hyperlink w:anchor="_Toc225506465" w:history="1">
+      <w:hyperlink w:anchor="_Toc239765746" w:history="1">
         <w:r>
           <w:rPr>
             <w:rStyle w:val="Hyperlink"/>
@@ -1858,7 +1858,7 @@
             <w:rStyle w:val="Hyperlink"/>
             <w:noProof/>
           </w:rPr>
-          <w:t>Version 8.0 (August 2024)</w:t>
+          <w:t>Version 8.1 (October 2025)</w:t>
         </w:r>
         <w:r>
           <w:rPr>
@@ -1879,7 +1879,7 @@
             <w:noProof/>
             <w:webHidden/>
           </w:rPr>
-          <w:instrText xml:space="preserve"> PAGEREF _Toc225506465 \h </w:instrText>
+          <w:instrText xml:space="preserve"> PAGEREF _Toc239765746 \h </w:instrText>
         </w:r>
         <w:r>
           <w:rPr>
@@ -1924,7 +1924,7 @@
           <w14:ligatures w14:val="standardContextual"/>
         </w:rPr>
       </w:pPr>
-      <w:hyperlink w:anchor="_Toc225506466" w:history="1">
+      <w:hyperlink w:anchor="_Toc239765747" w:history="1">
         <w:r>
           <w:rPr>
             <w:rStyle w:val="Hyperlink"/>
@@ -1950,7 +1950,7 @@
             <w:rStyle w:val="Hyperlink"/>
             <w:noProof/>
           </w:rPr>
-          <w:t>Version 7.0 (September 2023)</w:t>
+          <w:t>Version 8.0 (August 2024)</w:t>
         </w:r>
         <w:r>
           <w:rPr>
@@ -1971,7 +1971,7 @@
             <w:noProof/>
             <w:webHidden/>
           </w:rPr>
-          <w:instrText xml:space="preserve"> PAGEREF _Toc225506466 \h </w:instrText>
+          <w:instrText xml:space="preserve"> PAGEREF _Toc239765747 \h </w:instrText>
         </w:r>
         <w:r>
           <w:rPr>
@@ -2016,7 +2016,7 @@
           <w14:ligatures w14:val="standardContextual"/>
         </w:rPr>
       </w:pPr>
-      <w:hyperlink w:anchor="_Toc225506467" w:history="1">
+      <w:hyperlink w:anchor="_Toc239765748" w:history="1">
         <w:r>
           <w:rPr>
             <w:rStyle w:val="Hyperlink"/>
@@ -2042,7 +2042,7 @@
             <w:rStyle w:val="Hyperlink"/>
             <w:noProof/>
           </w:rPr>
-          <w:t>Version 6.10 (April 2022)</w:t>
+          <w:t>Version 7.0 (September 2023)</w:t>
         </w:r>
         <w:r>
           <w:rPr>
@@ -2063,7 +2063,7 @@
             <w:noProof/>
             <w:webHidden/>
           </w:rPr>
-          <w:instrText xml:space="preserve"> PAGEREF _Toc225506467 \h </w:instrText>
+          <w:instrText xml:space="preserve"> PAGEREF _Toc239765748 \h </w:instrText>
         </w:r>
         <w:r>
           <w:rPr>
@@ -2083,7 +2083,7 @@
             <w:noProof/>
             <w:webHidden/>
           </w:rPr>
-          <w:t>10</w:t>
+          <w:t>8</w:t>
         </w:r>
         <w:r>
           <w:rPr>
@@ -2108,7 +2108,7 @@
           <w14:ligatures w14:val="standardContextual"/>
         </w:rPr>
       </w:pPr>
-      <w:hyperlink w:anchor="_Toc225506468" w:history="1">
+      <w:hyperlink w:anchor="_Toc239765749" w:history="1">
         <w:r>
           <w:rPr>
             <w:rStyle w:val="Hyperlink"/>
@@ -2134,7 +2134,7 @@
             <w:rStyle w:val="Hyperlink"/>
             <w:noProof/>
           </w:rPr>
-          <w:t>Version 6.8 and 6.9 (January 2022)</w:t>
+          <w:t>Version 6.10 (April 2022)</w:t>
         </w:r>
         <w:r>
           <w:rPr>
@@ -2155,7 +2155,7 @@
             <w:noProof/>
             <w:webHidden/>
           </w:rPr>
-          <w:instrText xml:space="preserve"> PAGEREF _Toc225506468 \h </w:instrText>
+          <w:instrText xml:space="preserve"> PAGEREF _Toc239765749 \h </w:instrText>
         </w:r>
         <w:r>
           <w:rPr>
@@ -2200,7 +2200,7 @@
           <w14:ligatures w14:val="standardContextual"/>
         </w:rPr>
       </w:pPr>
-      <w:hyperlink w:anchor="_Toc225506469" w:history="1">
+      <w:hyperlink w:anchor="_Toc239765750" w:history="1">
         <w:r>
           <w:rPr>
             <w:rStyle w:val="Hyperlink"/>
@@ -2226,7 +2226,7 @@
             <w:rStyle w:val="Hyperlink"/>
             <w:noProof/>
           </w:rPr>
-          <w:t>Version 6.7 (May 2021)</w:t>
+          <w:t>Version 6.8 and 6.9 (January 2022)</w:t>
         </w:r>
         <w:r>
           <w:rPr>
@@ -2247,7 +2247,7 @@
             <w:noProof/>
             <w:webHidden/>
           </w:rPr>
-          <w:instrText xml:space="preserve"> PAGEREF _Toc225506469 \h </w:instrText>
+          <w:instrText xml:space="preserve"> PAGEREF _Toc239765750 \h </w:instrText>
         </w:r>
         <w:r>
           <w:rPr>
@@ -2292,7 +2292,7 @@
           <w14:ligatures w14:val="standardContextual"/>
         </w:rPr>
       </w:pPr>
-      <w:hyperlink w:anchor="_Toc225506470" w:history="1">
+      <w:hyperlink w:anchor="_Toc239765751" w:history="1">
         <w:r>
           <w:rPr>
             <w:rStyle w:val="Hyperlink"/>
@@ -2318,7 +2318,7 @@
             <w:rStyle w:val="Hyperlink"/>
             <w:noProof/>
           </w:rPr>
-          <w:t>Version 6.6 and Earlier</w:t>
+          <w:t>Version 6.7 (May 2021)</w:t>
         </w:r>
         <w:r>
           <w:rPr>
@@ -2339,95 +2339,7 @@
             <w:noProof/>
             <w:webHidden/>
           </w:rPr>
-          <w:instrText xml:space="preserve"> PAGEREF _Toc225506470 \h </w:instrText>
-        </w:r>
-        <w:r>
-          <w:rPr>
-            <w:noProof/>
-            <w:webHidden/>
-          </w:rPr>
-        </w:r>
-        <w:r>
-          <w:rPr>
-            <w:noProof/>
-            <w:webHidden/>
-          </w:rPr>
-          <w:fldChar w:fldCharType="separate"/>
-        </w:r>
-        <w:r>
-          <w:rPr>
-            <w:noProof/>
-            <w:webHidden/>
-          </w:rPr>
-          <w:t>11</w:t>
-        </w:r>
-        <w:r>
-          <w:rPr>
-            <w:noProof/>
-            <w:webHidden/>
-          </w:rPr>
-          <w:fldChar w:fldCharType="end"/>
-        </w:r>
-      </w:hyperlink>
-    </w:p>
-    <w:p>
-      <w:pPr>
-        <w:pStyle w:val="TOC2"/>
-        <w:rPr>
-          <w:rFonts w:asciiTheme="minorHAnsi" w:eastAsiaTheme="minorEastAsia" w:hAnsiTheme="minorHAnsi" w:cstheme="minorBidi"/>
-          <w:noProof/>
-          <w:kern w:val="2"/>
-          <w:sz w:val="24"/>
-          <w:szCs w:val="24"/>
-          <w14:ligatures w14:val="standardContextual"/>
-        </w:rPr>
-      </w:pPr>
-      <w:hyperlink w:anchor="_Toc225506471" w:history="1">
-        <w:r>
-          <w:rPr>
-            <w:rStyle w:val="Hyperlink"/>
-            <w:noProof/>
-          </w:rPr>
-          <w:t>1.12</w:t>
-        </w:r>
-        <w:r>
-          <w:rPr>
-            <w:rFonts w:asciiTheme="minorHAnsi" w:eastAsiaTheme="minorEastAsia" w:hAnsiTheme="minorHAnsi" w:cstheme="minorBidi"/>
-            <w:noProof/>
-            <w:kern w:val="2"/>
-            <w:sz w:val="24"/>
-            <w:szCs w:val="24"/>
-            <w14:ligatures w14:val="standardContextual"/>
-          </w:rPr>
-          <w:tab/>
-        </w:r>
-        <w:r>
-          <w:rPr>
-            <w:rStyle w:val="Hyperlink"/>
-            <w:noProof/>
-          </w:rPr>
-          <w:t>Minor Releases (this major release)</w:t>
-        </w:r>
-        <w:r>
-          <w:rPr>
-            <w:noProof/>
-            <w:webHidden/>
-          </w:rPr>
-          <w:tab/>
-        </w:r>
-        <w:r>
-          <w:rPr>
-            <w:noProof/>
-            <w:webHidden/>
-          </w:rPr>
-          <w:fldChar w:fldCharType="begin"/>
-        </w:r>
-        <w:r>
-          <w:rPr>
-            <w:noProof/>
-            <w:webHidden/>
-          </w:rPr>
-          <w:instrText xml:space="preserve"> PAGEREF _Toc225506471 \h </w:instrText>
+          <w:instrText xml:space="preserve"> PAGEREF _Toc239765751 \h </w:instrText>
         </w:r>
         <w:r>
           <w:rPr>
@@ -2472,13 +2384,13 @@
           <w14:ligatures w14:val="standardContextual"/>
         </w:rPr>
       </w:pPr>
-      <w:hyperlink w:anchor="_Toc225506472" w:history="1">
+      <w:hyperlink w:anchor="_Toc239765752" w:history="1">
         <w:r>
           <w:rPr>
             <w:rStyle w:val="Hyperlink"/>
             <w:noProof/>
           </w:rPr>
-          <w:t>1.12.1</w:t>
+          <w:t>1.11.9</w:t>
         </w:r>
         <w:r>
           <w:rPr>
@@ -2498,7 +2410,7 @@
             <w:rStyle w:val="Hyperlink"/>
             <w:noProof/>
           </w:rPr>
-          <w:t>8.0.4. Update to Fine Fuel calculation timing</w:t>
+          <w:t>Version 6.6 and Earlier</w:t>
         </w:r>
         <w:r>
           <w:rPr>
@@ -2519,7 +2431,95 @@
             <w:noProof/>
             <w:webHidden/>
           </w:rPr>
-          <w:instrText xml:space="preserve"> PAGEREF _Toc225506472 \h </w:instrText>
+          <w:instrText xml:space="preserve"> PAGEREF _Toc239765752 \h </w:instrText>
+        </w:r>
+        <w:r>
+          <w:rPr>
+            <w:noProof/>
+            <w:webHidden/>
+          </w:rPr>
+        </w:r>
+        <w:r>
+          <w:rPr>
+            <w:noProof/>
+            <w:webHidden/>
+          </w:rPr>
+          <w:fldChar w:fldCharType="separate"/>
+        </w:r>
+        <w:r>
+          <w:rPr>
+            <w:noProof/>
+            <w:webHidden/>
+          </w:rPr>
+          <w:t>11</w:t>
+        </w:r>
+        <w:r>
+          <w:rPr>
+            <w:noProof/>
+            <w:webHidden/>
+          </w:rPr>
+          <w:fldChar w:fldCharType="end"/>
+        </w:r>
+      </w:hyperlink>
+    </w:p>
+    <w:p>
+      <w:pPr>
+        <w:pStyle w:val="TOC2"/>
+        <w:rPr>
+          <w:rFonts w:asciiTheme="minorHAnsi" w:eastAsiaTheme="minorEastAsia" w:hAnsiTheme="minorHAnsi" w:cstheme="minorBidi"/>
+          <w:noProof/>
+          <w:kern w:val="2"/>
+          <w:sz w:val="24"/>
+          <w:szCs w:val="24"/>
+          <w14:ligatures w14:val="standardContextual"/>
+        </w:rPr>
+      </w:pPr>
+      <w:hyperlink w:anchor="_Toc239765753" w:history="1">
+        <w:r>
+          <w:rPr>
+            <w:rStyle w:val="Hyperlink"/>
+            <w:noProof/>
+          </w:rPr>
+          <w:t>1.12</w:t>
+        </w:r>
+        <w:r>
+          <w:rPr>
+            <w:rFonts w:asciiTheme="minorHAnsi" w:eastAsiaTheme="minorEastAsia" w:hAnsiTheme="minorHAnsi" w:cstheme="minorBidi"/>
+            <w:noProof/>
+            <w:kern w:val="2"/>
+            <w:sz w:val="24"/>
+            <w:szCs w:val="24"/>
+            <w14:ligatures w14:val="standardContextual"/>
+          </w:rPr>
+          <w:tab/>
+        </w:r>
+        <w:r>
+          <w:rPr>
+            <w:rStyle w:val="Hyperlink"/>
+            <w:noProof/>
+          </w:rPr>
+          <w:t>Minor Releases (this major release)</w:t>
+        </w:r>
+        <w:r>
+          <w:rPr>
+            <w:noProof/>
+            <w:webHidden/>
+          </w:rPr>
+          <w:tab/>
+        </w:r>
+        <w:r>
+          <w:rPr>
+            <w:noProof/>
+            <w:webHidden/>
+          </w:rPr>
+          <w:fldChar w:fldCharType="begin"/>
+        </w:r>
+        <w:r>
+          <w:rPr>
+            <w:noProof/>
+            <w:webHidden/>
+          </w:rPr>
+          <w:instrText xml:space="preserve"> PAGEREF _Toc239765753 \h </w:instrText>
         </w:r>
         <w:r>
           <w:rPr>
@@ -2564,13 +2564,13 @@
           <w14:ligatures w14:val="standardContextual"/>
         </w:rPr>
       </w:pPr>
-      <w:hyperlink w:anchor="_Toc225506473" w:history="1">
+      <w:hyperlink w:anchor="_Toc239765754" w:history="1">
         <w:r>
           <w:rPr>
             <w:rStyle w:val="Hyperlink"/>
             <w:noProof/>
           </w:rPr>
-          <w:t>1.12.2</w:t>
+          <w:t>1.12.1</w:t>
         </w:r>
         <w:r>
           <w:rPr>
@@ -2590,7 +2590,7 @@
             <w:rStyle w:val="Hyperlink"/>
             <w:noProof/>
           </w:rPr>
-          <w:t>8.0.3. Bugfix in postfire regeneration</w:t>
+          <w:t>8.0.4. Update to Fine Fuel calculation timing</w:t>
         </w:r>
         <w:r>
           <w:rPr>
@@ -2611,7 +2611,7 @@
             <w:noProof/>
             <w:webHidden/>
           </w:rPr>
-          <w:instrText xml:space="preserve"> PAGEREF _Toc225506473 \h </w:instrText>
+          <w:instrText xml:space="preserve"> PAGEREF _Toc239765754 \h </w:instrText>
         </w:r>
         <w:r>
           <w:rPr>
@@ -2656,13 +2656,13 @@
           <w14:ligatures w14:val="standardContextual"/>
         </w:rPr>
       </w:pPr>
-      <w:hyperlink w:anchor="_Toc225506474" w:history="1">
+      <w:hyperlink w:anchor="_Toc239765755" w:history="1">
         <w:r>
           <w:rPr>
             <w:rStyle w:val="Hyperlink"/>
             <w:noProof/>
           </w:rPr>
-          <w:t>1.12.3</w:t>
+          <w:t>1.12.2</w:t>
         </w:r>
         <w:r>
           <w:rPr>
@@ -2682,7 +2682,7 @@
             <w:rStyle w:val="Hyperlink"/>
             <w:noProof/>
           </w:rPr>
-          <w:t>8.0.2. Bugfix in initial biomass calculation.</w:t>
+          <w:t>8.0.3. Bugfix in postfire regeneration</w:t>
         </w:r>
         <w:r>
           <w:rPr>
@@ -2703,7 +2703,7 @@
             <w:noProof/>
             <w:webHidden/>
           </w:rPr>
-          <w:instrText xml:space="preserve"> PAGEREF _Toc225506474 \h </w:instrText>
+          <w:instrText xml:space="preserve"> PAGEREF _Toc239765755 \h </w:instrText>
         </w:r>
         <w:r>
           <w:rPr>
@@ -2723,7 +2723,7 @@
             <w:noProof/>
             <w:webHidden/>
           </w:rPr>
-          <w:t>12</w:t>
+          <w:t>11</w:t>
         </w:r>
         <w:r>
           <w:rPr>
@@ -2748,13 +2748,13 @@
           <w14:ligatures w14:val="standardContextual"/>
         </w:rPr>
       </w:pPr>
-      <w:hyperlink w:anchor="_Toc225506475" w:history="1">
+      <w:hyperlink w:anchor="_Toc239765756" w:history="1">
         <w:r>
           <w:rPr>
             <w:rStyle w:val="Hyperlink"/>
             <w:noProof/>
           </w:rPr>
-          <w:t>1.12.4</w:t>
+          <w:t>1.12.3</w:t>
         </w:r>
         <w:r>
           <w:rPr>
@@ -2774,6 +2774,98 @@
             <w:rStyle w:val="Hyperlink"/>
             <w:noProof/>
           </w:rPr>
+          <w:t>8.0.2. Bugfix in initial biomass calculation.</w:t>
+        </w:r>
+        <w:r>
+          <w:rPr>
+            <w:noProof/>
+            <w:webHidden/>
+          </w:rPr>
+          <w:tab/>
+        </w:r>
+        <w:r>
+          <w:rPr>
+            <w:noProof/>
+            <w:webHidden/>
+          </w:rPr>
+          <w:fldChar w:fldCharType="begin"/>
+        </w:r>
+        <w:r>
+          <w:rPr>
+            <w:noProof/>
+            <w:webHidden/>
+          </w:rPr>
+          <w:instrText xml:space="preserve"> PAGEREF _Toc239765756 \h </w:instrText>
+        </w:r>
+        <w:r>
+          <w:rPr>
+            <w:noProof/>
+            <w:webHidden/>
+          </w:rPr>
+        </w:r>
+        <w:r>
+          <w:rPr>
+            <w:noProof/>
+            <w:webHidden/>
+          </w:rPr>
+          <w:fldChar w:fldCharType="separate"/>
+        </w:r>
+        <w:r>
+          <w:rPr>
+            <w:noProof/>
+            <w:webHidden/>
+          </w:rPr>
+          <w:t>12</w:t>
+        </w:r>
+        <w:r>
+          <w:rPr>
+            <w:noProof/>
+            <w:webHidden/>
+          </w:rPr>
+          <w:fldChar w:fldCharType="end"/>
+        </w:r>
+      </w:hyperlink>
+    </w:p>
+    <w:p>
+      <w:pPr>
+        <w:pStyle w:val="TOC3"/>
+        <w:rPr>
+          <w:rFonts w:asciiTheme="minorHAnsi" w:eastAsiaTheme="minorEastAsia" w:hAnsiTheme="minorHAnsi" w:cstheme="minorBidi"/>
+          <w:i w:val="0"/>
+          <w:iCs w:val="0"/>
+          <w:noProof/>
+          <w:kern w:val="2"/>
+          <w:sz w:val="24"/>
+          <w:szCs w:val="24"/>
+          <w14:ligatures w14:val="standardContextual"/>
+        </w:rPr>
+      </w:pPr>
+      <w:hyperlink w:anchor="_Toc239765757" w:history="1">
+        <w:r>
+          <w:rPr>
+            <w:rStyle w:val="Hyperlink"/>
+            <w:noProof/>
+          </w:rPr>
+          <w:t>1.12.4</w:t>
+        </w:r>
+        <w:r>
+          <w:rPr>
+            <w:rFonts w:asciiTheme="minorHAnsi" w:eastAsiaTheme="minorEastAsia" w:hAnsiTheme="minorHAnsi" w:cstheme="minorBidi"/>
+            <w:i w:val="0"/>
+            <w:iCs w:val="0"/>
+            <w:noProof/>
+            <w:kern w:val="2"/>
+            <w:sz w:val="24"/>
+            <w:szCs w:val="24"/>
+            <w14:ligatures w14:val="standardContextual"/>
+          </w:rPr>
+          <w:tab/>
+        </w:r>
+        <w:r>
+          <w:rPr>
+            <w:rStyle w:val="Hyperlink"/>
+            <w:noProof/>
+          </w:rPr>
           <w:t>8.0.1. Bugfixes in ANPP calculation.</w:t>
         </w:r>
         <w:r>
@@ -2795,7 +2887,7 @@
             <w:noProof/>
             <w:webHidden/>
           </w:rPr>
-          <w:instrText xml:space="preserve"> PAGEREF _Toc225506475 \h </w:instrText>
+          <w:instrText xml:space="preserve"> PAGEREF _Toc239765757 \h </w:instrText>
         </w:r>
         <w:r>
           <w:rPr>
@@ -2838,7 +2930,7 @@
           <w14:ligatures w14:val="standardContextual"/>
         </w:rPr>
       </w:pPr>
-      <w:hyperlink w:anchor="_Toc225506476" w:history="1">
+      <w:hyperlink w:anchor="_Toc239765758" w:history="1">
         <w:r>
           <w:rPr>
             <w:rStyle w:val="Hyperlink"/>
@@ -2883,7 +2975,7 @@
             <w:noProof/>
             <w:webHidden/>
           </w:rPr>
-          <w:instrText xml:space="preserve"> PAGEREF _Toc225506476 \h </w:instrText>
+          <w:instrText xml:space="preserve"> PAGEREF _Toc239765758 \h </w:instrText>
         </w:r>
         <w:r>
           <w:rPr>
@@ -2926,7 +3018,7 @@
           <w14:ligatures w14:val="standardContextual"/>
         </w:rPr>
       </w:pPr>
-      <w:hyperlink w:anchor="_Toc225506477" w:history="1">
+      <w:hyperlink w:anchor="_Toc239765759" w:history="1">
         <w:r>
           <w:rPr>
             <w:rStyle w:val="Hyperlink"/>
@@ -2971,7 +3063,7 @@
             <w:noProof/>
             <w:webHidden/>
           </w:rPr>
-          <w:instrText xml:space="preserve"> PAGEREF _Toc225506477 \h </w:instrText>
+          <w:instrText xml:space="preserve"> PAGEREF _Toc239765759 \h </w:instrText>
         </w:r>
         <w:r>
           <w:rPr>
@@ -3017,7 +3109,7 @@
           <w14:ligatures w14:val="standardContextual"/>
         </w:rPr>
       </w:pPr>
-      <w:hyperlink w:anchor="_Toc225506478" w:history="1">
+      <w:hyperlink w:anchor="_Toc239765760" w:history="1">
         <w:r>
           <w:rPr>
             <w:rStyle w:val="Hyperlink"/>
@@ -3065,7 +3157,7 @@
             <w:noProof/>
             <w:webHidden/>
           </w:rPr>
-          <w:instrText xml:space="preserve"> PAGEREF _Toc225506478 \h </w:instrText>
+          <w:instrText xml:space="preserve"> PAGEREF _Toc239765760 \h </w:instrText>
         </w:r>
         <w:r>
           <w:rPr>
@@ -3108,7 +3200,7 @@
           <w14:ligatures w14:val="standardContextual"/>
         </w:rPr>
       </w:pPr>
-      <w:hyperlink w:anchor="_Toc225506479" w:history="1">
+      <w:hyperlink w:anchor="_Toc239765761" w:history="1">
         <w:r>
           <w:rPr>
             <w:rStyle w:val="Hyperlink"/>
@@ -3153,7 +3245,7 @@
             <w:noProof/>
             <w:webHidden/>
           </w:rPr>
-          <w:instrText xml:space="preserve"> PAGEREF _Toc225506479 \h </w:instrText>
+          <w:instrText xml:space="preserve"> PAGEREF _Toc239765761 \h </w:instrText>
         </w:r>
         <w:r>
           <w:rPr>
@@ -3196,7 +3288,7 @@
           <w14:ligatures w14:val="standardContextual"/>
         </w:rPr>
       </w:pPr>
-      <w:hyperlink w:anchor="_Toc225506480" w:history="1">
+      <w:hyperlink w:anchor="_Toc239765762" w:history="1">
         <w:r>
           <w:rPr>
             <w:rStyle w:val="Hyperlink"/>
@@ -3241,7 +3333,7 @@
             <w:noProof/>
             <w:webHidden/>
           </w:rPr>
-          <w:instrText xml:space="preserve"> PAGEREF _Toc225506480 \h </w:instrText>
+          <w:instrText xml:space="preserve"> PAGEREF _Toc239765762 \h </w:instrText>
         </w:r>
         <w:r>
           <w:rPr>
@@ -3284,7 +3376,7 @@
           <w14:ligatures w14:val="standardContextual"/>
         </w:rPr>
       </w:pPr>
-      <w:hyperlink w:anchor="_Toc225506481" w:history="1">
+      <w:hyperlink w:anchor="_Toc239765763" w:history="1">
         <w:r>
           <w:rPr>
             <w:rStyle w:val="Hyperlink"/>
@@ -3329,7 +3421,7 @@
             <w:noProof/>
             <w:webHidden/>
           </w:rPr>
-          <w:instrText xml:space="preserve"> PAGEREF _Toc225506481 \h </w:instrText>
+          <w:instrText xml:space="preserve"> PAGEREF _Toc239765763 \h </w:instrText>
         </w:r>
         <w:r>
           <w:rPr>
@@ -3372,7 +3464,7 @@
           <w14:ligatures w14:val="standardContextual"/>
         </w:rPr>
       </w:pPr>
-      <w:hyperlink w:anchor="_Toc225506482" w:history="1">
+      <w:hyperlink w:anchor="_Toc239765764" w:history="1">
         <w:r>
           <w:rPr>
             <w:rStyle w:val="Hyperlink"/>
@@ -3417,7 +3509,7 @@
             <w:noProof/>
             <w:webHidden/>
           </w:rPr>
-          <w:instrText xml:space="preserve"> PAGEREF _Toc225506482 \h </w:instrText>
+          <w:instrText xml:space="preserve"> PAGEREF _Toc239765764 \h </w:instrText>
         </w:r>
         <w:r>
           <w:rPr>
@@ -3460,7 +3552,7 @@
           <w14:ligatures w14:val="standardContextual"/>
         </w:rPr>
       </w:pPr>
-      <w:hyperlink w:anchor="_Toc225506483" w:history="1">
+      <w:hyperlink w:anchor="_Toc239765765" w:history="1">
         <w:r>
           <w:rPr>
             <w:rStyle w:val="Hyperlink"/>
@@ -3505,7 +3597,7 @@
             <w:noProof/>
             <w:webHidden/>
           </w:rPr>
-          <w:instrText xml:space="preserve"> PAGEREF _Toc225506483 \h </w:instrText>
+          <w:instrText xml:space="preserve"> PAGEREF _Toc239765765 \h </w:instrText>
         </w:r>
         <w:r>
           <w:rPr>
@@ -3548,7 +3640,7 @@
           <w14:ligatures w14:val="standardContextual"/>
         </w:rPr>
       </w:pPr>
-      <w:hyperlink w:anchor="_Toc225506484" w:history="1">
+      <w:hyperlink w:anchor="_Toc239765766" w:history="1">
         <w:r>
           <w:rPr>
             <w:rStyle w:val="Hyperlink"/>
@@ -3593,7 +3685,7 @@
             <w:noProof/>
             <w:webHidden/>
           </w:rPr>
-          <w:instrText xml:space="preserve"> PAGEREF _Toc225506484 \h </w:instrText>
+          <w:instrText xml:space="preserve"> PAGEREF _Toc239765766 \h </w:instrText>
         </w:r>
         <w:r>
           <w:rPr>
@@ -3636,7 +3728,7 @@
           <w14:ligatures w14:val="standardContextual"/>
         </w:rPr>
       </w:pPr>
-      <w:hyperlink w:anchor="_Toc225506485" w:history="1">
+      <w:hyperlink w:anchor="_Toc239765767" w:history="1">
         <w:r>
           <w:rPr>
             <w:rStyle w:val="Hyperlink"/>
@@ -3681,7 +3773,7 @@
             <w:noProof/>
             <w:webHidden/>
           </w:rPr>
-          <w:instrText xml:space="preserve"> PAGEREF _Toc225506485 \h </w:instrText>
+          <w:instrText xml:space="preserve"> PAGEREF _Toc239765767 \h </w:instrText>
         </w:r>
         <w:r>
           <w:rPr>
@@ -3724,7 +3816,7 @@
           <w14:ligatures w14:val="standardContextual"/>
         </w:rPr>
       </w:pPr>
-      <w:hyperlink w:anchor="_Toc225506486" w:history="1">
+      <w:hyperlink w:anchor="_Toc239765768" w:history="1">
         <w:r>
           <w:rPr>
             <w:rStyle w:val="Hyperlink"/>
@@ -3769,7 +3861,7 @@
             <w:noProof/>
             <w:webHidden/>
           </w:rPr>
-          <w:instrText xml:space="preserve"> PAGEREF _Toc225506486 \h </w:instrText>
+          <w:instrText xml:space="preserve"> PAGEREF _Toc239765768 \h </w:instrText>
         </w:r>
         <w:r>
           <w:rPr>
@@ -3812,7 +3904,7 @@
           <w14:ligatures w14:val="standardContextual"/>
         </w:rPr>
       </w:pPr>
-      <w:hyperlink w:anchor="_Toc225506487" w:history="1">
+      <w:hyperlink w:anchor="_Toc239765769" w:history="1">
         <w:r>
           <w:rPr>
             <w:rStyle w:val="Hyperlink"/>
@@ -3857,7 +3949,7 @@
             <w:noProof/>
             <w:webHidden/>
           </w:rPr>
-          <w:instrText xml:space="preserve"> PAGEREF _Toc225506487 \h </w:instrText>
+          <w:instrText xml:space="preserve"> PAGEREF _Toc239765769 \h </w:instrText>
         </w:r>
         <w:r>
           <w:rPr>
@@ -3900,7 +3992,7 @@
           <w14:ligatures w14:val="standardContextual"/>
         </w:rPr>
       </w:pPr>
-      <w:hyperlink w:anchor="_Toc225506488" w:history="1">
+      <w:hyperlink w:anchor="_Toc239765770" w:history="1">
         <w:r>
           <w:rPr>
             <w:rStyle w:val="Hyperlink"/>
@@ -3945,7 +4037,7 @@
             <w:noProof/>
             <w:webHidden/>
           </w:rPr>
-          <w:instrText xml:space="preserve"> PAGEREF _Toc225506488 \h </w:instrText>
+          <w:instrText xml:space="preserve"> PAGEREF _Toc239765770 \h </w:instrText>
         </w:r>
         <w:r>
           <w:rPr>
@@ -3988,7 +4080,7 @@
           <w14:ligatures w14:val="standardContextual"/>
         </w:rPr>
       </w:pPr>
-      <w:hyperlink w:anchor="_Toc225506489" w:history="1">
+      <w:hyperlink w:anchor="_Toc239765771" w:history="1">
         <w:r>
           <w:rPr>
             <w:rStyle w:val="Hyperlink"/>
@@ -4033,7 +4125,7 @@
             <w:noProof/>
             <w:webHidden/>
           </w:rPr>
-          <w:instrText xml:space="preserve"> PAGEREF _Toc225506489 \h </w:instrText>
+          <w:instrText xml:space="preserve"> PAGEREF _Toc239765771 \h </w:instrText>
         </w:r>
         <w:r>
           <w:rPr>
@@ -4076,7 +4168,7 @@
           <w14:ligatures w14:val="standardContextual"/>
         </w:rPr>
       </w:pPr>
-      <w:hyperlink w:anchor="_Toc225506490" w:history="1">
+      <w:hyperlink w:anchor="_Toc239765772" w:history="1">
         <w:r>
           <w:rPr>
             <w:rStyle w:val="Hyperlink"/>
@@ -4121,7 +4213,7 @@
             <w:noProof/>
             <w:webHidden/>
           </w:rPr>
-          <w:instrText xml:space="preserve"> PAGEREF _Toc225506490 \h </w:instrText>
+          <w:instrText xml:space="preserve"> PAGEREF _Toc239765772 \h </w:instrText>
         </w:r>
         <w:r>
           <w:rPr>
@@ -4164,7 +4256,7 @@
           <w14:ligatures w14:val="standardContextual"/>
         </w:rPr>
       </w:pPr>
-      <w:hyperlink w:anchor="_Toc225506491" w:history="1">
+      <w:hyperlink w:anchor="_Toc239765773" w:history="1">
         <w:r>
           <w:rPr>
             <w:rStyle w:val="Hyperlink"/>
@@ -4209,7 +4301,7 @@
             <w:noProof/>
             <w:webHidden/>
           </w:rPr>
-          <w:instrText xml:space="preserve"> PAGEREF _Toc225506491 \h </w:instrText>
+          <w:instrText xml:space="preserve"> PAGEREF _Toc239765773 \h </w:instrText>
         </w:r>
         <w:r>
           <w:rPr>
@@ -4252,7 +4344,7 @@
           <w14:ligatures w14:val="standardContextual"/>
         </w:rPr>
       </w:pPr>
-      <w:hyperlink w:anchor="_Toc225506492" w:history="1">
+      <w:hyperlink w:anchor="_Toc239765774" w:history="1">
         <w:r>
           <w:rPr>
             <w:rStyle w:val="Hyperlink"/>
@@ -4297,7 +4389,7 @@
             <w:noProof/>
             <w:webHidden/>
           </w:rPr>
-          <w:instrText xml:space="preserve"> PAGEREF _Toc225506492 \h </w:instrText>
+          <w:instrText xml:space="preserve"> PAGEREF _Toc239765774 \h </w:instrText>
         </w:r>
         <w:r>
           <w:rPr>
@@ -4340,7 +4432,7 @@
           <w14:ligatures w14:val="standardContextual"/>
         </w:rPr>
       </w:pPr>
-      <w:hyperlink w:anchor="_Toc225506493" w:history="1">
+      <w:hyperlink w:anchor="_Toc239765775" w:history="1">
         <w:r>
           <w:rPr>
             <w:rStyle w:val="Hyperlink"/>
@@ -4385,7 +4477,7 @@
             <w:noProof/>
             <w:webHidden/>
           </w:rPr>
-          <w:instrText xml:space="preserve"> PAGEREF _Toc225506493 \h </w:instrText>
+          <w:instrText xml:space="preserve"> PAGEREF _Toc239765775 \h </w:instrText>
         </w:r>
         <w:r>
           <w:rPr>
@@ -4428,7 +4520,7 @@
           <w14:ligatures w14:val="standardContextual"/>
         </w:rPr>
       </w:pPr>
-      <w:hyperlink w:anchor="_Toc225506494" w:history="1">
+      <w:hyperlink w:anchor="_Toc239765776" w:history="1">
         <w:r>
           <w:rPr>
             <w:rStyle w:val="Hyperlink"/>
@@ -4473,7 +4565,7 @@
             <w:noProof/>
             <w:webHidden/>
           </w:rPr>
-          <w:instrText xml:space="preserve"> PAGEREF _Toc225506494 \h </w:instrText>
+          <w:instrText xml:space="preserve"> PAGEREF _Toc239765776 \h </w:instrText>
         </w:r>
         <w:r>
           <w:rPr>
@@ -4516,7 +4608,7 @@
           <w14:ligatures w14:val="standardContextual"/>
         </w:rPr>
       </w:pPr>
-      <w:hyperlink w:anchor="_Toc225506495" w:history="1">
+      <w:hyperlink w:anchor="_Toc239765777" w:history="1">
         <w:r>
           <w:rPr>
             <w:rStyle w:val="Hyperlink"/>
@@ -4561,7 +4653,7 @@
             <w:noProof/>
             <w:webHidden/>
           </w:rPr>
-          <w:instrText xml:space="preserve"> PAGEREF _Toc225506495 \h </w:instrText>
+          <w:instrText xml:space="preserve"> PAGEREF _Toc239765777 \h </w:instrText>
         </w:r>
         <w:r>
           <w:rPr>
@@ -4604,7 +4696,7 @@
           <w14:ligatures w14:val="standardContextual"/>
         </w:rPr>
       </w:pPr>
-      <w:hyperlink w:anchor="_Toc225506496" w:history="1">
+      <w:hyperlink w:anchor="_Toc239765778" w:history="1">
         <w:r>
           <w:rPr>
             <w:rStyle w:val="Hyperlink"/>
@@ -4649,7 +4741,7 @@
             <w:noProof/>
             <w:webHidden/>
           </w:rPr>
-          <w:instrText xml:space="preserve"> PAGEREF _Toc225506496 \h </w:instrText>
+          <w:instrText xml:space="preserve"> PAGEREF _Toc239765778 \h </w:instrText>
         </w:r>
         <w:r>
           <w:rPr>
@@ -4692,7 +4784,7 @@
           <w14:ligatures w14:val="standardContextual"/>
         </w:rPr>
       </w:pPr>
-      <w:hyperlink w:anchor="_Toc225506497" w:history="1">
+      <w:hyperlink w:anchor="_Toc239765779" w:history="1">
         <w:r>
           <w:rPr>
             <w:rStyle w:val="Hyperlink"/>
@@ -4737,7 +4829,7 @@
             <w:noProof/>
             <w:webHidden/>
           </w:rPr>
-          <w:instrText xml:space="preserve"> PAGEREF _Toc225506497 \h </w:instrText>
+          <w:instrText xml:space="preserve"> PAGEREF _Toc239765779 \h </w:instrText>
         </w:r>
         <w:r>
           <w:rPr>
@@ -4780,7 +4872,7 @@
           <w14:ligatures w14:val="standardContextual"/>
         </w:rPr>
       </w:pPr>
-      <w:hyperlink w:anchor="_Toc225506498" w:history="1">
+      <w:hyperlink w:anchor="_Toc239765780" w:history="1">
         <w:r>
           <w:rPr>
             <w:rStyle w:val="Hyperlink"/>
@@ -4825,7 +4917,7 @@
             <w:noProof/>
             <w:webHidden/>
           </w:rPr>
-          <w:instrText xml:space="preserve"> PAGEREF _Toc225506498 \h </w:instrText>
+          <w:instrText xml:space="preserve"> PAGEREF _Toc239765780 \h </w:instrText>
         </w:r>
         <w:r>
           <w:rPr>
@@ -4868,7 +4960,7 @@
           <w14:ligatures w14:val="standardContextual"/>
         </w:rPr>
       </w:pPr>
-      <w:hyperlink w:anchor="_Toc225506499" w:history="1">
+      <w:hyperlink w:anchor="_Toc239765781" w:history="1">
         <w:r>
           <w:rPr>
             <w:rStyle w:val="Hyperlink"/>
@@ -4913,7 +5005,7 @@
             <w:noProof/>
             <w:webHidden/>
           </w:rPr>
-          <w:instrText xml:space="preserve"> PAGEREF _Toc225506499 \h </w:instrText>
+          <w:instrText xml:space="preserve"> PAGEREF _Toc239765781 \h </w:instrText>
         </w:r>
         <w:r>
           <w:rPr>
@@ -4956,7 +5048,7 @@
           <w14:ligatures w14:val="standardContextual"/>
         </w:rPr>
       </w:pPr>
-      <w:hyperlink w:anchor="_Toc225506500" w:history="1">
+      <w:hyperlink w:anchor="_Toc239765782" w:history="1">
         <w:r>
           <w:rPr>
             <w:rStyle w:val="Hyperlink"/>
@@ -5001,7 +5093,7 @@
             <w:noProof/>
             <w:webHidden/>
           </w:rPr>
-          <w:instrText xml:space="preserve"> PAGEREF _Toc225506500 \h </w:instrText>
+          <w:instrText xml:space="preserve"> PAGEREF _Toc239765782 \h </w:instrText>
         </w:r>
         <w:r>
           <w:rPr>
@@ -5044,7 +5136,7 @@
           <w14:ligatures w14:val="standardContextual"/>
         </w:rPr>
       </w:pPr>
-      <w:hyperlink w:anchor="_Toc225506501" w:history="1">
+      <w:hyperlink w:anchor="_Toc239765783" w:history="1">
         <w:r>
           <w:rPr>
             <w:rStyle w:val="Hyperlink"/>
@@ -5089,7 +5181,7 @@
             <w:noProof/>
             <w:webHidden/>
           </w:rPr>
-          <w:instrText xml:space="preserve"> PAGEREF _Toc225506501 \h </w:instrText>
+          <w:instrText xml:space="preserve"> PAGEREF _Toc239765783 \h </w:instrText>
         </w:r>
         <w:r>
           <w:rPr>
@@ -5132,7 +5224,7 @@
           <w14:ligatures w14:val="standardContextual"/>
         </w:rPr>
       </w:pPr>
-      <w:hyperlink w:anchor="_Toc225506502" w:history="1">
+      <w:hyperlink w:anchor="_Toc239765784" w:history="1">
         <w:r>
           <w:rPr>
             <w:rStyle w:val="Hyperlink"/>
@@ -5177,7 +5269,7 @@
             <w:noProof/>
             <w:webHidden/>
           </w:rPr>
-          <w:instrText xml:space="preserve"> PAGEREF _Toc225506502 \h </w:instrText>
+          <w:instrText xml:space="preserve"> PAGEREF _Toc239765784 \h </w:instrText>
         </w:r>
         <w:r>
           <w:rPr>
@@ -5220,7 +5312,7 @@
           <w14:ligatures w14:val="standardContextual"/>
         </w:rPr>
       </w:pPr>
-      <w:hyperlink w:anchor="_Toc225506503" w:history="1">
+      <w:hyperlink w:anchor="_Toc239765785" w:history="1">
         <w:r>
           <w:rPr>
             <w:rStyle w:val="Hyperlink"/>
@@ -5265,7 +5357,7 @@
             <w:noProof/>
             <w:webHidden/>
           </w:rPr>
-          <w:instrText xml:space="preserve"> PAGEREF _Toc225506503 \h </w:instrText>
+          <w:instrText xml:space="preserve"> PAGEREF _Toc239765785 \h </w:instrText>
         </w:r>
         <w:r>
           <w:rPr>
@@ -5308,7 +5400,7 @@
           <w14:ligatures w14:val="standardContextual"/>
         </w:rPr>
       </w:pPr>
-      <w:hyperlink w:anchor="_Toc225506504" w:history="1">
+      <w:hyperlink w:anchor="_Toc239765786" w:history="1">
         <w:r>
           <w:rPr>
             <w:rStyle w:val="Hyperlink"/>
@@ -5353,7 +5445,7 @@
             <w:noProof/>
             <w:webHidden/>
           </w:rPr>
-          <w:instrText xml:space="preserve"> PAGEREF _Toc225506504 \h </w:instrText>
+          <w:instrText xml:space="preserve"> PAGEREF _Toc239765786 \h </w:instrText>
         </w:r>
         <w:r>
           <w:rPr>
@@ -5396,7 +5488,7 @@
           <w14:ligatures w14:val="standardContextual"/>
         </w:rPr>
       </w:pPr>
-      <w:hyperlink w:anchor="_Toc225506505" w:history="1">
+      <w:hyperlink w:anchor="_Toc239765787" w:history="1">
         <w:r>
           <w:rPr>
             <w:rStyle w:val="Hyperlink"/>
@@ -5441,7 +5533,7 @@
             <w:noProof/>
             <w:webHidden/>
           </w:rPr>
-          <w:instrText xml:space="preserve"> PAGEREF _Toc225506505 \h </w:instrText>
+          <w:instrText xml:space="preserve"> PAGEREF _Toc239765787 \h </w:instrText>
         </w:r>
         <w:r>
           <w:rPr>
@@ -5484,7 +5576,7 @@
           <w14:ligatures w14:val="standardContextual"/>
         </w:rPr>
       </w:pPr>
-      <w:hyperlink w:anchor="_Toc225506506" w:history="1">
+      <w:hyperlink w:anchor="_Toc239765788" w:history="1">
         <w:r>
           <w:rPr>
             <w:rStyle w:val="Hyperlink"/>
@@ -5529,7 +5621,7 @@
             <w:noProof/>
             <w:webHidden/>
           </w:rPr>
-          <w:instrText xml:space="preserve"> PAGEREF _Toc225506506 \h </w:instrText>
+          <w:instrText xml:space="preserve"> PAGEREF _Toc239765788 \h </w:instrText>
         </w:r>
         <w:r>
           <w:rPr>
@@ -5572,7 +5664,7 @@
           <w14:ligatures w14:val="standardContextual"/>
         </w:rPr>
       </w:pPr>
-      <w:hyperlink w:anchor="_Toc225506507" w:history="1">
+      <w:hyperlink w:anchor="_Toc239765789" w:history="1">
         <w:r>
           <w:rPr>
             <w:rStyle w:val="Hyperlink"/>
@@ -5617,7 +5709,7 @@
             <w:noProof/>
             <w:webHidden/>
           </w:rPr>
-          <w:instrText xml:space="preserve"> PAGEREF _Toc225506507 \h </w:instrText>
+          <w:instrText xml:space="preserve"> PAGEREF _Toc239765789 \h </w:instrText>
         </w:r>
         <w:r>
           <w:rPr>
@@ -5660,7 +5752,7 @@
           <w14:ligatures w14:val="standardContextual"/>
         </w:rPr>
       </w:pPr>
-      <w:hyperlink w:anchor="_Toc225506508" w:history="1">
+      <w:hyperlink w:anchor="_Toc239765790" w:history="1">
         <w:r>
           <w:rPr>
             <w:rStyle w:val="Hyperlink"/>
@@ -5705,7 +5797,7 @@
             <w:noProof/>
             <w:webHidden/>
           </w:rPr>
-          <w:instrText xml:space="preserve"> PAGEREF _Toc225506508 \h </w:instrText>
+          <w:instrText xml:space="preserve"> PAGEREF _Toc239765790 \h </w:instrText>
         </w:r>
         <w:r>
           <w:rPr>
@@ -5748,7 +5840,7 @@
           <w14:ligatures w14:val="standardContextual"/>
         </w:rPr>
       </w:pPr>
-      <w:hyperlink w:anchor="_Toc225506509" w:history="1">
+      <w:hyperlink w:anchor="_Toc239765791" w:history="1">
         <w:r>
           <w:rPr>
             <w:rStyle w:val="Hyperlink"/>
@@ -5793,7 +5885,7 @@
             <w:noProof/>
             <w:webHidden/>
           </w:rPr>
-          <w:instrText xml:space="preserve"> PAGEREF _Toc225506509 \h </w:instrText>
+          <w:instrText xml:space="preserve"> PAGEREF _Toc239765791 \h </w:instrText>
         </w:r>
         <w:r>
           <w:rPr>
@@ -5836,7 +5928,7 @@
           <w14:ligatures w14:val="standardContextual"/>
         </w:rPr>
       </w:pPr>
-      <w:hyperlink w:anchor="_Toc225506510" w:history="1">
+      <w:hyperlink w:anchor="_Toc239765792" w:history="1">
         <w:r>
           <w:rPr>
             <w:rStyle w:val="Hyperlink"/>
@@ -5881,7 +5973,7 @@
             <w:noProof/>
             <w:webHidden/>
           </w:rPr>
-          <w:instrText xml:space="preserve"> PAGEREF _Toc225506510 \h </w:instrText>
+          <w:instrText xml:space="preserve"> PAGEREF _Toc239765792 \h </w:instrText>
         </w:r>
         <w:r>
           <w:rPr>
@@ -5924,7 +6016,7 @@
           <w14:ligatures w14:val="standardContextual"/>
         </w:rPr>
       </w:pPr>
-      <w:hyperlink w:anchor="_Toc225506511" w:history="1">
+      <w:hyperlink w:anchor="_Toc239765793" w:history="1">
         <w:r>
           <w:rPr>
             <w:rStyle w:val="Hyperlink"/>
@@ -5969,7 +6061,7 @@
             <w:noProof/>
             <w:webHidden/>
           </w:rPr>
-          <w:instrText xml:space="preserve"> PAGEREF _Toc225506511 \h </w:instrText>
+          <w:instrText xml:space="preserve"> PAGEREF _Toc239765793 \h </w:instrText>
         </w:r>
         <w:r>
           <w:rPr>
@@ -6012,7 +6104,7 @@
           <w14:ligatures w14:val="standardContextual"/>
         </w:rPr>
       </w:pPr>
-      <w:hyperlink w:anchor="_Toc225506512" w:history="1">
+      <w:hyperlink w:anchor="_Toc239765794" w:history="1">
         <w:r>
           <w:rPr>
             <w:rStyle w:val="Hyperlink"/>
@@ -6057,7 +6149,7 @@
             <w:noProof/>
             <w:webHidden/>
           </w:rPr>
-          <w:instrText xml:space="preserve"> PAGEREF _Toc225506512 \h </w:instrText>
+          <w:instrText xml:space="preserve"> PAGEREF _Toc239765794 \h </w:instrText>
         </w:r>
         <w:r>
           <w:rPr>
@@ -6102,7 +6194,7 @@
           <w14:ligatures w14:val="standardContextual"/>
         </w:rPr>
       </w:pPr>
-      <w:hyperlink w:anchor="_Toc225506513" w:history="1">
+      <w:hyperlink w:anchor="_Toc239765795" w:history="1">
         <w:r>
           <w:rPr>
             <w:rStyle w:val="Hyperlink"/>
@@ -6149,7 +6241,7 @@
             <w:noProof/>
             <w:webHidden/>
           </w:rPr>
-          <w:instrText xml:space="preserve"> PAGEREF _Toc225506513 \h </w:instrText>
+          <w:instrText xml:space="preserve"> PAGEREF _Toc239765795 \h </w:instrText>
         </w:r>
         <w:r>
           <w:rPr>
@@ -6194,7 +6286,7 @@
           <w14:ligatures w14:val="standardContextual"/>
         </w:rPr>
       </w:pPr>
-      <w:hyperlink w:anchor="_Toc225506514" w:history="1">
+      <w:hyperlink w:anchor="_Toc239765796" w:history="1">
         <w:r>
           <w:rPr>
             <w:rStyle w:val="Hyperlink"/>
@@ -6241,7 +6333,7 @@
             <w:noProof/>
             <w:webHidden/>
           </w:rPr>
-          <w:instrText xml:space="preserve"> PAGEREF _Toc225506514 \h </w:instrText>
+          <w:instrText xml:space="preserve"> PAGEREF _Toc239765796 \h </w:instrText>
         </w:r>
         <w:r>
           <w:rPr>
@@ -6286,7 +6378,7 @@
           <w14:ligatures w14:val="standardContextual"/>
         </w:rPr>
       </w:pPr>
-      <w:hyperlink w:anchor="_Toc225506515" w:history="1">
+      <w:hyperlink w:anchor="_Toc239765797" w:history="1">
         <w:r>
           <w:rPr>
             <w:rStyle w:val="Hyperlink"/>
@@ -6333,7 +6425,7 @@
             <w:noProof/>
             <w:webHidden/>
           </w:rPr>
-          <w:instrText xml:space="preserve"> PAGEREF _Toc225506515 \h </w:instrText>
+          <w:instrText xml:space="preserve"> PAGEREF _Toc239765797 \h </w:instrText>
         </w:r>
         <w:r>
           <w:rPr>
@@ -6378,7 +6470,7 @@
           <w14:ligatures w14:val="standardContextual"/>
         </w:rPr>
       </w:pPr>
-      <w:hyperlink w:anchor="_Toc225506516" w:history="1">
+      <w:hyperlink w:anchor="_Toc239765798" w:history="1">
         <w:r>
           <w:rPr>
             <w:rStyle w:val="Hyperlink"/>
@@ -6425,7 +6517,7 @@
             <w:noProof/>
             <w:webHidden/>
           </w:rPr>
-          <w:instrText xml:space="preserve"> PAGEREF _Toc225506516 \h </w:instrText>
+          <w:instrText xml:space="preserve"> PAGEREF _Toc239765798 \h </w:instrText>
         </w:r>
         <w:r>
           <w:rPr>
@@ -6470,7 +6562,7 @@
           <w14:ligatures w14:val="standardContextual"/>
         </w:rPr>
       </w:pPr>
-      <w:hyperlink w:anchor="_Toc225506517" w:history="1">
+      <w:hyperlink w:anchor="_Toc239765799" w:history="1">
         <w:r>
           <w:rPr>
             <w:rStyle w:val="Hyperlink"/>
@@ -6517,7 +6609,7 @@
             <w:noProof/>
             <w:webHidden/>
           </w:rPr>
-          <w:instrText xml:space="preserve"> PAGEREF _Toc225506517 \h </w:instrText>
+          <w:instrText xml:space="preserve"> PAGEREF _Toc239765799 \h </w:instrText>
         </w:r>
         <w:r>
           <w:rPr>
@@ -6562,7 +6654,7 @@
           <w14:ligatures w14:val="standardContextual"/>
         </w:rPr>
       </w:pPr>
-      <w:hyperlink w:anchor="_Toc225506518" w:history="1">
+      <w:hyperlink w:anchor="_Toc239765800" w:history="1">
         <w:r>
           <w:rPr>
             <w:rStyle w:val="Hyperlink"/>
@@ -6609,7 +6701,7 @@
             <w:noProof/>
             <w:webHidden/>
           </w:rPr>
-          <w:instrText xml:space="preserve"> PAGEREF _Toc225506518 \h </w:instrText>
+          <w:instrText xml:space="preserve"> PAGEREF _Toc239765800 \h </w:instrText>
         </w:r>
         <w:r>
           <w:rPr>
@@ -6652,7 +6744,7 @@
           <w14:ligatures w14:val="standardContextual"/>
         </w:rPr>
       </w:pPr>
-      <w:hyperlink w:anchor="_Toc225506519" w:history="1">
+      <w:hyperlink w:anchor="_Toc239765801" w:history="1">
         <w:r>
           <w:rPr>
             <w:rStyle w:val="Hyperlink"/>
@@ -6697,7 +6789,7 @@
             <w:noProof/>
             <w:webHidden/>
           </w:rPr>
-          <w:instrText xml:space="preserve"> PAGEREF _Toc225506519 \h </w:instrText>
+          <w:instrText xml:space="preserve"> PAGEREF _Toc239765801 \h </w:instrText>
         </w:r>
         <w:r>
           <w:rPr>
@@ -6742,7 +6834,7 @@
           <w14:ligatures w14:val="standardContextual"/>
         </w:rPr>
       </w:pPr>
-      <w:hyperlink w:anchor="_Toc225506520" w:history="1">
+      <w:hyperlink w:anchor="_Toc239765802" w:history="1">
         <w:r>
           <w:rPr>
             <w:rStyle w:val="Hyperlink"/>
@@ -6789,7 +6881,7 @@
             <w:noProof/>
             <w:webHidden/>
           </w:rPr>
-          <w:instrText xml:space="preserve"> PAGEREF _Toc225506520 \h </w:instrText>
+          <w:instrText xml:space="preserve"> PAGEREF _Toc239765802 \h </w:instrText>
         </w:r>
         <w:r>
           <w:rPr>
@@ -6834,7 +6926,7 @@
           <w14:ligatures w14:val="standardContextual"/>
         </w:rPr>
       </w:pPr>
-      <w:hyperlink w:anchor="_Toc225506521" w:history="1">
+      <w:hyperlink w:anchor="_Toc239765803" w:history="1">
         <w:r>
           <w:rPr>
             <w:rStyle w:val="Hyperlink"/>
@@ -6881,7 +6973,7 @@
             <w:noProof/>
             <w:webHidden/>
           </w:rPr>
-          <w:instrText xml:space="preserve"> PAGEREF _Toc225506521 \h </w:instrText>
+          <w:instrText xml:space="preserve"> PAGEREF _Toc239765803 \h </w:instrText>
         </w:r>
         <w:r>
           <w:rPr>
@@ -6926,7 +7018,7 @@
           <w14:ligatures w14:val="standardContextual"/>
         </w:rPr>
       </w:pPr>
-      <w:hyperlink w:anchor="_Toc225506522" w:history="1">
+      <w:hyperlink w:anchor="_Toc239765804" w:history="1">
         <w:r>
           <w:rPr>
             <w:rStyle w:val="Hyperlink"/>
@@ -6973,7 +7065,7 @@
             <w:noProof/>
             <w:webHidden/>
           </w:rPr>
-          <w:instrText xml:space="preserve"> PAGEREF _Toc225506522 \h </w:instrText>
+          <w:instrText xml:space="preserve"> PAGEREF _Toc239765804 \h </w:instrText>
         </w:r>
         <w:r>
           <w:rPr>
@@ -7018,7 +7110,7 @@
           <w14:ligatures w14:val="standardContextual"/>
         </w:rPr>
       </w:pPr>
-      <w:hyperlink w:anchor="_Toc225506523" w:history="1">
+      <w:hyperlink w:anchor="_Toc239765805" w:history="1">
         <w:r>
           <w:rPr>
             <w:rStyle w:val="Hyperlink"/>
@@ -7065,7 +7157,7 @@
             <w:noProof/>
             <w:webHidden/>
           </w:rPr>
-          <w:instrText xml:space="preserve"> PAGEREF _Toc225506523 \h </w:instrText>
+          <w:instrText xml:space="preserve"> PAGEREF _Toc239765805 \h </w:instrText>
         </w:r>
         <w:r>
           <w:rPr>
@@ -7110,7 +7202,7 @@
           <w14:ligatures w14:val="standardContextual"/>
         </w:rPr>
       </w:pPr>
-      <w:hyperlink w:anchor="_Toc225506524" w:history="1">
+      <w:hyperlink w:anchor="_Toc239765806" w:history="1">
         <w:r>
           <w:rPr>
             <w:rStyle w:val="Hyperlink"/>
@@ -7157,7 +7249,7 @@
             <w:noProof/>
             <w:webHidden/>
           </w:rPr>
-          <w:instrText xml:space="preserve"> PAGEREF _Toc225506524 \h </w:instrText>
+          <w:instrText xml:space="preserve"> PAGEREF _Toc239765806 \h </w:instrText>
         </w:r>
         <w:r>
           <w:rPr>
@@ -7203,7 +7295,7 @@
           <w14:ligatures w14:val="standardContextual"/>
         </w:rPr>
       </w:pPr>
-      <w:hyperlink w:anchor="_Toc225506525" w:history="1">
+      <w:hyperlink w:anchor="_Toc239765807" w:history="1">
         <w:r>
           <w:rPr>
             <w:rStyle w:val="Hyperlink"/>
@@ -7251,7 +7343,7 @@
             <w:noProof/>
             <w:webHidden/>
           </w:rPr>
-          <w:instrText xml:space="preserve"> PAGEREF _Toc225506525 \h </w:instrText>
+          <w:instrText xml:space="preserve"> PAGEREF _Toc239765807 \h </w:instrText>
         </w:r>
         <w:r>
           <w:rPr>
@@ -7294,7 +7386,7 @@
           <w14:ligatures w14:val="standardContextual"/>
         </w:rPr>
       </w:pPr>
-      <w:hyperlink w:anchor="_Toc225506526" w:history="1">
+      <w:hyperlink w:anchor="_Toc239765808" w:history="1">
         <w:r>
           <w:rPr>
             <w:rStyle w:val="Hyperlink"/>
@@ -7339,7 +7431,7 @@
             <w:noProof/>
             <w:webHidden/>
           </w:rPr>
-          <w:instrText xml:space="preserve"> PAGEREF _Toc225506526 \h </w:instrText>
+          <w:instrText xml:space="preserve"> PAGEREF _Toc239765808 \h </w:instrText>
         </w:r>
         <w:r>
           <w:rPr>
@@ -7382,7 +7474,7 @@
           <w14:ligatures w14:val="standardContextual"/>
         </w:rPr>
       </w:pPr>
-      <w:hyperlink w:anchor="_Toc225506527" w:history="1">
+      <w:hyperlink w:anchor="_Toc239765809" w:history="1">
         <w:r>
           <w:rPr>
             <w:rStyle w:val="Hyperlink"/>
@@ -7427,7 +7519,7 @@
             <w:noProof/>
             <w:webHidden/>
           </w:rPr>
-          <w:instrText xml:space="preserve"> PAGEREF _Toc225506527 \h </w:instrText>
+          <w:instrText xml:space="preserve"> PAGEREF _Toc239765809 \h </w:instrText>
         </w:r>
         <w:r>
           <w:rPr>
@@ -7470,7 +7562,7 @@
           <w14:ligatures w14:val="standardContextual"/>
         </w:rPr>
       </w:pPr>
-      <w:hyperlink w:anchor="_Toc225506528" w:history="1">
+      <w:hyperlink w:anchor="_Toc239765810" w:history="1">
         <w:r>
           <w:rPr>
             <w:rStyle w:val="Hyperlink"/>
@@ -7515,7 +7607,7 @@
             <w:noProof/>
             <w:webHidden/>
           </w:rPr>
-          <w:instrText xml:space="preserve"> PAGEREF _Toc225506528 \h </w:instrText>
+          <w:instrText xml:space="preserve"> PAGEREF _Toc239765810 \h </w:instrText>
         </w:r>
         <w:r>
           <w:rPr>
@@ -7558,7 +7650,7 @@
           <w14:ligatures w14:val="standardContextual"/>
         </w:rPr>
       </w:pPr>
-      <w:hyperlink w:anchor="_Toc225506529" w:history="1">
+      <w:hyperlink w:anchor="_Toc239765811" w:history="1">
         <w:r>
           <w:rPr>
             <w:rStyle w:val="Hyperlink"/>
@@ -7603,7 +7695,7 @@
             <w:noProof/>
             <w:webHidden/>
           </w:rPr>
-          <w:instrText xml:space="preserve"> PAGEREF _Toc225506529 \h </w:instrText>
+          <w:instrText xml:space="preserve"> PAGEREF _Toc239765811 \h </w:instrText>
         </w:r>
         <w:r>
           <w:rPr>
@@ -7646,7 +7738,7 @@
           <w14:ligatures w14:val="standardContextual"/>
         </w:rPr>
       </w:pPr>
-      <w:hyperlink w:anchor="_Toc225506530" w:history="1">
+      <w:hyperlink w:anchor="_Toc239765812" w:history="1">
         <w:r>
           <w:rPr>
             <w:rStyle w:val="Hyperlink"/>
@@ -7691,7 +7783,7 @@
             <w:noProof/>
             <w:webHidden/>
           </w:rPr>
-          <w:instrText xml:space="preserve"> PAGEREF _Toc225506530 \h </w:instrText>
+          <w:instrText xml:space="preserve"> PAGEREF _Toc239765812 \h </w:instrText>
         </w:r>
         <w:r>
           <w:rPr>
@@ -7734,7 +7826,7 @@
           <w14:ligatures w14:val="standardContextual"/>
         </w:rPr>
       </w:pPr>
-      <w:hyperlink w:anchor="_Toc225506531" w:history="1">
+      <w:hyperlink w:anchor="_Toc239765813" w:history="1">
         <w:r>
           <w:rPr>
             <w:rStyle w:val="Hyperlink"/>
@@ -7779,7 +7871,7 @@
             <w:noProof/>
             <w:webHidden/>
           </w:rPr>
-          <w:instrText xml:space="preserve"> PAGEREF _Toc225506531 \h </w:instrText>
+          <w:instrText xml:space="preserve"> PAGEREF _Toc239765813 \h </w:instrText>
         </w:r>
         <w:r>
           <w:rPr>
@@ -7822,7 +7914,7 @@
           <w14:ligatures w14:val="standardContextual"/>
         </w:rPr>
       </w:pPr>
-      <w:hyperlink w:anchor="_Toc225506532" w:history="1">
+      <w:hyperlink w:anchor="_Toc239765814" w:history="1">
         <w:r>
           <w:rPr>
             <w:rStyle w:val="Hyperlink"/>
@@ -7867,7 +7959,7 @@
             <w:noProof/>
             <w:webHidden/>
           </w:rPr>
-          <w:instrText xml:space="preserve"> PAGEREF _Toc225506532 \h </w:instrText>
+          <w:instrText xml:space="preserve"> PAGEREF _Toc239765814 \h </w:instrText>
         </w:r>
         <w:r>
           <w:rPr>
@@ -7910,7 +8002,7 @@
           <w14:ligatures w14:val="standardContextual"/>
         </w:rPr>
       </w:pPr>
-      <w:hyperlink w:anchor="_Toc225506533" w:history="1">
+      <w:hyperlink w:anchor="_Toc239765815" w:history="1">
         <w:r>
           <w:rPr>
             <w:rStyle w:val="Hyperlink"/>
@@ -7955,7 +8047,7 @@
             <w:noProof/>
             <w:webHidden/>
           </w:rPr>
-          <w:instrText xml:space="preserve"> PAGEREF _Toc225506533 \h </w:instrText>
+          <w:instrText xml:space="preserve"> PAGEREF _Toc239765815 \h </w:instrText>
         </w:r>
         <w:r>
           <w:rPr>
@@ -8001,7 +8093,7 @@
           <w14:ligatures w14:val="standardContextual"/>
         </w:rPr>
       </w:pPr>
-      <w:hyperlink w:anchor="_Toc225506534" w:history="1">
+      <w:hyperlink w:anchor="_Toc239765816" w:history="1">
         <w:r>
           <w:rPr>
             <w:rStyle w:val="Hyperlink"/>
@@ -8049,7 +8141,7 @@
             <w:noProof/>
             <w:webHidden/>
           </w:rPr>
-          <w:instrText xml:space="preserve"> PAGEREF _Toc225506534 \h </w:instrText>
+          <w:instrText xml:space="preserve"> PAGEREF _Toc239765816 \h </w:instrText>
         </w:r>
         <w:r>
           <w:rPr>
@@ -8092,7 +8184,7 @@
           <w14:ligatures w14:val="standardContextual"/>
         </w:rPr>
       </w:pPr>
-      <w:hyperlink w:anchor="_Toc225506535" w:history="1">
+      <w:hyperlink w:anchor="_Toc239765817" w:history="1">
         <w:r>
           <w:rPr>
             <w:rStyle w:val="Hyperlink"/>
@@ -8137,7 +8229,7 @@
             <w:noProof/>
             <w:webHidden/>
           </w:rPr>
-          <w:instrText xml:space="preserve"> PAGEREF _Toc225506535 \h </w:instrText>
+          <w:instrText xml:space="preserve"> PAGEREF _Toc239765817 \h </w:instrText>
         </w:r>
         <w:r>
           <w:rPr>
@@ -8180,7 +8272,7 @@
           <w14:ligatures w14:val="standardContextual"/>
         </w:rPr>
       </w:pPr>
-      <w:hyperlink w:anchor="_Toc225506536" w:history="1">
+      <w:hyperlink w:anchor="_Toc239765818" w:history="1">
         <w:r>
           <w:rPr>
             <w:rStyle w:val="Hyperlink"/>
@@ -8225,7 +8317,7 @@
             <w:noProof/>
             <w:webHidden/>
           </w:rPr>
-          <w:instrText xml:space="preserve"> PAGEREF _Toc225506536 \h </w:instrText>
+          <w:instrText xml:space="preserve"> PAGEREF _Toc239765818 \h </w:instrText>
         </w:r>
         <w:r>
           <w:rPr>
@@ -8270,7 +8362,7 @@
           <w14:ligatures w14:val="standardContextual"/>
         </w:rPr>
       </w:pPr>
-      <w:hyperlink w:anchor="_Toc225506537" w:history="1">
+      <w:hyperlink w:anchor="_Toc239765819" w:history="1">
         <w:r>
           <w:rPr>
             <w:rStyle w:val="Hyperlink"/>
@@ -8317,7 +8409,7 @@
             <w:noProof/>
             <w:webHidden/>
           </w:rPr>
-          <w:instrText xml:space="preserve"> PAGEREF _Toc225506537 \h </w:instrText>
+          <w:instrText xml:space="preserve"> PAGEREF _Toc239765819 \h </w:instrText>
         </w:r>
         <w:r>
           <w:rPr>
@@ -8362,7 +8454,7 @@
           <w14:ligatures w14:val="standardContextual"/>
         </w:rPr>
       </w:pPr>
-      <w:hyperlink w:anchor="_Toc225506538" w:history="1">
+      <w:hyperlink w:anchor="_Toc239765820" w:history="1">
         <w:r>
           <w:rPr>
             <w:rStyle w:val="Hyperlink"/>
@@ -8409,7 +8501,7 @@
             <w:noProof/>
             <w:webHidden/>
           </w:rPr>
-          <w:instrText xml:space="preserve"> PAGEREF _Toc225506538 \h </w:instrText>
+          <w:instrText xml:space="preserve"> PAGEREF _Toc239765820 \h </w:instrText>
         </w:r>
         <w:r>
           <w:rPr>
@@ -8454,7 +8546,7 @@
           <w14:ligatures w14:val="standardContextual"/>
         </w:rPr>
       </w:pPr>
-      <w:hyperlink w:anchor="_Toc225506539" w:history="1">
+      <w:hyperlink w:anchor="_Toc239765821" w:history="1">
         <w:r>
           <w:rPr>
             <w:rStyle w:val="Hyperlink"/>
@@ -8501,7 +8593,7 @@
             <w:noProof/>
             <w:webHidden/>
           </w:rPr>
-          <w:instrText xml:space="preserve"> PAGEREF _Toc225506539 \h </w:instrText>
+          <w:instrText xml:space="preserve"> PAGEREF _Toc239765821 \h </w:instrText>
         </w:r>
         <w:r>
           <w:rPr>
@@ -8546,7 +8638,7 @@
           <w14:ligatures w14:val="standardContextual"/>
         </w:rPr>
       </w:pPr>
-      <w:hyperlink w:anchor="_Toc225506540" w:history="1">
+      <w:hyperlink w:anchor="_Toc239765822" w:history="1">
         <w:r>
           <w:rPr>
             <w:rStyle w:val="Hyperlink"/>
@@ -8593,7 +8685,7 @@
             <w:noProof/>
             <w:webHidden/>
           </w:rPr>
-          <w:instrText xml:space="preserve"> PAGEREF _Toc225506540 \h </w:instrText>
+          <w:instrText xml:space="preserve"> PAGEREF _Toc239765822 \h </w:instrText>
         </w:r>
         <w:r>
           <w:rPr>
@@ -8632,7 +8724,7 @@
         <w:lastRenderedPageBreak/>
         <w:fldChar w:fldCharType="end"/>
       </w:r>
-      <w:bookmarkStart w:id="3" w:name="_Toc225506449"/>
+      <w:bookmarkStart w:id="3" w:name="_Toc239765730"/>
       <w:r>
         <w:t>Introduction</w:t>
       </w:r>
@@ -8755,7 +8847,7 @@
       <w:pPr>
         <w:pStyle w:val="Heading2"/>
       </w:pPr>
-      <w:bookmarkStart w:id="4" w:name="_Toc225506450"/>
+      <w:bookmarkStart w:id="4" w:name="_Toc239765731"/>
       <w:r>
         <w:t>Purpose</w:t>
       </w:r>
@@ -9008,7 +9100,7 @@
         <w:pStyle w:val="Heading2"/>
       </w:pPr>
       <w:bookmarkStart w:id="5" w:name="_Toc357416400"/>
-      <w:bookmarkStart w:id="6" w:name="_Toc225506451"/>
+      <w:bookmarkStart w:id="6" w:name="_Toc239765732"/>
       <w:r>
         <w:t>Cohort Reproduction – Probability of Establishment</w:t>
       </w:r>
@@ -9108,7 +9200,7 @@
       <w:pPr>
         <w:pStyle w:val="Heading2"/>
       </w:pPr>
-      <w:bookmarkStart w:id="7" w:name="_Toc225506452"/>
+      <w:bookmarkStart w:id="7" w:name="_Toc239765733"/>
       <w:r>
         <w:t>Cohort Growth</w:t>
       </w:r>
@@ -9203,7 +9295,7 @@
         </w:tabs>
         <w:ind w:left="1440"/>
       </w:pPr>
-      <w:bookmarkStart w:id="8" w:name="_Toc225506453"/>
+      <w:bookmarkStart w:id="8" w:name="_Toc239765734"/>
       <w:r>
         <w:t>Water limits</w:t>
       </w:r>
@@ -9911,7 +10003,7 @@
         </w:tabs>
         <w:ind w:left="1440"/>
       </w:pPr>
-      <w:bookmarkStart w:id="9" w:name="_Toc225506454"/>
+      <w:bookmarkStart w:id="9" w:name="_Toc239765735"/>
       <w:r>
         <w:t>T</w:t>
       </w:r>
@@ -10421,7 +10513,7 @@
       <w:pPr>
         <w:pStyle w:val="Heading2"/>
       </w:pPr>
-      <w:bookmarkStart w:id="10" w:name="_Toc225506455"/>
+      <w:bookmarkStart w:id="10" w:name="_Toc239765736"/>
       <w:r>
         <w:t xml:space="preserve">Soil and </w:t>
       </w:r>
@@ -10495,7 +10587,7 @@
       <w:pPr>
         <w:pStyle w:val="Heading2"/>
       </w:pPr>
-      <w:bookmarkStart w:id="11" w:name="_Toc225506456"/>
+      <w:bookmarkStart w:id="11" w:name="_Toc239765737"/>
       <w:r>
         <w:t xml:space="preserve">Initial </w:t>
       </w:r>
@@ -10565,7 +10657,7 @@
       <w:pPr>
         <w:pStyle w:val="Heading2"/>
       </w:pPr>
-      <w:bookmarkStart w:id="12" w:name="_Toc225506457"/>
+      <w:bookmarkStart w:id="12" w:name="_Toc239765738"/>
       <w:r>
         <w:t>Cohort Reproduction – Disturbance Interactions</w:t>
       </w:r>
@@ -10615,7 +10707,7 @@
       <w:pPr>
         <w:pStyle w:val="Heading2"/>
       </w:pPr>
-      <w:bookmarkStart w:id="13" w:name="_Toc225506458"/>
+      <w:bookmarkStart w:id="13" w:name="_Toc239765739"/>
       <w:r>
         <w:t>Cohort Reproduction – Initial Biomass</w:t>
       </w:r>
@@ -10916,7 +11008,7 @@
       <w:pPr>
         <w:pStyle w:val="Heading2"/>
       </w:pPr>
-      <w:bookmarkStart w:id="14" w:name="_Toc225506459"/>
+      <w:bookmarkStart w:id="14" w:name="_Toc239765740"/>
       <w:r>
         <w:lastRenderedPageBreak/>
         <w:t>Interactions with Disturbances</w:t>
@@ -10935,7 +11027,7 @@
       <w:pPr>
         <w:pStyle w:val="Heading2"/>
       </w:pPr>
-      <w:bookmarkStart w:id="15" w:name="_Toc225506460"/>
+      <w:bookmarkStart w:id="15" w:name="_Toc239765741"/>
       <w:r>
         <w:t>Drought mortality</w:t>
       </w:r>
@@ -10959,7 +11051,7 @@
       <w:pPr>
         <w:pStyle w:val="Heading2"/>
       </w:pPr>
-      <w:bookmarkStart w:id="16" w:name="_Toc225506461"/>
+      <w:bookmarkStart w:id="16" w:name="_Toc239765742"/>
       <w:r>
         <w:t>Cohort Senescence</w:t>
       </w:r>
@@ -11003,7 +11095,7 @@
       <w:pPr>
         <w:pStyle w:val="Heading2"/>
       </w:pPr>
-      <w:bookmarkStart w:id="17" w:name="_Toc225506462"/>
+      <w:bookmarkStart w:id="17" w:name="_Toc239765743"/>
       <w:r>
         <w:t>Major Releases</w:t>
       </w:r>
@@ -11014,11 +11106,29 @@
         <w:pStyle w:val="Heading3"/>
       </w:pPr>
       <w:bookmarkStart w:id="18" w:name="_Toc357416398"/>
-      <w:bookmarkStart w:id="19" w:name="_Toc225506463"/>
+      <w:bookmarkStart w:id="19" w:name="_Toc239765744"/>
+      <w:r>
+        <w:t>Version 8.3 (September 2026)</w:t>
+      </w:r>
+      <w:bookmarkEnd w:id="19"/>
+    </w:p>
+    <w:p>
+      <w:pPr>
+        <w:pStyle w:val="textbody"/>
+      </w:pPr>
+      <w:r>
+        <w:t>Updated with v6 of the Climate Library.</w:t>
+      </w:r>
+    </w:p>
+    <w:p>
+      <w:pPr>
+        <w:pStyle w:val="Heading3"/>
+      </w:pPr>
+      <w:bookmarkStart w:id="20" w:name="_Toc239765745"/>
       <w:r>
         <w:t>Version 8.2 (March 2026)</w:t>
       </w:r>
-      <w:bookmarkEnd w:id="19"/>
+      <w:bookmarkEnd w:id="20"/>
     </w:p>
     <w:p>
       <w:pPr>
@@ -11032,11 +11142,11 @@
       <w:pPr>
         <w:pStyle w:val="Heading3"/>
       </w:pPr>
-      <w:bookmarkStart w:id="20" w:name="_Toc225506464"/>
+      <w:bookmarkStart w:id="21" w:name="_Toc239765746"/>
       <w:r>
         <w:t>Version 8.1 (October 2025)</w:t>
       </w:r>
-      <w:bookmarkEnd w:id="20"/>
+      <w:bookmarkEnd w:id="21"/>
     </w:p>
     <w:p>
       <w:pPr>
@@ -11068,11 +11178,11 @@
       <w:pPr>
         <w:pStyle w:val="Heading3"/>
       </w:pPr>
-      <w:bookmarkStart w:id="21" w:name="_Toc225506465"/>
+      <w:bookmarkStart w:id="22" w:name="_Toc239765747"/>
       <w:r>
         <w:t>Version 8.0 (August 2024)</w:t>
       </w:r>
-      <w:bookmarkEnd w:id="21"/>
+      <w:bookmarkEnd w:id="22"/>
     </w:p>
     <w:p>
       <w:pPr>
@@ -11102,8 +11212,9 @@
       <w:pPr>
         <w:pStyle w:val="Heading3"/>
       </w:pPr>
-      <w:bookmarkStart w:id="22" w:name="_Toc225506466"/>
-      <w:r>
+      <w:bookmarkStart w:id="23" w:name="_Toc239765748"/>
+      <w:r>
+        <w:lastRenderedPageBreak/>
         <w:t>Version 7.0 (</w:t>
       </w:r>
       <w:r>
@@ -11112,7 +11223,7 @@
       <w:r>
         <w:t xml:space="preserve"> 2023)</w:t>
       </w:r>
-      <w:bookmarkEnd w:id="22"/>
+      <w:bookmarkEnd w:id="23"/>
     </w:p>
     <w:p>
       <w:pPr>
@@ -11182,7 +11293,6 @@
           <w:rFonts w:hint="eastAsia"/>
           <w:lang w:eastAsia="ja-JP"/>
         </w:rPr>
-        <w:lastRenderedPageBreak/>
         <w:t>A portion of the snowpack evaporates when PET &gt; 0.</w:t>
       </w:r>
       <w:r>
@@ -11409,7 +11519,14 @@
         <w:rPr>
           <w:highlight w:val="yellow"/>
         </w:rPr>
-        <w:t xml:space="preserve">previously used the Henne Water Mode, the NECN v7 model should be largely the same as the NECN v6 model, so long as baseflow and stormflow are set to 0. </w:t>
+        <w:t xml:space="preserve">previously used the Henne Water Mode, the NECN v7 </w:t>
+      </w:r>
+      <w:r>
+        <w:rPr>
+          <w:highlight w:val="yellow"/>
+        </w:rPr>
+        <w:lastRenderedPageBreak/>
+        <w:t xml:space="preserve">model should be largely the same as the NECN v6 model, so long as baseflow and stormflow are set to 0. </w:t>
       </w:r>
     </w:p>
     <w:p>
@@ -11451,14 +11568,7 @@
         <w:rPr>
           <w:lang w:eastAsia="ja-JP"/>
         </w:rPr>
-        <w:t xml:space="preserve">In previous </w:t>
-      </w:r>
-      <w:r>
-        <w:rPr>
-          <w:lang w:eastAsia="ja-JP"/>
-        </w:rPr>
-        <w:lastRenderedPageBreak/>
-        <w:t xml:space="preserve">versions, the effects of drought were realized in NECN by reduced growth rates, and reduced regeneration, but not elevated mortality rates.  </w:t>
+        <w:t xml:space="preserve">In previous versions, the effects of drought were realized in NECN by reduced growth rates, and reduced regeneration, but not elevated mortality rates.  </w:t>
       </w:r>
       <w:r>
         <w:t>We added representation of t</w:t>
@@ -11608,7 +11718,11 @@
         </w:numPr>
       </w:pPr>
       <w:r>
-        <w:t xml:space="preserve">Additional optional limits to establishment were added. Establishment may now be (optionally) limited by climatic water deficit or by soil drainage classes, preventing species from establishing in dry sites or </w:t>
+        <w:t xml:space="preserve">Additional optional limits to establishment were added. Establishment may now be (optionally) limited by climatic water </w:t>
+      </w:r>
+      <w:r>
+        <w:lastRenderedPageBreak/>
+        <w:t xml:space="preserve">deficit or by soil drainage classes, preventing species from establishing in dry sites or </w:t>
       </w:r>
       <w:proofErr w:type="gramStart"/>
       <w:r>
@@ -11616,11 +11730,7 @@
       </w:r>
       <w:proofErr w:type="gramEnd"/>
       <w:r>
-        <w:t xml:space="preserve"> sites. In combination with the above moisture curve modifications, this change prevents establishment of upland species in wetlands. CWD-based </w:t>
-      </w:r>
-      <w:r>
-        <w:lastRenderedPageBreak/>
-        <w:t xml:space="preserve">establishment is somewhat easier to parameterize than </w:t>
+        <w:t xml:space="preserve"> sites. In combination with the above moisture curve modifications, this change prevents establishment of upland species in wetlands. CWD-based establishment is somewhat easier to parameterize than </w:t>
       </w:r>
       <w:proofErr w:type="spellStart"/>
       <w:r>
@@ -11693,7 +11803,7 @@
       <w:pPr>
         <w:pStyle w:val="Heading3"/>
       </w:pPr>
-      <w:bookmarkStart w:id="23" w:name="_Toc225506467"/>
+      <w:bookmarkStart w:id="24" w:name="_Toc239765749"/>
       <w:r>
         <w:t>Version 6.10 (</w:t>
       </w:r>
@@ -11703,7 +11813,7 @@
       <w:r>
         <w:t xml:space="preserve"> 2022)</w:t>
       </w:r>
-      <w:bookmarkEnd w:id="23"/>
+      <w:bookmarkEnd w:id="24"/>
     </w:p>
     <w:p>
       <w:pPr>
@@ -12224,12 +12334,13 @@
       <w:pPr>
         <w:pStyle w:val="Heading3"/>
       </w:pPr>
-      <w:bookmarkStart w:id="24" w:name="_Toc225506468"/>
+      <w:bookmarkStart w:id="25" w:name="_Toc239765750"/>
       <w:proofErr w:type="gramStart"/>
       <w:r>
         <w:rPr>
           <w:rFonts w:hint="eastAsia"/>
         </w:rPr>
+        <w:lastRenderedPageBreak/>
         <w:t>Version</w:t>
       </w:r>
       <w:proofErr w:type="gramEnd"/>
@@ -12272,7 +12383,7 @@
         </w:rPr>
         <w:t>)</w:t>
       </w:r>
-      <w:bookmarkEnd w:id="24"/>
+      <w:bookmarkEnd w:id="25"/>
     </w:p>
     <w:p>
       <w:pPr>
@@ -12305,15 +12416,7 @@
           <w:rFonts w:hint="eastAsia"/>
           <w:lang w:eastAsia="ja-JP"/>
         </w:rPr>
-        <w:t xml:space="preserve"> was added to the Species table; this allows the user to override the previous default value of 0.47.  We also </w:t>
-      </w:r>
-      <w:r>
-        <w:rPr>
-          <w:rFonts w:hint="eastAsia"/>
-          <w:lang w:eastAsia="ja-JP"/>
-        </w:rPr>
-        <w:lastRenderedPageBreak/>
-        <w:t xml:space="preserve">added an optional Minimum LAI to the functional group table allowing users to override the previous default of 0.10.  </w:t>
+        <w:t xml:space="preserve"> was added to the Species table; this allows the user to override the previous default value of 0.47.  We also added an optional Minimum LAI to the functional group table allowing users to override the previous default of 0.10.  </w:t>
       </w:r>
       <w:r>
         <w:rPr>
@@ -12352,7 +12455,7 @@
       <w:pPr>
         <w:pStyle w:val="Heading3"/>
       </w:pPr>
-      <w:bookmarkStart w:id="25" w:name="_Toc225506469"/>
+      <w:bookmarkStart w:id="26" w:name="_Toc239765751"/>
       <w:r>
         <w:rPr>
           <w:rFonts w:hint="eastAsia"/>
@@ -12383,7 +12486,7 @@
         </w:rPr>
         <w:t xml:space="preserve"> 2021)</w:t>
       </w:r>
-      <w:bookmarkEnd w:id="25"/>
+      <w:bookmarkEnd w:id="26"/>
     </w:p>
     <w:p>
       <w:pPr>
@@ -12406,7 +12509,7 @@
         </w:rPr>
         <w:t xml:space="preserve">new type of species:  Grass.  </w:t>
       </w:r>
-      <w:bookmarkStart w:id="26" w:name="_Hlk96081557"/>
+      <w:bookmarkStart w:id="27" w:name="_Hlk96081557"/>
       <w:r>
         <w:rPr>
           <w:rFonts w:hint="eastAsia"/>
@@ -12451,7 +12554,7 @@
         </w:rPr>
         <w:t>) is present and one or more species are labeled as such.</w:t>
       </w:r>
-      <w:bookmarkEnd w:id="26"/>
+      <w:bookmarkEnd w:id="27"/>
       <w:r>
         <w:rPr>
           <w:rFonts w:hint="eastAsia"/>
@@ -12739,7 +12842,7 @@
       <w:pPr>
         <w:pStyle w:val="Heading3"/>
       </w:pPr>
-      <w:bookmarkStart w:id="27" w:name="_Toc225506470"/>
+      <w:bookmarkStart w:id="28" w:name="_Toc239765752"/>
       <w:r>
         <w:rPr>
           <w:rFonts w:hint="eastAsia"/>
@@ -12749,7 +12852,7 @@
       <w:r>
         <w:t>and Earlier</w:t>
       </w:r>
-      <w:bookmarkEnd w:id="27"/>
+      <w:bookmarkEnd w:id="28"/>
     </w:p>
     <w:p>
       <w:pPr>
@@ -12771,7 +12874,7 @@
       <w:pPr>
         <w:pStyle w:val="Heading2"/>
       </w:pPr>
-      <w:bookmarkStart w:id="28" w:name="_Toc225506471"/>
+      <w:bookmarkStart w:id="29" w:name="_Toc239765753"/>
       <w:bookmarkEnd w:id="18"/>
       <w:r>
         <w:t>Minor Releases</w:t>
@@ -12779,20 +12882,20 @@
       <w:r>
         <w:t xml:space="preserve"> (this major release)</w:t>
       </w:r>
-      <w:bookmarkEnd w:id="28"/>
+      <w:bookmarkEnd w:id="29"/>
     </w:p>
     <w:p>
       <w:pPr>
         <w:pStyle w:val="Heading3"/>
       </w:pPr>
-      <w:bookmarkStart w:id="29" w:name="_Toc225506472"/>
+      <w:bookmarkStart w:id="30" w:name="_Toc239765754"/>
       <w:r>
         <w:t>8.0.4. Update to Fine Fuel calculation</w:t>
       </w:r>
       <w:r>
         <w:t xml:space="preserve"> timing</w:t>
       </w:r>
-      <w:bookmarkEnd w:id="29"/>
+      <w:bookmarkEnd w:id="30"/>
     </w:p>
     <w:p>
       <w:pPr>
@@ -12815,14 +12918,14 @@
       <w:pPr>
         <w:pStyle w:val="Heading3"/>
       </w:pPr>
-      <w:bookmarkStart w:id="30" w:name="_Toc225506473"/>
+      <w:bookmarkStart w:id="31" w:name="_Toc239765755"/>
       <w:r>
         <w:t xml:space="preserve">8.0.3. </w:t>
       </w:r>
       <w:r>
         <w:t>Bugfix in postfire regeneration</w:t>
       </w:r>
-      <w:bookmarkEnd w:id="30"/>
+      <w:bookmarkEnd w:id="31"/>
     </w:p>
     <w:p>
       <w:pPr>
@@ -12836,32 +12939,32 @@
       <w:pPr>
         <w:pStyle w:val="Heading3"/>
       </w:pPr>
-      <w:bookmarkStart w:id="31" w:name="_Toc225506474"/>
+      <w:bookmarkStart w:id="32" w:name="_Toc239765756"/>
       <w:r>
         <w:lastRenderedPageBreak/>
         <w:t>8.0.2. Bugfix in initial biomass calculation.</w:t>
       </w:r>
-      <w:bookmarkEnd w:id="31"/>
+      <w:bookmarkEnd w:id="32"/>
     </w:p>
     <w:p>
       <w:pPr>
         <w:pStyle w:val="Heading3"/>
       </w:pPr>
-      <w:bookmarkStart w:id="32" w:name="_Toc225506475"/>
+      <w:bookmarkStart w:id="33" w:name="_Toc239765757"/>
       <w:r>
         <w:t>8.0.1. Bugfixes in ANPP calculation.</w:t>
       </w:r>
-      <w:bookmarkEnd w:id="32"/>
+      <w:bookmarkEnd w:id="33"/>
     </w:p>
     <w:p>
       <w:pPr>
         <w:pStyle w:val="Heading2"/>
       </w:pPr>
-      <w:bookmarkStart w:id="33" w:name="_Toc225506476"/>
+      <w:bookmarkStart w:id="34" w:name="_Toc239765758"/>
       <w:r>
         <w:t>References</w:t>
       </w:r>
-      <w:bookmarkEnd w:id="33"/>
+      <w:bookmarkEnd w:id="34"/>
     </w:p>
     <w:p>
       <w:pPr>
@@ -12908,7 +13011,7 @@
           <w:szCs w:val="20"/>
         </w:rPr>
       </w:pPr>
-      <w:bookmarkStart w:id="34" w:name="PCRefList_LANDIS_II_Century_Succession_v"/>
+      <w:bookmarkStart w:id="35" w:name="PCRefList_LANDIS_II_Century_Succession_v"/>
       <w:r>
         <w:rPr>
           <w:rFonts w:cs="MS Sans Serif"/>
@@ -13983,14 +14086,14 @@
       <w:pPr>
         <w:pStyle w:val="Heading2"/>
       </w:pPr>
-      <w:bookmarkStart w:id="35" w:name="_Toc127846704"/>
-      <w:bookmarkStart w:id="36" w:name="_Toc225506477"/>
-      <w:bookmarkEnd w:id="34"/>
+      <w:bookmarkStart w:id="36" w:name="_Toc127846704"/>
+      <w:bookmarkStart w:id="37" w:name="_Toc239765759"/>
+      <w:bookmarkEnd w:id="35"/>
       <w:r>
         <w:t>Acknowledgments</w:t>
       </w:r>
-      <w:bookmarkEnd w:id="35"/>
       <w:bookmarkEnd w:id="36"/>
+      <w:bookmarkEnd w:id="37"/>
     </w:p>
     <w:p>
       <w:pPr>
@@ -14043,7 +14146,7 @@
       <w:pPr>
         <w:pStyle w:val="Heading1"/>
       </w:pPr>
-      <w:bookmarkStart w:id="37" w:name="_Toc225506478"/>
+      <w:bookmarkStart w:id="38" w:name="_Toc239765760"/>
       <w:r>
         <w:lastRenderedPageBreak/>
         <w:t xml:space="preserve">Succession </w:t>
@@ -14051,7 +14154,7 @@
       <w:r>
         <w:t>Input File</w:t>
       </w:r>
-      <w:bookmarkEnd w:id="37"/>
+      <w:bookmarkEnd w:id="38"/>
     </w:p>
     <w:p>
       <w:pPr>
@@ -14114,14 +14217,14 @@
       <w:pPr>
         <w:pStyle w:val="Heading2"/>
       </w:pPr>
-      <w:bookmarkStart w:id="38" w:name="_Toc112490865"/>
-      <w:bookmarkStart w:id="39" w:name="_Toc225506479"/>
+      <w:bookmarkStart w:id="39" w:name="_Toc112490865"/>
+      <w:bookmarkStart w:id="40" w:name="_Toc239765761"/>
       <w:proofErr w:type="spellStart"/>
       <w:r>
         <w:t>LandisData</w:t>
       </w:r>
-      <w:bookmarkEnd w:id="38"/>
       <w:bookmarkEnd w:id="39"/>
+      <w:bookmarkEnd w:id="40"/>
       <w:proofErr w:type="spellEnd"/>
     </w:p>
     <w:p>
@@ -14163,13 +14266,13 @@
       <w:pPr>
         <w:pStyle w:val="Heading2"/>
       </w:pPr>
-      <w:bookmarkStart w:id="40" w:name="_Toc112490866"/>
-      <w:bookmarkStart w:id="41" w:name="_Toc225506480"/>
+      <w:bookmarkStart w:id="41" w:name="_Toc112490866"/>
+      <w:bookmarkStart w:id="42" w:name="_Toc239765762"/>
       <w:r>
         <w:t>Timestep</w:t>
       </w:r>
-      <w:bookmarkEnd w:id="40"/>
       <w:bookmarkEnd w:id="41"/>
+      <w:bookmarkEnd w:id="42"/>
     </w:p>
     <w:p>
       <w:pPr>
@@ -14265,16 +14368,16 @@
       <w:pPr>
         <w:pStyle w:val="Heading2"/>
       </w:pPr>
-      <w:bookmarkStart w:id="42" w:name="_Toc107735767"/>
-      <w:bookmarkStart w:id="43" w:name="_Toc112490867"/>
-      <w:bookmarkStart w:id="44" w:name="_Toc225506481"/>
+      <w:bookmarkStart w:id="43" w:name="_Toc107735767"/>
+      <w:bookmarkStart w:id="44" w:name="_Toc112490867"/>
+      <w:bookmarkStart w:id="45" w:name="_Toc239765763"/>
       <w:proofErr w:type="spellStart"/>
       <w:r>
         <w:t>SeedingAlgorithm</w:t>
       </w:r>
-      <w:bookmarkEnd w:id="42"/>
       <w:bookmarkEnd w:id="43"/>
       <w:bookmarkEnd w:id="44"/>
+      <w:bookmarkEnd w:id="45"/>
       <w:proofErr w:type="spellEnd"/>
     </w:p>
     <w:p>
@@ -14410,10 +14513,10 @@
       <w:pPr>
         <w:pStyle w:val="Heading2"/>
       </w:pPr>
-      <w:bookmarkStart w:id="45" w:name="_Toc107735768"/>
-      <w:bookmarkStart w:id="46" w:name="_Toc112490868"/>
-      <w:bookmarkStart w:id="47" w:name="_Ref140207509"/>
-      <w:bookmarkStart w:id="48" w:name="_Toc225506482"/>
+      <w:bookmarkStart w:id="46" w:name="_Toc107735768"/>
+      <w:bookmarkStart w:id="47" w:name="_Toc112490868"/>
+      <w:bookmarkStart w:id="48" w:name="_Ref140207509"/>
+      <w:bookmarkStart w:id="49" w:name="_Toc239765764"/>
       <w:proofErr w:type="spellStart"/>
       <w:r>
         <w:t>InitialCommunities</w:t>
@@ -14425,7 +14528,7 @@
       <w:r>
         <w:t xml:space="preserve"> (file name)</w:t>
       </w:r>
-      <w:bookmarkEnd w:id="48"/>
+      <w:bookmarkEnd w:id="49"/>
     </w:p>
     <w:p>
       <w:pPr>
@@ -14483,22 +14586,22 @@
       <w:pPr>
         <w:pStyle w:val="Heading2"/>
       </w:pPr>
-      <w:bookmarkStart w:id="49" w:name="_Ref109371856"/>
-      <w:bookmarkStart w:id="50" w:name="_Toc133339090"/>
-      <w:bookmarkStart w:id="51" w:name="_Toc282434151"/>
-      <w:bookmarkStart w:id="52" w:name="_Toc225506483"/>
+      <w:bookmarkStart w:id="50" w:name="_Ref109371856"/>
+      <w:bookmarkStart w:id="51" w:name="_Toc133339090"/>
+      <w:bookmarkStart w:id="52" w:name="_Toc282434151"/>
+      <w:bookmarkStart w:id="53" w:name="_Toc239765765"/>
       <w:proofErr w:type="spellStart"/>
       <w:r>
         <w:t>InitialCommunitiesMap</w:t>
       </w:r>
-      <w:bookmarkEnd w:id="49"/>
       <w:bookmarkEnd w:id="50"/>
       <w:bookmarkEnd w:id="51"/>
+      <w:bookmarkEnd w:id="52"/>
       <w:proofErr w:type="spellEnd"/>
       <w:r>
         <w:t xml:space="preserve"> (file name)</w:t>
       </w:r>
-      <w:bookmarkEnd w:id="52"/>
+      <w:bookmarkEnd w:id="53"/>
     </w:p>
     <w:p>
       <w:pPr>
@@ -14518,7 +14621,7 @@
       <w:pPr>
         <w:pStyle w:val="Heading2"/>
       </w:pPr>
-      <w:bookmarkStart w:id="53" w:name="_Toc225506484"/>
+      <w:bookmarkStart w:id="54" w:name="_Toc239765766"/>
       <w:proofErr w:type="spellStart"/>
       <w:r>
         <w:t>Climate</w:t>
@@ -14533,7 +14636,7 @@
       <w:r>
         <w:t xml:space="preserve"> (file name)</w:t>
       </w:r>
-      <w:bookmarkEnd w:id="53"/>
+      <w:bookmarkEnd w:id="54"/>
     </w:p>
     <w:p>
       <w:pPr>
@@ -14583,13 +14686,13 @@
       <w:pPr>
         <w:pStyle w:val="Heading2"/>
       </w:pPr>
-      <w:bookmarkStart w:id="54" w:name="_Toc510167268"/>
-      <w:bookmarkStart w:id="55" w:name="_Toc225506485"/>
+      <w:bookmarkStart w:id="55" w:name="_Toc510167268"/>
+      <w:bookmarkStart w:id="56" w:name="_Toc239765767"/>
       <w:r>
         <w:lastRenderedPageBreak/>
         <w:t>Soil Physical Parameters</w:t>
       </w:r>
-      <w:bookmarkEnd w:id="55"/>
+      <w:bookmarkEnd w:id="56"/>
     </w:p>
     <w:p>
       <w:pPr>
@@ -15086,13 +15189,13 @@
       <w:pPr>
         <w:pStyle w:val="Heading2"/>
       </w:pPr>
-      <w:bookmarkStart w:id="56" w:name="_Toc510167272"/>
-      <w:bookmarkStart w:id="57" w:name="_Toc225506486"/>
-      <w:bookmarkEnd w:id="54"/>
+      <w:bookmarkStart w:id="57" w:name="_Toc510167272"/>
+      <w:bookmarkStart w:id="58" w:name="_Toc239765768"/>
+      <w:bookmarkEnd w:id="55"/>
       <w:r>
         <w:t>Initial Soil and Dead Wood Inputs</w:t>
       </w:r>
-      <w:bookmarkEnd w:id="57"/>
+      <w:bookmarkEnd w:id="58"/>
     </w:p>
     <w:p>
       <w:pPr>
@@ -15232,11 +15335,11 @@
               <w:pStyle w:val="textbody"/>
               <w:ind w:left="0" w:right="156"/>
             </w:pPr>
-            <w:bookmarkStart w:id="58" w:name="_Toc510167273"/>
+            <w:bookmarkStart w:id="59" w:name="_Toc510167273"/>
             <w:r>
               <w:t>InitialSOM1NsurfMapName</w:t>
             </w:r>
-            <w:bookmarkEnd w:id="58"/>
+            <w:bookmarkEnd w:id="59"/>
           </w:p>
         </w:tc>
         <w:tc>
@@ -15273,11 +15376,11 @@
               <w:pStyle w:val="textbody"/>
               <w:ind w:left="0" w:right="156"/>
             </w:pPr>
-            <w:bookmarkStart w:id="59" w:name="_Toc510167274"/>
+            <w:bookmarkStart w:id="60" w:name="_Toc510167274"/>
             <w:r>
               <w:t>InitialSOM1CsoilMapName</w:t>
             </w:r>
-            <w:bookmarkEnd w:id="59"/>
+            <w:bookmarkEnd w:id="60"/>
           </w:p>
         </w:tc>
         <w:tc>
@@ -15314,11 +15417,11 @@
               <w:pStyle w:val="textbody"/>
               <w:ind w:left="0" w:right="156"/>
             </w:pPr>
-            <w:bookmarkStart w:id="60" w:name="_Toc510167275"/>
+            <w:bookmarkStart w:id="61" w:name="_Toc510167275"/>
             <w:r>
               <w:t>InitialSOM1NsoilMapName</w:t>
             </w:r>
-            <w:bookmarkEnd w:id="60"/>
+            <w:bookmarkEnd w:id="61"/>
           </w:p>
         </w:tc>
         <w:tc>
@@ -15355,11 +15458,11 @@
               <w:pStyle w:val="textbody"/>
               <w:ind w:left="0" w:right="156"/>
             </w:pPr>
-            <w:bookmarkStart w:id="61" w:name="_Toc510167276"/>
+            <w:bookmarkStart w:id="62" w:name="_Toc510167276"/>
             <w:r>
               <w:t>InitialSOM2CMapName</w:t>
             </w:r>
-            <w:bookmarkEnd w:id="61"/>
+            <w:bookmarkEnd w:id="62"/>
           </w:p>
         </w:tc>
         <w:tc>
@@ -15396,11 +15499,11 @@
               <w:pStyle w:val="textbody"/>
               <w:ind w:left="0" w:right="156"/>
             </w:pPr>
-            <w:bookmarkStart w:id="62" w:name="_Toc510167277"/>
+            <w:bookmarkStart w:id="63" w:name="_Toc510167277"/>
             <w:r>
               <w:t>InitialSOM2NMapName</w:t>
             </w:r>
-            <w:bookmarkEnd w:id="62"/>
+            <w:bookmarkEnd w:id="63"/>
           </w:p>
         </w:tc>
         <w:tc>
@@ -15437,11 +15540,11 @@
               <w:pStyle w:val="textbody"/>
               <w:ind w:left="0" w:right="156"/>
             </w:pPr>
-            <w:bookmarkStart w:id="63" w:name="_Toc510167278"/>
+            <w:bookmarkStart w:id="64" w:name="_Toc510167278"/>
             <w:r>
               <w:t>InitialSOM3CMapName</w:t>
             </w:r>
-            <w:bookmarkEnd w:id="63"/>
+            <w:bookmarkEnd w:id="64"/>
           </w:p>
         </w:tc>
         <w:tc>
@@ -15478,11 +15581,11 @@
               <w:pStyle w:val="textbody"/>
               <w:ind w:left="0" w:right="156"/>
             </w:pPr>
-            <w:bookmarkStart w:id="64" w:name="_Toc510167279"/>
+            <w:bookmarkStart w:id="65" w:name="_Toc510167279"/>
             <w:r>
               <w:t>InitialSOM3NMapName</w:t>
             </w:r>
-            <w:bookmarkEnd w:id="64"/>
+            <w:bookmarkEnd w:id="65"/>
           </w:p>
         </w:tc>
         <w:tc>
@@ -15519,13 +15622,13 @@
               <w:pStyle w:val="textbody"/>
               <w:ind w:left="0" w:right="156"/>
             </w:pPr>
-            <w:bookmarkStart w:id="65" w:name="_Toc510167280"/>
+            <w:bookmarkStart w:id="66" w:name="_Toc510167280"/>
             <w:proofErr w:type="spellStart"/>
             <w:r>
               <w:lastRenderedPageBreak/>
               <w:t>InitialDeadWoodSurfaceMapName</w:t>
             </w:r>
-            <w:bookmarkEnd w:id="65"/>
+            <w:bookmarkEnd w:id="66"/>
             <w:proofErr w:type="spellEnd"/>
           </w:p>
         </w:tc>
@@ -15563,7 +15666,7 @@
               <w:pStyle w:val="textbody"/>
               <w:ind w:left="0" w:right="156"/>
             </w:pPr>
-            <w:bookmarkStart w:id="66" w:name="_Toc510167281"/>
+            <w:bookmarkStart w:id="67" w:name="_Toc510167281"/>
             <w:proofErr w:type="spellStart"/>
             <w:r>
               <w:t>InitialDeadWood</w:t>
@@ -15574,7 +15677,7 @@
             <w:r>
               <w:t>MapName</w:t>
             </w:r>
-            <w:bookmarkEnd w:id="66"/>
+            <w:bookmarkEnd w:id="67"/>
             <w:proofErr w:type="spellEnd"/>
           </w:p>
         </w:tc>
@@ -15629,8 +15732,8 @@
       <w:pPr>
         <w:pStyle w:val="Heading2"/>
       </w:pPr>
-      <w:bookmarkStart w:id="67" w:name="_Toc225506487"/>
-      <w:bookmarkEnd w:id="56"/>
+      <w:bookmarkStart w:id="68" w:name="_Toc239765769"/>
+      <w:bookmarkEnd w:id="57"/>
       <w:proofErr w:type="spellStart"/>
       <w:r>
         <w:t>SlopeMapName</w:t>
@@ -15639,7 +15742,7 @@
       <w:r>
         <w:t xml:space="preserve"> (double, optional)</w:t>
       </w:r>
-      <w:bookmarkEnd w:id="67"/>
+      <w:bookmarkEnd w:id="68"/>
     </w:p>
     <w:p>
       <w:pPr>
@@ -15656,7 +15759,7 @@
       <w:pPr>
         <w:pStyle w:val="Heading2"/>
       </w:pPr>
-      <w:bookmarkStart w:id="68" w:name="_Toc225506488"/>
+      <w:bookmarkStart w:id="69" w:name="_Toc239765770"/>
       <w:proofErr w:type="spellStart"/>
       <w:r>
         <w:t>AspectMapName</w:t>
@@ -15665,7 +15768,7 @@
       <w:r>
         <w:t xml:space="preserve"> (double, optional)</w:t>
       </w:r>
-      <w:bookmarkEnd w:id="68"/>
+      <w:bookmarkEnd w:id="69"/>
     </w:p>
     <w:p>
       <w:pPr>
@@ -15682,7 +15785,7 @@
       <w:pPr>
         <w:pStyle w:val="Heading2"/>
       </w:pPr>
-      <w:bookmarkStart w:id="69" w:name="_Toc225506489"/>
+      <w:bookmarkStart w:id="70" w:name="_Toc239765771"/>
       <w:proofErr w:type="spellStart"/>
       <w:r>
         <w:t>NormalSWAMapName</w:t>
@@ -15691,7 +15794,7 @@
       <w:r>
         <w:t xml:space="preserve"> (double, optional)</w:t>
       </w:r>
-      <w:bookmarkEnd w:id="69"/>
+      <w:bookmarkEnd w:id="70"/>
     </w:p>
     <w:p>
       <w:pPr>
@@ -15723,7 +15826,7 @@
       <w:pPr>
         <w:pStyle w:val="Heading2"/>
       </w:pPr>
-      <w:bookmarkStart w:id="70" w:name="_Toc225506490"/>
+      <w:bookmarkStart w:id="71" w:name="_Toc239765772"/>
       <w:proofErr w:type="spellStart"/>
       <w:r>
         <w:t>NormalCWDMapName</w:t>
@@ -15732,7 +15835,7 @@
       <w:r>
         <w:t xml:space="preserve"> (double, optional)</w:t>
       </w:r>
-      <w:bookmarkEnd w:id="70"/>
+      <w:bookmarkEnd w:id="71"/>
     </w:p>
     <w:p>
       <w:pPr>
@@ -15763,7 +15866,7 @@
       <w:pPr>
         <w:pStyle w:val="Heading2"/>
       </w:pPr>
-      <w:bookmarkStart w:id="71" w:name="_Toc225506491"/>
+      <w:bookmarkStart w:id="72" w:name="_Toc239765773"/>
       <w:proofErr w:type="spellStart"/>
       <w:r>
         <w:t>NormalTempMapName</w:t>
@@ -15772,7 +15875,7 @@
       <w:r>
         <w:t xml:space="preserve"> (double, optional)</w:t>
       </w:r>
-      <w:bookmarkEnd w:id="71"/>
+      <w:bookmarkEnd w:id="72"/>
     </w:p>
     <w:p>
       <w:pPr>
@@ -15800,7 +15903,7 @@
       <w:pPr>
         <w:pStyle w:val="Heading2"/>
       </w:pPr>
-      <w:bookmarkStart w:id="72" w:name="_Toc225506492"/>
+      <w:bookmarkStart w:id="73" w:name="_Toc239765774"/>
       <w:proofErr w:type="spellStart"/>
       <w:r>
         <w:t>CalibrateMode</w:t>
@@ -15815,7 +15918,7 @@
       <w:r>
         <w:t>ptional)</w:t>
       </w:r>
-      <w:bookmarkEnd w:id="72"/>
+      <w:bookmarkEnd w:id="73"/>
     </w:p>
     <w:p>
       <w:pPr>
@@ -15892,7 +15995,7 @@
       <w:pPr>
         <w:pStyle w:val="Heading2"/>
       </w:pPr>
-      <w:bookmarkStart w:id="73" w:name="_Toc225506493"/>
+      <w:bookmarkStart w:id="74" w:name="_Toc239765775"/>
       <w:proofErr w:type="spellStart"/>
       <w:r>
         <w:t>SmokeModelOutputs</w:t>
@@ -15907,7 +16010,7 @@
       <w:r>
         <w:t>ptional)</w:t>
       </w:r>
-      <w:bookmarkEnd w:id="73"/>
+      <w:bookmarkEnd w:id="74"/>
     </w:p>
     <w:p>
       <w:pPr>
@@ -15924,7 +16027,7 @@
       <w:pPr>
         <w:pStyle w:val="Heading2"/>
       </w:pPr>
-      <w:bookmarkStart w:id="74" w:name="_Toc225506494"/>
+      <w:bookmarkStart w:id="75" w:name="_Toc239765776"/>
       <w:proofErr w:type="spellStart"/>
       <w:r>
         <w:lastRenderedPageBreak/>
@@ -15934,7 +16037,7 @@
       <w:r>
         <w:t xml:space="preserve"> (Boolean, optional)</w:t>
       </w:r>
-      <w:bookmarkEnd w:id="74"/>
+      <w:bookmarkEnd w:id="75"/>
     </w:p>
     <w:p>
       <w:pPr>
@@ -15956,7 +16059,7 @@
       <w:pPr>
         <w:pStyle w:val="Heading2"/>
       </w:pPr>
-      <w:bookmarkStart w:id="75" w:name="_Toc225506495"/>
+      <w:bookmarkStart w:id="76" w:name="_Toc239765777"/>
       <w:proofErr w:type="spellStart"/>
       <w:r>
         <w:t>Write_CWD_Maps</w:t>
@@ -15965,7 +16068,7 @@
       <w:r>
         <w:t xml:space="preserve"> (Boolean, optional)</w:t>
       </w:r>
-      <w:bookmarkEnd w:id="75"/>
+      <w:bookmarkEnd w:id="76"/>
     </w:p>
     <w:p>
       <w:pPr>
@@ -15987,7 +16090,7 @@
       <w:pPr>
         <w:pStyle w:val="Heading2"/>
       </w:pPr>
-      <w:bookmarkStart w:id="76" w:name="_Toc225506496"/>
+      <w:bookmarkStart w:id="77" w:name="_Toc239765778"/>
       <w:proofErr w:type="spellStart"/>
       <w:r>
         <w:t>Write_Temperature_Maps</w:t>
@@ -15996,7 +16099,7 @@
       <w:r>
         <w:t xml:space="preserve"> (Boolean, optional)</w:t>
       </w:r>
-      <w:bookmarkEnd w:id="76"/>
+      <w:bookmarkEnd w:id="77"/>
     </w:p>
     <w:p>
       <w:pPr>
@@ -16024,7 +16127,7 @@
       <w:pPr>
         <w:pStyle w:val="Heading2"/>
       </w:pPr>
-      <w:bookmarkStart w:id="77" w:name="_Toc225506497"/>
+      <w:bookmarkStart w:id="78" w:name="_Toc239765779"/>
       <w:proofErr w:type="spellStart"/>
       <w:r>
         <w:t>Write_Species_Drought_Maps</w:t>
@@ -16033,7 +16136,7 @@
       <w:r>
         <w:t xml:space="preserve"> (Boolean, optional)</w:t>
       </w:r>
-      <w:bookmarkEnd w:id="77"/>
+      <w:bookmarkEnd w:id="78"/>
     </w:p>
     <w:p>
       <w:pPr>
@@ -16047,12 +16150,12 @@
       <w:pPr>
         <w:pStyle w:val="Heading2"/>
       </w:pPr>
-      <w:bookmarkStart w:id="78" w:name="_Toc225506498"/>
+      <w:bookmarkStart w:id="79" w:name="_Toc239765780"/>
       <w:proofErr w:type="spellStart"/>
       <w:r>
         <w:t>WaterDecayFunction</w:t>
       </w:r>
-      <w:bookmarkEnd w:id="78"/>
+      <w:bookmarkEnd w:id="79"/>
       <w:proofErr w:type="spellEnd"/>
     </w:p>
     <w:p>
@@ -16130,7 +16233,7 @@
       <w:pPr>
         <w:pStyle w:val="Heading2"/>
       </w:pPr>
-      <w:bookmarkStart w:id="79" w:name="_Toc225506499"/>
+      <w:bookmarkStart w:id="80" w:name="_Toc239765781"/>
       <w:proofErr w:type="spellStart"/>
       <w:r>
         <w:t>ProbabilityEstablishAdjust</w:t>
@@ -16139,7 +16242,7 @@
       <w:r>
         <w:t xml:space="preserve"> (double)</w:t>
       </w:r>
-      <w:bookmarkEnd w:id="79"/>
+      <w:bookmarkEnd w:id="80"/>
       <w:r>
         <w:t xml:space="preserve"> </w:t>
       </w:r>
@@ -16225,24 +16328,22 @@
       <w:pPr>
         <w:pStyle w:val="Heading2"/>
       </w:pPr>
-      <w:bookmarkStart w:id="80" w:name="_Toc387238314"/>
-      <w:bookmarkStart w:id="81" w:name="_Toc387238315"/>
-      <w:bookmarkStart w:id="82" w:name="_Toc387238316"/>
-      <w:bookmarkStart w:id="83" w:name="_Toc225506500"/>
-      <w:bookmarkEnd w:id="80"/>
+      <w:bookmarkStart w:id="81" w:name="_Toc387238314"/>
+      <w:bookmarkStart w:id="82" w:name="_Toc387238315"/>
+      <w:bookmarkStart w:id="83" w:name="_Toc387238316"/>
+      <w:bookmarkStart w:id="84" w:name="_Toc239765782"/>
       <w:bookmarkEnd w:id="81"/>
       <w:bookmarkEnd w:id="82"/>
+      <w:bookmarkEnd w:id="83"/>
       <w:proofErr w:type="spellStart"/>
-      <w:proofErr w:type="gramStart"/>
       <w:r>
         <w:t>InitialMineralN</w:t>
       </w:r>
       <w:proofErr w:type="spellEnd"/>
-      <w:proofErr w:type="gramEnd"/>
       <w:r>
         <w:t xml:space="preserve"> (double)</w:t>
       </w:r>
-      <w:bookmarkEnd w:id="83"/>
+      <w:bookmarkEnd w:id="84"/>
     </w:p>
     <w:p>
       <w:pPr>
@@ -16265,7 +16366,7 @@
       <w:pPr>
         <w:pStyle w:val="Heading2"/>
       </w:pPr>
-      <w:bookmarkStart w:id="84" w:name="_Toc225506501"/>
+      <w:bookmarkStart w:id="85" w:name="_Toc239765783"/>
       <w:proofErr w:type="spellStart"/>
       <w:r>
         <w:lastRenderedPageBreak/>
@@ -16275,7 +16376,7 @@
       <w:r>
         <w:t xml:space="preserve"> (double)</w:t>
       </w:r>
-      <w:bookmarkEnd w:id="84"/>
+      <w:bookmarkEnd w:id="85"/>
     </w:p>
     <w:p>
       <w:pPr>
@@ -16315,8 +16416,8 @@
         </w:tabs>
         <w:ind w:left="900" w:hanging="900"/>
       </w:pPr>
-      <w:bookmarkStart w:id="85" w:name="_Toc510167286"/>
-      <w:bookmarkStart w:id="86" w:name="_Toc225506502"/>
+      <w:bookmarkStart w:id="86" w:name="_Toc510167286"/>
+      <w:bookmarkStart w:id="87" w:name="_Toc239765784"/>
       <w:r>
         <w:t>Nitrogen Inputs:</w:t>
       </w:r>
@@ -16344,8 +16445,8 @@
       <w:r>
         <w:t>Intercept</w:t>
       </w:r>
-      <w:bookmarkEnd w:id="85"/>
       <w:bookmarkEnd w:id="86"/>
+      <w:bookmarkEnd w:id="87"/>
       <w:proofErr w:type="spellEnd"/>
     </w:p>
     <w:p>
@@ -16443,14 +16544,14 @@
       <w:pPr>
         <w:pStyle w:val="Heading2"/>
       </w:pPr>
-      <w:bookmarkStart w:id="87" w:name="_Toc225506503"/>
+      <w:bookmarkStart w:id="88" w:name="_Toc239765785"/>
       <w:r>
         <w:t>Latitude</w:t>
       </w:r>
       <w:r>
         <w:t xml:space="preserve"> (double)</w:t>
       </w:r>
-      <w:bookmarkEnd w:id="87"/>
+      <w:bookmarkEnd w:id="88"/>
     </w:p>
     <w:p>
       <w:pPr>
@@ -16464,7 +16565,7 @@
       <w:pPr>
         <w:pStyle w:val="Heading2"/>
       </w:pPr>
-      <w:bookmarkStart w:id="88" w:name="_Toc225506504"/>
+      <w:bookmarkStart w:id="89" w:name="_Toc239765786"/>
       <w:proofErr w:type="spellStart"/>
       <w:r>
         <w:t>Denitrification</w:t>
@@ -16476,7 +16577,7 @@
       <w:r>
         <w:t xml:space="preserve"> (double)</w:t>
       </w:r>
-      <w:bookmarkEnd w:id="88"/>
+      <w:bookmarkEnd w:id="89"/>
     </w:p>
     <w:p>
       <w:pPr>
@@ -16562,7 +16663,7 @@
       <w:pPr>
         <w:pStyle w:val="Heading2"/>
       </w:pPr>
-      <w:bookmarkStart w:id="89" w:name="_Toc225506505"/>
+      <w:bookmarkStart w:id="90" w:name="_Toc239765787"/>
       <w:r>
         <w:t>Decay Rate</w:t>
       </w:r>
@@ -16590,7 +16691,7 @@
       <w:r>
         <w:t xml:space="preserve"> (double)</w:t>
       </w:r>
-      <w:bookmarkEnd w:id="89"/>
+      <w:bookmarkEnd w:id="90"/>
     </w:p>
     <w:p>
       <w:pPr>
@@ -16722,8 +16823,8 @@
       <w:pPr>
         <w:pStyle w:val="Heading2"/>
       </w:pPr>
-      <w:bookmarkStart w:id="90" w:name="_Ref69910657"/>
-      <w:bookmarkStart w:id="91" w:name="_Toc225506506"/>
+      <w:bookmarkStart w:id="91" w:name="_Ref69910657"/>
+      <w:bookmarkStart w:id="92" w:name="_Toc239765788"/>
       <w:proofErr w:type="spellStart"/>
       <w:r>
         <w:lastRenderedPageBreak/>
@@ -16739,8 +16840,8 @@
       <w:r>
         <w:t>ptional)</w:t>
       </w:r>
-      <w:bookmarkEnd w:id="90"/>
       <w:bookmarkEnd w:id="91"/>
+      <w:bookmarkEnd w:id="92"/>
     </w:p>
     <w:p>
       <w:pPr>
@@ -17032,11 +17133,11 @@
       <w:pPr>
         <w:pStyle w:val="Heading2"/>
       </w:pPr>
-      <w:bookmarkStart w:id="92" w:name="_Toc225506507"/>
+      <w:bookmarkStart w:id="93" w:name="_Toc239765789"/>
       <w:r>
         <w:t>Optional Maps</w:t>
       </w:r>
-      <w:bookmarkEnd w:id="92"/>
+      <w:bookmarkEnd w:id="93"/>
     </w:p>
     <w:p>
       <w:pPr>
@@ -17433,7 +17534,7 @@
       <w:pPr>
         <w:pStyle w:val="Heading2"/>
       </w:pPr>
-      <w:bookmarkStart w:id="93" w:name="_Toc225506508"/>
+      <w:bookmarkStart w:id="94" w:name="_Toc239765790"/>
       <w:proofErr w:type="spellStart"/>
       <w:r>
         <w:lastRenderedPageBreak/>
@@ -17458,7 +17559,7 @@
       <w:r>
         <w:t>)</w:t>
       </w:r>
-      <w:bookmarkEnd w:id="93"/>
+      <w:bookmarkEnd w:id="94"/>
     </w:p>
     <w:p>
       <w:pPr>
@@ -17508,14 +17609,14 @@
       <w:pPr>
         <w:pStyle w:val="Heading2"/>
       </w:pPr>
-      <w:bookmarkStart w:id="94" w:name="_Toc225506509"/>
+      <w:bookmarkStart w:id="95" w:name="_Toc239765791"/>
       <w:r>
         <w:t>Variable overrides</w:t>
       </w:r>
       <w:r>
         <w:t xml:space="preserve"> (double, optional)</w:t>
       </w:r>
-      <w:bookmarkEnd w:id="94"/>
+      <w:bookmarkEnd w:id="95"/>
     </w:p>
     <w:p>
       <w:pPr>
@@ -17572,13 +17673,13 @@
       <w:pPr>
         <w:pStyle w:val="Heading2"/>
       </w:pPr>
-      <w:bookmarkStart w:id="95" w:name="_Toc107735769"/>
-      <w:bookmarkStart w:id="96" w:name="_Toc112490873"/>
-      <w:bookmarkStart w:id="97" w:name="_Ref140207562"/>
-      <w:bookmarkStart w:id="98" w:name="_Toc225506510"/>
-      <w:bookmarkEnd w:id="45"/>
+      <w:bookmarkStart w:id="96" w:name="_Toc107735769"/>
+      <w:bookmarkStart w:id="97" w:name="_Toc112490873"/>
+      <w:bookmarkStart w:id="98" w:name="_Ref140207562"/>
+      <w:bookmarkStart w:id="99" w:name="_Toc239765792"/>
       <w:bookmarkEnd w:id="46"/>
       <w:bookmarkEnd w:id="47"/>
+      <w:bookmarkEnd w:id="48"/>
       <w:proofErr w:type="spellStart"/>
       <w:r>
         <w:t>Species</w:t>
@@ -17586,17 +17687,17 @@
       <w:r>
         <w:t>Parameters</w:t>
       </w:r>
-      <w:bookmarkEnd w:id="95"/>
+      <w:bookmarkEnd w:id="96"/>
       <w:proofErr w:type="spellEnd"/>
       <w:r>
         <w:t xml:space="preserve"> </w:t>
       </w:r>
-      <w:bookmarkEnd w:id="96"/>
       <w:bookmarkEnd w:id="97"/>
+      <w:bookmarkEnd w:id="98"/>
       <w:r>
         <w:t>(CSV file name)</w:t>
       </w:r>
-      <w:bookmarkEnd w:id="98"/>
+      <w:bookmarkEnd w:id="99"/>
     </w:p>
     <w:p>
       <w:pPr>
@@ -17619,7 +17720,7 @@
       <w:pPr>
         <w:pStyle w:val="textbody"/>
       </w:pPr>
-      <w:bookmarkStart w:id="99" w:name="_Toc112490874"/>
+      <w:bookmarkStart w:id="100" w:name="_Toc112490874"/>
       <w:r>
         <w:rPr>
           <w:b/>
@@ -17866,15 +17967,7 @@
               <w:t xml:space="preserve">, depending on whether the species can fix N.  </w:t>
             </w:r>
             <w:r>
-              <w:t xml:space="preserve">An N fixing tree or shrub is never N </w:t>
-            </w:r>
-            <w:proofErr w:type="gramStart"/>
-            <w:r>
-              <w:t>limited</w:t>
-            </w:r>
-            <w:proofErr w:type="gramEnd"/>
-            <w:r>
-              <w:t xml:space="preserve"> and its N components fertilize following mortality.</w:t>
+              <w:t>An N fixing tree or shrub is never N limited and its N components fertilize following mortality.</w:t>
             </w:r>
             <w:r>
               <w:t xml:space="preserve">  Must be TRUE or FALSE.</w:t>
@@ -18111,15 +18204,7 @@
               <w:ind w:left="0" w:right="78"/>
             </w:pPr>
             <w:r>
-              <w:t xml:space="preserve">If available water falls below zero for a </w:t>
-            </w:r>
-            <w:proofErr w:type="gramStart"/>
-            <w:r>
-              <w:t>percent</w:t>
-            </w:r>
-            <w:proofErr w:type="gramEnd"/>
-            <w:r>
-              <w:t xml:space="preserve"> of the growing season greater than this value, a species cannot establish.  Units:  </w:t>
+              <w:t xml:space="preserve">If available water falls below zero for a percent of the growing season greater than this value, a species cannot establish.  Units:  </w:t>
             </w:r>
             <w:r>
               <w:t xml:space="preserve">fraction of the growing season (0.0 – 1.0). </w:t>
@@ -18159,12 +18244,12 @@
               <w:pStyle w:val="textbody"/>
               <w:ind w:left="0" w:right="156"/>
             </w:pPr>
-            <w:bookmarkStart w:id="100" w:name="_Toc112490875"/>
+            <w:bookmarkStart w:id="101" w:name="_Toc112490875"/>
             <w:proofErr w:type="spellStart"/>
             <w:r>
               <w:t>LeafLongevity</w:t>
             </w:r>
-            <w:bookmarkEnd w:id="100"/>
+            <w:bookmarkEnd w:id="101"/>
             <w:proofErr w:type="spellEnd"/>
           </w:p>
         </w:tc>
@@ -19043,15 +19128,7 @@
               <w:ind w:left="0" w:right="78"/>
             </w:pPr>
             <w:r>
-              <w:t xml:space="preserve">Determines whether the species is </w:t>
-            </w:r>
-            <w:proofErr w:type="gramStart"/>
-            <w:r>
-              <w:t>grass</w:t>
-            </w:r>
-            <w:proofErr w:type="gramEnd"/>
-            <w:r>
-              <w:t xml:space="preserve"> species or not. If users include grass species in their simulation, there will be competition between grasses and trees (see Introduction).</w:t>
+              <w:t>Determines whether the species is grass species or not. If users include grass species in their simulation, there will be competition between grasses and trees (see Introduction).</w:t>
             </w:r>
             <w:r>
               <w:rPr>
@@ -20093,15 +20170,7 @@
               <w:t xml:space="preserve">(B) </w:t>
             </w:r>
             <w:r>
-              <w:t xml:space="preserve">Determines the </w:t>
-            </w:r>
-            <w:proofErr w:type="gramStart"/>
-            <w:r>
-              <w:t>intercept</w:t>
-            </w:r>
-            <w:proofErr w:type="gramEnd"/>
-            <w:r>
-              <w:t xml:space="preserve"> of the effect of water content on growth.  </w:t>
+              <w:t xml:space="preserve">Determines the intercept of the effect of water content on growth.  </w:t>
             </w:r>
           </w:p>
         </w:tc>
@@ -21107,10 +21176,10 @@
       <w:pPr>
         <w:pStyle w:val="Heading2"/>
       </w:pPr>
-      <w:bookmarkStart w:id="101" w:name="_Toc112490878"/>
-      <w:bookmarkStart w:id="102" w:name="_Toc107735770"/>
-      <w:bookmarkStart w:id="103" w:name="_Toc225506511"/>
-      <w:bookmarkEnd w:id="99"/>
+      <w:bookmarkStart w:id="102" w:name="_Toc112490878"/>
+      <w:bookmarkStart w:id="103" w:name="_Toc107735770"/>
+      <w:bookmarkStart w:id="104" w:name="_Toc239765793"/>
+      <w:bookmarkEnd w:id="100"/>
       <w:proofErr w:type="spellStart"/>
       <w:r>
         <w:t>DroughtMortalityParameters</w:t>
@@ -21125,7 +21194,7 @@
       <w:r>
         <w:t>)</w:t>
       </w:r>
-      <w:bookmarkEnd w:id="103"/>
+      <w:bookmarkEnd w:id="104"/>
     </w:p>
     <w:p>
       <w:pPr>
@@ -22675,11 +22744,11 @@
       <w:pPr>
         <w:pStyle w:val="Heading2"/>
       </w:pPr>
-      <w:bookmarkStart w:id="104" w:name="_Toc225506512"/>
+      <w:bookmarkStart w:id="105" w:name="_Toc239765794"/>
       <w:r>
         <w:t>Fire Reduction Parameters</w:t>
       </w:r>
-      <w:bookmarkEnd w:id="104"/>
+      <w:bookmarkEnd w:id="105"/>
     </w:p>
     <w:p>
       <w:pPr>
@@ -22742,14 +22811,14 @@
       <w:pPr>
         <w:pStyle w:val="Heading3"/>
       </w:pPr>
-      <w:bookmarkStart w:id="105" w:name="_Toc225506513"/>
+      <w:bookmarkStart w:id="106" w:name="_Toc239765795"/>
       <w:r>
         <w:t>Fire Severity</w:t>
       </w:r>
       <w:r>
         <w:t xml:space="preserve"> (integer)</w:t>
       </w:r>
-      <w:bookmarkEnd w:id="105"/>
+      <w:bookmarkEnd w:id="106"/>
     </w:p>
     <w:p>
       <w:pPr>
@@ -22800,7 +22869,7 @@
       <w:pPr>
         <w:pStyle w:val="Heading3"/>
       </w:pPr>
-      <w:bookmarkStart w:id="106" w:name="_Toc225506514"/>
+      <w:bookmarkStart w:id="107" w:name="_Toc239765796"/>
       <w:r>
         <w:t xml:space="preserve">Coarse Debris </w:t>
       </w:r>
@@ -22810,7 +22879,7 @@
       <w:r>
         <w:t xml:space="preserve"> (double)</w:t>
       </w:r>
-      <w:bookmarkEnd w:id="106"/>
+      <w:bookmarkEnd w:id="107"/>
     </w:p>
     <w:p>
       <w:pPr>
@@ -22824,7 +22893,7 @@
       <w:pPr>
         <w:pStyle w:val="Heading3"/>
       </w:pPr>
-      <w:bookmarkStart w:id="107" w:name="_Toc225506515"/>
+      <w:bookmarkStart w:id="108" w:name="_Toc239765797"/>
       <w:r>
         <w:t xml:space="preserve">Fine </w:t>
       </w:r>
@@ -22834,7 +22903,7 @@
       <w:r>
         <w:t xml:space="preserve"> (double)</w:t>
       </w:r>
-      <w:bookmarkEnd w:id="107"/>
+      <w:bookmarkEnd w:id="108"/>
     </w:p>
     <w:p>
       <w:pPr>
@@ -22848,14 +22917,14 @@
       <w:pPr>
         <w:pStyle w:val="Heading3"/>
       </w:pPr>
-      <w:bookmarkStart w:id="108" w:name="_Toc225506516"/>
+      <w:bookmarkStart w:id="109" w:name="_Toc239765798"/>
       <w:r>
         <w:t>Cohort Wood Reduction</w:t>
       </w:r>
       <w:r>
         <w:t xml:space="preserve"> (double)</w:t>
       </w:r>
-      <w:bookmarkEnd w:id="108"/>
+      <w:bookmarkEnd w:id="109"/>
     </w:p>
     <w:p>
       <w:pPr>
@@ -22869,14 +22938,14 @@
       <w:pPr>
         <w:pStyle w:val="Heading3"/>
       </w:pPr>
-      <w:bookmarkStart w:id="109" w:name="_Toc225506517"/>
+      <w:bookmarkStart w:id="110" w:name="_Toc239765799"/>
       <w:r>
         <w:t>Cohort Leaf Reduction</w:t>
       </w:r>
       <w:r>
         <w:t xml:space="preserve"> (double)</w:t>
       </w:r>
-      <w:bookmarkEnd w:id="109"/>
+      <w:bookmarkEnd w:id="110"/>
     </w:p>
     <w:p>
       <w:pPr>
@@ -22890,7 +22959,7 @@
       <w:pPr>
         <w:pStyle w:val="Heading3"/>
       </w:pPr>
-      <w:bookmarkStart w:id="110" w:name="_Toc225506518"/>
+      <w:bookmarkStart w:id="111" w:name="_Toc239765800"/>
       <w:r>
         <w:t xml:space="preserve">Soil </w:t>
       </w:r>
@@ -22906,7 +22975,7 @@
       <w:r>
         <w:t xml:space="preserve"> (double)</w:t>
       </w:r>
-      <w:bookmarkEnd w:id="110"/>
+      <w:bookmarkEnd w:id="111"/>
     </w:p>
     <w:p>
       <w:pPr>
@@ -22920,11 +22989,11 @@
       <w:pPr>
         <w:pStyle w:val="Heading2"/>
       </w:pPr>
-      <w:bookmarkStart w:id="111" w:name="_Toc225506519"/>
+      <w:bookmarkStart w:id="112" w:name="_Toc239765801"/>
       <w:r>
         <w:t>Harvest Reduction Parameters</w:t>
       </w:r>
-      <w:bookmarkEnd w:id="111"/>
+      <w:bookmarkEnd w:id="112"/>
     </w:p>
     <w:p>
       <w:pPr>
@@ -23001,11 +23070,11 @@
       <w:pPr>
         <w:pStyle w:val="Heading3"/>
       </w:pPr>
-      <w:bookmarkStart w:id="112" w:name="_Toc225506520"/>
+      <w:bookmarkStart w:id="113" w:name="_Toc239765802"/>
       <w:r>
         <w:t>Prescription Name</w:t>
       </w:r>
-      <w:bookmarkEnd w:id="112"/>
+      <w:bookmarkEnd w:id="113"/>
     </w:p>
     <w:p>
       <w:pPr>
@@ -23053,7 +23122,7 @@
       <w:pPr>
         <w:pStyle w:val="Heading3"/>
       </w:pPr>
-      <w:bookmarkStart w:id="113" w:name="_Toc225506521"/>
+      <w:bookmarkStart w:id="114" w:name="_Toc239765803"/>
       <w:r>
         <w:t xml:space="preserve">Dead </w:t>
       </w:r>
@@ -23063,7 +23132,7 @@
       <w:r>
         <w:t xml:space="preserve"> (double)</w:t>
       </w:r>
-      <w:bookmarkEnd w:id="113"/>
+      <w:bookmarkEnd w:id="114"/>
     </w:p>
     <w:p>
       <w:pPr>
@@ -23104,7 +23173,7 @@
       <w:pPr>
         <w:pStyle w:val="Heading3"/>
       </w:pPr>
-      <w:bookmarkStart w:id="114" w:name="_Toc225506522"/>
+      <w:bookmarkStart w:id="115" w:name="_Toc239765804"/>
       <w:r>
         <w:t xml:space="preserve">Dead </w:t>
       </w:r>
@@ -23114,7 +23183,7 @@
       <w:r>
         <w:t xml:space="preserve"> (double)</w:t>
       </w:r>
-      <w:bookmarkEnd w:id="114"/>
+      <w:bookmarkEnd w:id="115"/>
     </w:p>
     <w:p>
       <w:pPr>
@@ -23155,14 +23224,14 @@
       <w:pPr>
         <w:pStyle w:val="Heading3"/>
       </w:pPr>
-      <w:bookmarkStart w:id="115" w:name="_Toc225506523"/>
+      <w:bookmarkStart w:id="116" w:name="_Toc239765805"/>
       <w:r>
         <w:t>Cohort Wood Removal</w:t>
       </w:r>
       <w:r>
         <w:t xml:space="preserve"> (double)</w:t>
       </w:r>
-      <w:bookmarkEnd w:id="115"/>
+      <w:bookmarkEnd w:id="116"/>
     </w:p>
     <w:p>
       <w:pPr>
@@ -23212,14 +23281,14 @@
       <w:pPr>
         <w:pStyle w:val="Heading3"/>
       </w:pPr>
-      <w:bookmarkStart w:id="116" w:name="_Toc225506524"/>
+      <w:bookmarkStart w:id="117" w:name="_Toc239765806"/>
       <w:r>
         <w:t xml:space="preserve">Cohort Leaf Removal </w:t>
       </w:r>
       <w:r>
         <w:t>(double)</w:t>
       </w:r>
-      <w:bookmarkEnd w:id="116"/>
+      <w:bookmarkEnd w:id="117"/>
     </w:p>
     <w:p>
       <w:pPr>
@@ -23269,18 +23338,18 @@
       <w:pPr>
         <w:pStyle w:val="Heading1"/>
       </w:pPr>
-      <w:bookmarkStart w:id="117" w:name="_Ref109371329"/>
-      <w:bookmarkStart w:id="118" w:name="_Toc133339122"/>
-      <w:bookmarkStart w:id="119" w:name="_Toc282434158"/>
-      <w:bookmarkStart w:id="120" w:name="_Ref140059391"/>
-      <w:bookmarkStart w:id="121" w:name="_Toc225506525"/>
-      <w:bookmarkEnd w:id="101"/>
+      <w:bookmarkStart w:id="118" w:name="_Ref109371329"/>
+      <w:bookmarkStart w:id="119" w:name="_Toc133339122"/>
+      <w:bookmarkStart w:id="120" w:name="_Toc282434158"/>
+      <w:bookmarkStart w:id="121" w:name="_Ref140059391"/>
+      <w:bookmarkStart w:id="122" w:name="_Toc239765807"/>
       <w:bookmarkEnd w:id="102"/>
+      <w:bookmarkEnd w:id="103"/>
       <w:r>
         <w:lastRenderedPageBreak/>
         <w:t>Output Files</w:t>
       </w:r>
-      <w:bookmarkEnd w:id="121"/>
+      <w:bookmarkEnd w:id="122"/>
     </w:p>
     <w:p>
       <w:pPr>
@@ -23424,11 +23493,11 @@
       <w:pPr>
         <w:pStyle w:val="Heading2"/>
       </w:pPr>
-      <w:bookmarkStart w:id="122" w:name="_Toc225506526"/>
+      <w:bookmarkStart w:id="123" w:name="_Toc239765808"/>
       <w:r>
         <w:t>Output Metadata</w:t>
       </w:r>
-      <w:bookmarkEnd w:id="122"/>
+      <w:bookmarkEnd w:id="123"/>
       <w:r>
         <w:t xml:space="preserve">  </w:t>
       </w:r>
@@ -23502,14 +23571,14 @@
       <w:pPr>
         <w:pStyle w:val="Heading2"/>
       </w:pPr>
-      <w:bookmarkStart w:id="123" w:name="_Toc225506527"/>
+      <w:bookmarkStart w:id="124" w:name="_Toc239765809"/>
       <w:r>
         <w:t>NECN</w:t>
       </w:r>
       <w:r>
         <w:t>-succession-log</w:t>
       </w:r>
-      <w:bookmarkEnd w:id="123"/>
+      <w:bookmarkEnd w:id="124"/>
       <w:r>
         <w:t xml:space="preserve">  </w:t>
       </w:r>
@@ -23540,11 +23609,11 @@
       <w:pPr>
         <w:pStyle w:val="Heading2"/>
       </w:pPr>
-      <w:bookmarkStart w:id="124" w:name="_Toc225506528"/>
+      <w:bookmarkStart w:id="125" w:name="_Toc239765810"/>
       <w:r>
         <w:t>NECN-succession-log-short</w:t>
       </w:r>
-      <w:bookmarkEnd w:id="124"/>
+      <w:bookmarkEnd w:id="125"/>
       <w:r>
         <w:t xml:space="preserve">  </w:t>
       </w:r>
@@ -23561,11 +23630,11 @@
       <w:pPr>
         <w:pStyle w:val="Heading2"/>
       </w:pPr>
-      <w:bookmarkStart w:id="125" w:name="_Toc225506529"/>
+      <w:bookmarkStart w:id="126" w:name="_Toc239765811"/>
       <w:r>
         <w:t>NECN-succession-monthly-log</w:t>
       </w:r>
-      <w:bookmarkEnd w:id="125"/>
+      <w:bookmarkEnd w:id="126"/>
       <w:r>
         <w:t xml:space="preserve">  </w:t>
       </w:r>
@@ -23610,12 +23679,12 @@
       <w:pPr>
         <w:pStyle w:val="Heading2"/>
       </w:pPr>
-      <w:bookmarkStart w:id="126" w:name="_Toc225506530"/>
+      <w:bookmarkStart w:id="127" w:name="_Toc239765812"/>
       <w:r>
         <w:lastRenderedPageBreak/>
         <w:t>NECN-prob-establish-log</w:t>
       </w:r>
-      <w:bookmarkEnd w:id="126"/>
+      <w:bookmarkEnd w:id="127"/>
       <w:r>
         <w:t xml:space="preserve">  </w:t>
       </w:r>
@@ -23761,11 +23830,11 @@
       <w:pPr>
         <w:pStyle w:val="Heading2"/>
       </w:pPr>
-      <w:bookmarkStart w:id="127" w:name="_Toc225506531"/>
+      <w:bookmarkStart w:id="128" w:name="_Toc239765813"/>
       <w:r>
         <w:t>NECN-reproduction-log</w:t>
       </w:r>
-      <w:bookmarkEnd w:id="127"/>
+      <w:bookmarkEnd w:id="128"/>
       <w:r>
         <w:t xml:space="preserve">  </w:t>
       </w:r>
@@ -23782,11 +23851,11 @@
       <w:pPr>
         <w:pStyle w:val="Heading2"/>
       </w:pPr>
-      <w:bookmarkStart w:id="128" w:name="_Toc225506532"/>
+      <w:bookmarkStart w:id="129" w:name="_Toc239765814"/>
       <w:r>
         <w:t>NECN-calibrate-log (Optional)</w:t>
       </w:r>
-      <w:bookmarkEnd w:id="128"/>
+      <w:bookmarkEnd w:id="129"/>
     </w:p>
     <w:p>
       <w:pPr>
@@ -23854,11 +23923,11 @@
       <w:pPr>
         <w:pStyle w:val="Heading2"/>
       </w:pPr>
-      <w:bookmarkStart w:id="129" w:name="_Toc225506533"/>
+      <w:bookmarkStart w:id="130" w:name="_Toc239765815"/>
       <w:r>
         <w:t>Drought mortality maps and tabular data</w:t>
       </w:r>
-      <w:bookmarkEnd w:id="129"/>
+      <w:bookmarkEnd w:id="130"/>
     </w:p>
     <w:p>
       <w:pPr>
@@ -23872,18 +23941,18 @@
       <w:pPr>
         <w:pStyle w:val="Heading1"/>
       </w:pPr>
-      <w:bookmarkStart w:id="130" w:name="_Toc225506534"/>
+      <w:bookmarkStart w:id="131" w:name="_Toc239765816"/>
       <w:r>
         <w:lastRenderedPageBreak/>
         <w:t>Initial Communities</w:t>
       </w:r>
-      <w:bookmarkEnd w:id="130"/>
+      <w:bookmarkEnd w:id="131"/>
     </w:p>
     <w:p>
       <w:pPr>
         <w:pStyle w:val="Heading2"/>
       </w:pPr>
-      <w:bookmarkStart w:id="131" w:name="_Toc225506535"/>
+      <w:bookmarkStart w:id="132" w:name="_Toc239765817"/>
       <w:r>
         <w:t>Initial</w:t>
       </w:r>
@@ -23899,7 +23968,7 @@
       <w:r>
         <w:t>Map</w:t>
       </w:r>
-      <w:bookmarkEnd w:id="131"/>
+      <w:bookmarkEnd w:id="132"/>
     </w:p>
     <w:p>
       <w:pPr>
@@ -23939,7 +24008,7 @@
       <w:pPr>
         <w:pStyle w:val="Heading2"/>
       </w:pPr>
-      <w:bookmarkStart w:id="132" w:name="_Toc225506536"/>
+      <w:bookmarkStart w:id="133" w:name="_Toc239765818"/>
       <w:r>
         <w:t xml:space="preserve">Initial Communities Input </w:t>
       </w:r>
@@ -23949,10 +24018,10 @@
       <w:r>
         <w:t>File</w:t>
       </w:r>
-      <w:bookmarkEnd w:id="117"/>
       <w:bookmarkEnd w:id="118"/>
       <w:bookmarkEnd w:id="119"/>
-      <w:bookmarkEnd w:id="132"/>
+      <w:bookmarkEnd w:id="120"/>
+      <w:bookmarkEnd w:id="133"/>
     </w:p>
     <w:p>
       <w:pPr>
@@ -24068,14 +24137,14 @@
       <w:pPr>
         <w:pStyle w:val="Heading3"/>
       </w:pPr>
-      <w:bookmarkStart w:id="133" w:name="_Toc133339126"/>
-      <w:bookmarkStart w:id="134" w:name="_Toc282434162"/>
-      <w:bookmarkStart w:id="135" w:name="_Toc225506537"/>
+      <w:bookmarkStart w:id="134" w:name="_Toc133339126"/>
+      <w:bookmarkStart w:id="135" w:name="_Toc282434162"/>
+      <w:bookmarkStart w:id="136" w:name="_Toc239765819"/>
       <w:proofErr w:type="spellStart"/>
       <w:r>
         <w:t>FileName</w:t>
       </w:r>
-      <w:bookmarkEnd w:id="135"/>
+      <w:bookmarkEnd w:id="136"/>
       <w:proofErr w:type="spellEnd"/>
       <w:r>
         <w:t xml:space="preserve"> </w:t>
@@ -24093,14 +24162,14 @@
       <w:pPr>
         <w:pStyle w:val="Heading3"/>
       </w:pPr>
-      <w:bookmarkStart w:id="136" w:name="_Toc225506538"/>
+      <w:bookmarkStart w:id="137" w:name="_Toc239765820"/>
       <w:r>
         <w:t xml:space="preserve">CSV </w:t>
       </w:r>
       <w:r>
         <w:t>file format</w:t>
       </w:r>
-      <w:bookmarkEnd w:id="136"/>
+      <w:bookmarkEnd w:id="137"/>
     </w:p>
     <w:p>
       <w:pPr>
@@ -24402,11 +24471,11 @@
       <w:pPr>
         <w:pStyle w:val="Heading3"/>
       </w:pPr>
-      <w:bookmarkStart w:id="137" w:name="_Toc225506539"/>
+      <w:bookmarkStart w:id="138" w:name="_Toc239765821"/>
       <w:r>
         <w:t>Unvegetated (aka empty) Map Codes</w:t>
       </w:r>
-      <w:bookmarkEnd w:id="137"/>
+      <w:bookmarkEnd w:id="138"/>
     </w:p>
     <w:p>
       <w:pPr>
@@ -24489,17 +24558,17 @@
       <w:pPr>
         <w:pStyle w:val="Heading3"/>
       </w:pPr>
-      <w:bookmarkStart w:id="138" w:name="_Toc133339128"/>
-      <w:bookmarkStart w:id="139" w:name="_Toc282434164"/>
-      <w:bookmarkStart w:id="140" w:name="_Toc225506540"/>
-      <w:bookmarkEnd w:id="133"/>
+      <w:bookmarkStart w:id="139" w:name="_Toc133339128"/>
+      <w:bookmarkStart w:id="140" w:name="_Toc282434164"/>
+      <w:bookmarkStart w:id="141" w:name="_Toc239765822"/>
       <w:bookmarkEnd w:id="134"/>
+      <w:bookmarkEnd w:id="135"/>
       <w:r>
         <w:t>Grouping Species Ages into Cohorts</w:t>
       </w:r>
-      <w:bookmarkEnd w:id="138"/>
       <w:bookmarkEnd w:id="139"/>
       <w:bookmarkEnd w:id="140"/>
+      <w:bookmarkEnd w:id="141"/>
     </w:p>
     <w:p>
       <w:pPr>
@@ -24655,7 +24724,7 @@
       <w:r>
         <w:t>40  200</w:t>
       </w:r>
-      <w:bookmarkEnd w:id="120"/>
+      <w:bookmarkEnd w:id="121"/>
       <w:proofErr w:type="gramEnd"/>
     </w:p>
     <w:sectPr>
@@ -24672,7 +24741,7 @@
 </file>
 
 <file path=word/endnotes.xml><?xml version="1.0" encoding="utf-8"?>
-<w:endnotes xmlns:wpc="http://schemas.microsoft.com/office/word/2010/wordprocessingCanvas" xmlns:cx="http://schemas.microsoft.com/office/drawing/2014/chartex" xmlns:cx1="http://schemas.microsoft.com/office/drawing/2015/9/8/chartex" xmlns:cx2="http://schemas.microsoft.com/office/drawing/2015/10/21/chartex" xmlns:cx3="http://schemas.microsoft.com/office/drawing/2016/5/9/chartex" xmlns:cx4="http://schemas.microsoft.com/office/drawing/2016/5/10/chartex" xmlns:cx5="http://schemas.microsoft.com/office/drawing/2016/5/11/chartex" xmlns:cx6="http://schemas.microsoft.com/office/drawing/2016/5/12/chartex" xmlns:cx7="http://schemas.microsoft.com/office/drawing/2016/5/13/chartex" xmlns:cx8="http://schemas.microsoft.com/office/drawing/2016/5/14/chartex" xmlns:mc="http://schemas.openxmlformats.org/markup-compatibility/2006" xmlns:aink="http://schemas.microsoft.com/office/drawing/2016/ink" xmlns:am3d="http://schemas.microsoft.com/office/drawing/2017/model3d" xmlns:o="urn:schemas-microsoft-com:office:office" xmlns:oel="http://schemas.microsoft.com/office/2019/extlst" xmlns:r="http://schemas.openxmlformats.org/officeDocument/2006/relationships" xmlns:m="http://schemas.openxmlformats.org/officeDocument/2006/math" xmlns:v="urn:schemas-microsoft-com:vml" xmlns:wp14="http://schemas.microsoft.com/office/word/2010/wordprocessingDrawing" xmlns:wp="http://schemas.openxmlformats.org/drawingml/2006/wordprocessingDrawing" xmlns:w10="urn:schemas-microsoft-com:office:word" xmlns:w="http://schemas.openxmlformats.org/wordprocessingml/2006/main" xmlns:w14="http://schemas.microsoft.com/office/word/2010/wordml" xmlns:w15="http://schemas.microsoft.com/office/word/2012/wordml" xmlns:w16cex="http://schemas.microsoft.com/office/word/2018/wordml/cex" xmlns:w16cid="http://schemas.microsoft.com/office/word/2016/wordml/cid" xmlns:w16="http://schemas.microsoft.com/office/word/2018/wordml" xmlns:w16du="http://schemas.microsoft.com/office/word/2023/wordml/word16du" xmlns:w16sdtdh="http://schemas.microsoft.com/office/word/2020/wordml/sdtdatahash" xmlns:w16sdtfl="http://schemas.microsoft.com/office/word/2024/wordml/sdtformatlock" xmlns:w16se="http://schemas.microsoft.com/office/word/2015/wordml/symex" xmlns:wpg="http://schemas.microsoft.com/office/word/2010/wordprocessingGroup" xmlns:wpi="http://schemas.microsoft.com/office/word/2010/wordprocessingInk" xmlns:wne="http://schemas.microsoft.com/office/word/2006/wordml" xmlns:wps="http://schemas.microsoft.com/office/word/2010/wordprocessingShape" mc:Ignorable="w14 w15 w16se w16cid w16 w16cex w16sdtdh w16sdtfl w16du wp14">
+<w:endnotes xmlns:wpc="http://schemas.microsoft.com/office/word/2010/wordprocessingCanvas" xmlns:cx="http://schemas.microsoft.com/office/drawing/2014/chartex" xmlns:cx1="http://schemas.microsoft.com/office/drawing/2015/9/8/chartex" xmlns:cx2="http://schemas.microsoft.com/office/drawing/2015/10/21/chartex" xmlns:cx3="http://schemas.microsoft.com/office/drawing/2016/5/9/chartex" xmlns:cx4="http://schemas.microsoft.com/office/drawing/2016/5/10/chartex" xmlns:cx5="http://schemas.microsoft.com/office/drawing/2016/5/11/chartex" xmlns:cx6="http://schemas.microsoft.com/office/drawing/2016/5/12/chartex" xmlns:cx7="http://schemas.microsoft.com/office/drawing/2016/5/13/chartex" xmlns:cx8="http://schemas.microsoft.com/office/drawing/2016/5/14/chartex" xmlns:mc="http://schemas.openxmlformats.org/markup-compatibility/2006" xmlns:aink="http://schemas.microsoft.com/office/drawing/2016/ink" xmlns:am3d="http://schemas.microsoft.com/office/drawing/2017/model3d" xmlns:o="urn:schemas-microsoft-com:office:office" xmlns:oel="http://schemas.microsoft.com/office/2019/extlst" xmlns:r="http://schemas.openxmlformats.org/officeDocument/2006/relationships" xmlns:m="http://schemas.openxmlformats.org/officeDocument/2006/math" xmlns:v="urn:schemas-microsoft-com:vml" xmlns:wp14="http://schemas.microsoft.com/office/word/2010/wordprocessingDrawing" xmlns:wp="http://schemas.openxmlformats.org/drawingml/2006/wordprocessingDrawing" xmlns:w10="urn:schemas-microsoft-com:office:word" xmlns:w="http://schemas.openxmlformats.org/wordprocessingml/2006/main" xmlns:w14="http://schemas.microsoft.com/office/word/2010/wordml" xmlns:w15="http://schemas.microsoft.com/office/word/2012/wordml" xmlns:w16cei="http://schemas.microsoft.com/office/word/2026/wordml/cei" xmlns:w16cex="http://schemas.microsoft.com/office/word/2018/wordml/cex" xmlns:w16cid="http://schemas.microsoft.com/office/word/2016/wordml/cid" xmlns:w16="http://schemas.microsoft.com/office/word/2018/wordml" xmlns:w16du="http://schemas.microsoft.com/office/word/2023/wordml/word16du" xmlns:w16sdtdh="http://schemas.microsoft.com/office/word/2020/wordml/sdtdatahash" xmlns:w16sdtfl="http://schemas.microsoft.com/office/word/2024/wordml/sdtformatlock" xmlns:w16se="http://schemas.microsoft.com/office/word/2015/wordml/symex" xmlns:wpg="http://schemas.microsoft.com/office/word/2010/wordprocessingGroup" xmlns:wpi="http://schemas.microsoft.com/office/word/2010/wordprocessingInk" xmlns:wne="http://schemas.microsoft.com/office/word/2006/wordml" xmlns:wps="http://schemas.microsoft.com/office/word/2010/wordprocessingShape" mc:Ignorable="w14 w15 w16se w16cid w16 w16cex w16sdtdh w16sdtfl w16du wp14">
   <w:endnote w:type="separator" w:id="-1">
     <w:p>
       <w:r>
@@ -24691,7 +24760,7 @@
 </file>
 
 <file path=word/footer1.xml><?xml version="1.0" encoding="utf-8"?>
-<w:ftr xmlns:wpc="http://schemas.microsoft.com/office/word/2010/wordprocessingCanvas" xmlns:cx="http://schemas.microsoft.com/office/drawing/2014/chartex" xmlns:cx1="http://schemas.microsoft.com/office/drawing/2015/9/8/chartex" xmlns:cx2="http://schemas.microsoft.com/office/drawing/2015/10/21/chartex" xmlns:cx3="http://schemas.microsoft.com/office/drawing/2016/5/9/chartex" xmlns:cx4="http://schemas.microsoft.com/office/drawing/2016/5/10/chartex" xmlns:cx5="http://schemas.microsoft.com/office/drawing/2016/5/11/chartex" xmlns:cx6="http://schemas.microsoft.com/office/drawing/2016/5/12/chartex" xmlns:cx7="http://schemas.microsoft.com/office/drawing/2016/5/13/chartex" xmlns:cx8="http://schemas.microsoft.com/office/drawing/2016/5/14/chartex" xmlns:mc="http://schemas.openxmlformats.org/markup-compatibility/2006" xmlns:aink="http://schemas.microsoft.com/office/drawing/2016/ink" xmlns:am3d="http://schemas.microsoft.com/office/drawing/2017/model3d" xmlns:o="urn:schemas-microsoft-com:office:office" xmlns:oel="http://schemas.microsoft.com/office/2019/extlst" xmlns:r="http://schemas.openxmlformats.org/officeDocument/2006/relationships" xmlns:m="http://schemas.openxmlformats.org/officeDocument/2006/math" xmlns:v="urn:schemas-microsoft-com:vml" xmlns:wp14="http://schemas.microsoft.com/office/word/2010/wordprocessingDrawing" xmlns:wp="http://schemas.openxmlformats.org/drawingml/2006/wordprocessingDrawing" xmlns:w10="urn:schemas-microsoft-com:office:word" xmlns:w="http://schemas.openxmlformats.org/wordprocessingml/2006/main" xmlns:w14="http://schemas.microsoft.com/office/word/2010/wordml" xmlns:w15="http://schemas.microsoft.com/office/word/2012/wordml" xmlns:w16cex="http://schemas.microsoft.com/office/word/2018/wordml/cex" xmlns:w16cid="http://schemas.microsoft.com/office/word/2016/wordml/cid" xmlns:w16="http://schemas.microsoft.com/office/word/2018/wordml" xmlns:w16du="http://schemas.microsoft.com/office/word/2023/wordml/word16du" xmlns:w16sdtdh="http://schemas.microsoft.com/office/word/2020/wordml/sdtdatahash" xmlns:w16sdtfl="http://schemas.microsoft.com/office/word/2024/wordml/sdtformatlock" xmlns:w16se="http://schemas.microsoft.com/office/word/2015/wordml/symex" xmlns:wpg="http://schemas.microsoft.com/office/word/2010/wordprocessingGroup" xmlns:wpi="http://schemas.microsoft.com/office/word/2010/wordprocessingInk" xmlns:wne="http://schemas.microsoft.com/office/word/2006/wordml" xmlns:wps="http://schemas.microsoft.com/office/word/2010/wordprocessingShape" mc:Ignorable="w14 w15 w16se w16cid w16 w16cex w16sdtdh w16sdtfl w16du wp14">
+<w:ftr xmlns:wpc="http://schemas.microsoft.com/office/word/2010/wordprocessingCanvas" xmlns:cx="http://schemas.microsoft.com/office/drawing/2014/chartex" xmlns:cx1="http://schemas.microsoft.com/office/drawing/2015/9/8/chartex" xmlns:cx2="http://schemas.microsoft.com/office/drawing/2015/10/21/chartex" xmlns:cx3="http://schemas.microsoft.com/office/drawing/2016/5/9/chartex" xmlns:cx4="http://schemas.microsoft.com/office/drawing/2016/5/10/chartex" xmlns:cx5="http://schemas.microsoft.com/office/drawing/2016/5/11/chartex" xmlns:cx6="http://schemas.microsoft.com/office/drawing/2016/5/12/chartex" xmlns:cx7="http://schemas.microsoft.com/office/drawing/2016/5/13/chartex" xmlns:cx8="http://schemas.microsoft.com/office/drawing/2016/5/14/chartex" xmlns:mc="http://schemas.openxmlformats.org/markup-compatibility/2006" xmlns:aink="http://schemas.microsoft.com/office/drawing/2016/ink" xmlns:am3d="http://schemas.microsoft.com/office/drawing/2017/model3d" xmlns:o="urn:schemas-microsoft-com:office:office" xmlns:oel="http://schemas.microsoft.com/office/2019/extlst" xmlns:r="http://schemas.openxmlformats.org/officeDocument/2006/relationships" xmlns:m="http://schemas.openxmlformats.org/officeDocument/2006/math" xmlns:v="urn:schemas-microsoft-com:vml" xmlns:wp14="http://schemas.microsoft.com/office/word/2010/wordprocessingDrawing" xmlns:wp="http://schemas.openxmlformats.org/drawingml/2006/wordprocessingDrawing" xmlns:w10="urn:schemas-microsoft-com:office:word" xmlns:w="http://schemas.openxmlformats.org/wordprocessingml/2006/main" xmlns:w14="http://schemas.microsoft.com/office/word/2010/wordml" xmlns:w15="http://schemas.microsoft.com/office/word/2012/wordml" xmlns:w16cei="http://schemas.microsoft.com/office/word/2026/wordml/cei" xmlns:w16cex="http://schemas.microsoft.com/office/word/2018/wordml/cex" xmlns:w16cid="http://schemas.microsoft.com/office/word/2016/wordml/cid" xmlns:w16="http://schemas.microsoft.com/office/word/2018/wordml" xmlns:w16du="http://schemas.microsoft.com/office/word/2023/wordml/word16du" xmlns:w16sdtdh="http://schemas.microsoft.com/office/word/2020/wordml/sdtdatahash" xmlns:w16sdtfl="http://schemas.microsoft.com/office/word/2024/wordml/sdtformatlock" xmlns:w16se="http://schemas.microsoft.com/office/word/2015/wordml/symex" xmlns:wpg="http://schemas.microsoft.com/office/word/2010/wordprocessingGroup" xmlns:wpi="http://schemas.microsoft.com/office/word/2010/wordprocessingInk" xmlns:wne="http://schemas.microsoft.com/office/word/2006/wordml" xmlns:wps="http://schemas.microsoft.com/office/word/2010/wordprocessingShape" mc:Ignorable="w14 w15 w16se w16cid w16 w16cex w16sdtdh w16sdtfl w16du wp14">
   <w:p>
     <w:pPr>
       <w:pStyle w:val="Footer"/>
@@ -24751,7 +24820,7 @@
 </file>
 
 <file path=word/footnotes.xml><?xml version="1.0" encoding="utf-8"?>
-<w:footnotes xmlns:wpc="http://schemas.microsoft.com/office/word/2010/wordprocessingCanvas" xmlns:cx="http://schemas.microsoft.com/office/drawing/2014/chartex" xmlns:cx1="http://schemas.microsoft.com/office/drawing/2015/9/8/chartex" xmlns:cx2="http://schemas.microsoft.com/office/drawing/2015/10/21/chartex" xmlns:cx3="http://schemas.microsoft.com/office/drawing/2016/5/9/chartex" xmlns:cx4="http://schemas.microsoft.com/office/drawing/2016/5/10/chartex" xmlns:cx5="http://schemas.microsoft.com/office/drawing/2016/5/11/chartex" xmlns:cx6="http://schemas.microsoft.com/office/drawing/2016/5/12/chartex" xmlns:cx7="http://schemas.microsoft.com/office/drawing/2016/5/13/chartex" xmlns:cx8="http://schemas.microsoft.com/office/drawing/2016/5/14/chartex" xmlns:mc="http://schemas.openxmlformats.org/markup-compatibility/2006" xmlns:aink="http://schemas.microsoft.com/office/drawing/2016/ink" xmlns:am3d="http://schemas.microsoft.com/office/drawing/2017/model3d" xmlns:o="urn:schemas-microsoft-com:office:office" xmlns:oel="http://schemas.microsoft.com/office/2019/extlst" xmlns:r="http://schemas.openxmlformats.org/officeDocument/2006/relationships" xmlns:m="http://schemas.openxmlformats.org/officeDocument/2006/math" xmlns:v="urn:schemas-microsoft-com:vml" xmlns:wp14="http://schemas.microsoft.com/office/word/2010/wordprocessingDrawing" xmlns:wp="http://schemas.openxmlformats.org/drawingml/2006/wordprocessingDrawing" xmlns:w10="urn:schemas-microsoft-com:office:word" xmlns:w="http://schemas.openxmlformats.org/wordprocessingml/2006/main" xmlns:w14="http://schemas.microsoft.com/office/word/2010/wordml" xmlns:w15="http://schemas.microsoft.com/office/word/2012/wordml" xmlns:w16cex="http://schemas.microsoft.com/office/word/2018/wordml/cex" xmlns:w16cid="http://schemas.microsoft.com/office/word/2016/wordml/cid" xmlns:w16="http://schemas.microsoft.com/office/word/2018/wordml" xmlns:w16du="http://schemas.microsoft.com/office/word/2023/wordml/word16du" xmlns:w16sdtdh="http://schemas.microsoft.com/office/word/2020/wordml/sdtdatahash" xmlns:w16sdtfl="http://schemas.microsoft.com/office/word/2024/wordml/sdtformatlock" xmlns:w16se="http://schemas.microsoft.com/office/word/2015/wordml/symex" xmlns:wpg="http://schemas.microsoft.com/office/word/2010/wordprocessingGroup" xmlns:wpi="http://schemas.microsoft.com/office/word/2010/wordprocessingInk" xmlns:wne="http://schemas.microsoft.com/office/word/2006/wordml" xmlns:wps="http://schemas.microsoft.com/office/word/2010/wordprocessingShape" mc:Ignorable="w14 w15 w16se w16cid w16 w16cex w16sdtdh w16sdtfl w16du wp14">
+<w:footnotes xmlns:wpc="http://schemas.microsoft.com/office/word/2010/wordprocessingCanvas" xmlns:cx="http://schemas.microsoft.com/office/drawing/2014/chartex" xmlns:cx1="http://schemas.microsoft.com/office/drawing/2015/9/8/chartex" xmlns:cx2="http://schemas.microsoft.com/office/drawing/2015/10/21/chartex" xmlns:cx3="http://schemas.microsoft.com/office/drawing/2016/5/9/chartex" xmlns:cx4="http://schemas.microsoft.com/office/drawing/2016/5/10/chartex" xmlns:cx5="http://schemas.microsoft.com/office/drawing/2016/5/11/chartex" xmlns:cx6="http://schemas.microsoft.com/office/drawing/2016/5/12/chartex" xmlns:cx7="http://schemas.microsoft.com/office/drawing/2016/5/13/chartex" xmlns:cx8="http://schemas.microsoft.com/office/drawing/2016/5/14/chartex" xmlns:mc="http://schemas.openxmlformats.org/markup-compatibility/2006" xmlns:aink="http://schemas.microsoft.com/office/drawing/2016/ink" xmlns:am3d="http://schemas.microsoft.com/office/drawing/2017/model3d" xmlns:o="urn:schemas-microsoft-com:office:office" xmlns:oel="http://schemas.microsoft.com/office/2019/extlst" xmlns:r="http://schemas.openxmlformats.org/officeDocument/2006/relationships" xmlns:m="http://schemas.openxmlformats.org/officeDocument/2006/math" xmlns:v="urn:schemas-microsoft-com:vml" xmlns:wp14="http://schemas.microsoft.com/office/word/2010/wordprocessingDrawing" xmlns:wp="http://schemas.openxmlformats.org/drawingml/2006/wordprocessingDrawing" xmlns:w10="urn:schemas-microsoft-com:office:word" xmlns:w="http://schemas.openxmlformats.org/wordprocessingml/2006/main" xmlns:w14="http://schemas.microsoft.com/office/word/2010/wordml" xmlns:w15="http://schemas.microsoft.com/office/word/2012/wordml" xmlns:w16cei="http://schemas.microsoft.com/office/word/2026/wordml/cei" xmlns:w16cex="http://schemas.microsoft.com/office/word/2018/wordml/cex" xmlns:w16cid="http://schemas.microsoft.com/office/word/2016/wordml/cid" xmlns:w16="http://schemas.microsoft.com/office/word/2018/wordml" xmlns:w16du="http://schemas.microsoft.com/office/word/2023/wordml/word16du" xmlns:w16sdtdh="http://schemas.microsoft.com/office/word/2020/wordml/sdtdatahash" xmlns:w16sdtfl="http://schemas.microsoft.com/office/word/2024/wordml/sdtformatlock" xmlns:w16se="http://schemas.microsoft.com/office/word/2015/wordml/symex" xmlns:wpg="http://schemas.microsoft.com/office/word/2010/wordprocessingGroup" xmlns:wpi="http://schemas.microsoft.com/office/word/2010/wordprocessingInk" xmlns:wne="http://schemas.microsoft.com/office/word/2006/wordml" xmlns:wps="http://schemas.microsoft.com/office/word/2010/wordprocessingShape" mc:Ignorable="w14 w15 w16se w16cid w16 w16cex w16sdtdh w16sdtfl w16du wp14">
   <w:footnote w:type="separator" w:id="-1">
     <w:p>
       <w:r>
@@ -24770,7 +24839,7 @@
 </file>
 
 <file path=word/header1.xml><?xml version="1.0" encoding="utf-8"?>
-<w:hdr xmlns:wpc="http://schemas.microsoft.com/office/word/2010/wordprocessingCanvas" xmlns:cx="http://schemas.microsoft.com/office/drawing/2014/chartex" xmlns:cx1="http://schemas.microsoft.com/office/drawing/2015/9/8/chartex" xmlns:cx2="http://schemas.microsoft.com/office/drawing/2015/10/21/chartex" xmlns:cx3="http://schemas.microsoft.com/office/drawing/2016/5/9/chartex" xmlns:cx4="http://schemas.microsoft.com/office/drawing/2016/5/10/chartex" xmlns:cx5="http://schemas.microsoft.com/office/drawing/2016/5/11/chartex" xmlns:cx6="http://schemas.microsoft.com/office/drawing/2016/5/12/chartex" xmlns:cx7="http://schemas.microsoft.com/office/drawing/2016/5/13/chartex" xmlns:cx8="http://schemas.microsoft.com/office/drawing/2016/5/14/chartex" xmlns:mc="http://schemas.openxmlformats.org/markup-compatibility/2006" xmlns:aink="http://schemas.microsoft.com/office/drawing/2016/ink" xmlns:am3d="http://schemas.microsoft.com/office/drawing/2017/model3d" xmlns:o="urn:schemas-microsoft-com:office:office" xmlns:oel="http://schemas.microsoft.com/office/2019/extlst" xmlns:r="http://schemas.openxmlformats.org/officeDocument/2006/relationships" xmlns:m="http://schemas.openxmlformats.org/officeDocument/2006/math" xmlns:v="urn:schemas-microsoft-com:vml" xmlns:wp14="http://schemas.microsoft.com/office/word/2010/wordprocessingDrawing" xmlns:wp="http://schemas.openxmlformats.org/drawingml/2006/wordprocessingDrawing" xmlns:w10="urn:schemas-microsoft-com:office:word" xmlns:w="http://schemas.openxmlformats.org/wordprocessingml/2006/main" xmlns:w14="http://schemas.microsoft.com/office/word/2010/wordml" xmlns:w15="http://schemas.microsoft.com/office/word/2012/wordml" xmlns:w16cex="http://schemas.microsoft.com/office/word/2018/wordml/cex" xmlns:w16cid="http://schemas.microsoft.com/office/word/2016/wordml/cid" xmlns:w16="http://schemas.microsoft.com/office/word/2018/wordml" xmlns:w16du="http://schemas.microsoft.com/office/word/2023/wordml/word16du" xmlns:w16sdtdh="http://schemas.microsoft.com/office/word/2020/wordml/sdtdatahash" xmlns:w16sdtfl="http://schemas.microsoft.com/office/word/2024/wordml/sdtformatlock" xmlns:w16se="http://schemas.microsoft.com/office/word/2015/wordml/symex" xmlns:wpg="http://schemas.microsoft.com/office/word/2010/wordprocessingGroup" xmlns:wpi="http://schemas.microsoft.com/office/word/2010/wordprocessingInk" xmlns:wne="http://schemas.microsoft.com/office/word/2006/wordml" xmlns:wps="http://schemas.microsoft.com/office/word/2010/wordprocessingShape" mc:Ignorable="w14 w15 w16se w16cid w16 w16cex w16sdtdh w16sdtfl w16du wp14">
+<w:hdr xmlns:wpc="http://schemas.microsoft.com/office/word/2010/wordprocessingCanvas" xmlns:cx="http://schemas.microsoft.com/office/drawing/2014/chartex" xmlns:cx1="http://schemas.microsoft.com/office/drawing/2015/9/8/chartex" xmlns:cx2="http://schemas.microsoft.com/office/drawing/2015/10/21/chartex" xmlns:cx3="http://schemas.microsoft.com/office/drawing/2016/5/9/chartex" xmlns:cx4="http://schemas.microsoft.com/office/drawing/2016/5/10/chartex" xmlns:cx5="http://schemas.microsoft.com/office/drawing/2016/5/11/chartex" xmlns:cx6="http://schemas.microsoft.com/office/drawing/2016/5/12/chartex" xmlns:cx7="http://schemas.microsoft.com/office/drawing/2016/5/13/chartex" xmlns:cx8="http://schemas.microsoft.com/office/drawing/2016/5/14/chartex" xmlns:mc="http://schemas.openxmlformats.org/markup-compatibility/2006" xmlns:aink="http://schemas.microsoft.com/office/drawing/2016/ink" xmlns:am3d="http://schemas.microsoft.com/office/drawing/2017/model3d" xmlns:o="urn:schemas-microsoft-com:office:office" xmlns:oel="http://schemas.microsoft.com/office/2019/extlst" xmlns:r="http://schemas.openxmlformats.org/officeDocument/2006/relationships" xmlns:m="http://schemas.openxmlformats.org/officeDocument/2006/math" xmlns:v="urn:schemas-microsoft-com:vml" xmlns:wp14="http://schemas.microsoft.com/office/word/2010/wordprocessingDrawing" xmlns:wp="http://schemas.openxmlformats.org/drawingml/2006/wordprocessingDrawing" xmlns:w10="urn:schemas-microsoft-com:office:word" xmlns:w="http://schemas.openxmlformats.org/wordprocessingml/2006/main" xmlns:w14="http://schemas.microsoft.com/office/word/2010/wordml" xmlns:w15="http://schemas.microsoft.com/office/word/2012/wordml" xmlns:w16cei="http://schemas.microsoft.com/office/word/2026/wordml/cei" xmlns:w16cex="http://schemas.microsoft.com/office/word/2018/wordml/cex" xmlns:w16cid="http://schemas.microsoft.com/office/word/2016/wordml/cid" xmlns:w16="http://schemas.microsoft.com/office/word/2018/wordml" xmlns:w16du="http://schemas.microsoft.com/office/word/2023/wordml/word16du" xmlns:w16sdtdh="http://schemas.microsoft.com/office/word/2020/wordml/sdtdatahash" xmlns:w16sdtfl="http://schemas.microsoft.com/office/word/2024/wordml/sdtformatlock" xmlns:w16se="http://schemas.microsoft.com/office/word/2015/wordml/symex" xmlns:wpg="http://schemas.microsoft.com/office/word/2010/wordprocessingGroup" xmlns:wpi="http://schemas.microsoft.com/office/word/2010/wordprocessingInk" xmlns:wne="http://schemas.microsoft.com/office/word/2006/wordml" xmlns:wps="http://schemas.microsoft.com/office/word/2010/wordprocessingShape" mc:Ignorable="w14 w15 w16se w16cid w16 w16cex w16sdtdh w16sdtfl w16du wp14">
   <w:p>
     <w:pPr>
       <w:pStyle w:val="Header"/>
@@ -24790,7 +24859,7 @@
 </file>
 
 <file path=word/header2.xml><?xml version="1.0" encoding="utf-8"?>
-<w:hdr xmlns:wpc="http://schemas.microsoft.com/office/word/2010/wordprocessingCanvas" xmlns:cx="http://schemas.microsoft.com/office/drawing/2014/chartex" xmlns:cx1="http://schemas.microsoft.com/office/drawing/2015/9/8/chartex" xmlns:cx2="http://schemas.microsoft.com/office/drawing/2015/10/21/chartex" xmlns:cx3="http://schemas.microsoft.com/office/drawing/2016/5/9/chartex" xmlns:cx4="http://schemas.microsoft.com/office/drawing/2016/5/10/chartex" xmlns:cx5="http://schemas.microsoft.com/office/drawing/2016/5/11/chartex" xmlns:cx6="http://schemas.microsoft.com/office/drawing/2016/5/12/chartex" xmlns:cx7="http://schemas.microsoft.com/office/drawing/2016/5/13/chartex" xmlns:cx8="http://schemas.microsoft.com/office/drawing/2016/5/14/chartex" xmlns:mc="http://schemas.openxmlformats.org/markup-compatibility/2006" xmlns:aink="http://schemas.microsoft.com/office/drawing/2016/ink" xmlns:am3d="http://schemas.microsoft.com/office/drawing/2017/model3d" xmlns:o="urn:schemas-microsoft-com:office:office" xmlns:oel="http://schemas.microsoft.com/office/2019/extlst" xmlns:r="http://schemas.openxmlformats.org/officeDocument/2006/relationships" xmlns:m="http://schemas.openxmlformats.org/officeDocument/2006/math" xmlns:v="urn:schemas-microsoft-com:vml" xmlns:wp14="http://schemas.microsoft.com/office/word/2010/wordprocessingDrawing" xmlns:wp="http://schemas.openxmlformats.org/drawingml/2006/wordprocessingDrawing" xmlns:w10="urn:schemas-microsoft-com:office:word" xmlns:w="http://schemas.openxmlformats.org/wordprocessingml/2006/main" xmlns:w14="http://schemas.microsoft.com/office/word/2010/wordml" xmlns:w15="http://schemas.microsoft.com/office/word/2012/wordml" xmlns:w16cex="http://schemas.microsoft.com/office/word/2018/wordml/cex" xmlns:w16cid="http://schemas.microsoft.com/office/word/2016/wordml/cid" xmlns:w16="http://schemas.microsoft.com/office/word/2018/wordml" xmlns:w16du="http://schemas.microsoft.com/office/word/2023/wordml/word16du" xmlns:w16sdtdh="http://schemas.microsoft.com/office/word/2020/wordml/sdtdatahash" xmlns:w16sdtfl="http://schemas.microsoft.com/office/word/2024/wordml/sdtformatlock" xmlns:w16se="http://schemas.microsoft.com/office/word/2015/wordml/symex" xmlns:wpg="http://schemas.microsoft.com/office/word/2010/wordprocessingGroup" xmlns:wpi="http://schemas.microsoft.com/office/word/2010/wordprocessingInk" xmlns:wne="http://schemas.microsoft.com/office/word/2006/wordml" xmlns:wps="http://schemas.microsoft.com/office/word/2010/wordprocessingShape" mc:Ignorable="w14 w15 w16se w16cid w16 w16cex w16sdtdh w16sdtfl w16du wp14">
+<w:hdr xmlns:wpc="http://schemas.microsoft.com/office/word/2010/wordprocessingCanvas" xmlns:cx="http://schemas.microsoft.com/office/drawing/2014/chartex" xmlns:cx1="http://schemas.microsoft.com/office/drawing/2015/9/8/chartex" xmlns:cx2="http://schemas.microsoft.com/office/drawing/2015/10/21/chartex" xmlns:cx3="http://schemas.microsoft.com/office/drawing/2016/5/9/chartex" xmlns:cx4="http://schemas.microsoft.com/office/drawing/2016/5/10/chartex" xmlns:cx5="http://schemas.microsoft.com/office/drawing/2016/5/11/chartex" xmlns:cx6="http://schemas.microsoft.com/office/drawing/2016/5/12/chartex" xmlns:cx7="http://schemas.microsoft.com/office/drawing/2016/5/13/chartex" xmlns:cx8="http://schemas.microsoft.com/office/drawing/2016/5/14/chartex" xmlns:mc="http://schemas.openxmlformats.org/markup-compatibility/2006" xmlns:aink="http://schemas.microsoft.com/office/drawing/2016/ink" xmlns:am3d="http://schemas.microsoft.com/office/drawing/2017/model3d" xmlns:o="urn:schemas-microsoft-com:office:office" xmlns:oel="http://schemas.microsoft.com/office/2019/extlst" xmlns:r="http://schemas.openxmlformats.org/officeDocument/2006/relationships" xmlns:m="http://schemas.openxmlformats.org/officeDocument/2006/math" xmlns:v="urn:schemas-microsoft-com:vml" xmlns:wp14="http://schemas.microsoft.com/office/word/2010/wordprocessingDrawing" xmlns:wp="http://schemas.openxmlformats.org/drawingml/2006/wordprocessingDrawing" xmlns:w10="urn:schemas-microsoft-com:office:word" xmlns:w="http://schemas.openxmlformats.org/wordprocessingml/2006/main" xmlns:w14="http://schemas.microsoft.com/office/word/2010/wordml" xmlns:w15="http://schemas.microsoft.com/office/word/2012/wordml" xmlns:w16cei="http://schemas.microsoft.com/office/word/2026/wordml/cei" xmlns:w16cex="http://schemas.microsoft.com/office/word/2018/wordml/cex" xmlns:w16cid="http://schemas.microsoft.com/office/word/2016/wordml/cid" xmlns:w16="http://schemas.microsoft.com/office/word/2018/wordml" xmlns:w16du="http://schemas.microsoft.com/office/word/2023/wordml/word16du" xmlns:w16sdtdh="http://schemas.microsoft.com/office/word/2020/wordml/sdtdatahash" xmlns:w16sdtfl="http://schemas.microsoft.com/office/word/2024/wordml/sdtformatlock" xmlns:w16se="http://schemas.microsoft.com/office/word/2015/wordml/symex" xmlns:wpg="http://schemas.microsoft.com/office/word/2010/wordprocessingGroup" xmlns:wpi="http://schemas.microsoft.com/office/word/2010/wordprocessingInk" xmlns:wne="http://schemas.microsoft.com/office/word/2006/wordml" xmlns:wps="http://schemas.microsoft.com/office/word/2010/wordprocessingShape" mc:Ignorable="w14 w15 w16se w16cid w16 w16cex w16sdtdh w16sdtfl w16du wp14">
   <w:p>
     <w:pPr>
       <w:pStyle w:val="Header"/>
@@ -24806,7 +24875,7 @@
     </w:r>
     <w:fldSimple w:instr=" DOCPROPERTY  &quot;Extension Version&quot;  \* MERGEFORMAT ">
       <w:r>
-        <w:t>8.2</w:t>
+        <w:t>8.3</w:t>
       </w:r>
     </w:fldSimple>
     <w:r>
@@ -24824,7 +24893,7 @@
 </file>
 
 <file path=word/numbering.xml><?xml version="1.0" encoding="utf-8"?>
-<w:numbering xmlns:wpc="http://schemas.microsoft.com/office/word/2010/wordprocessingCanvas" xmlns:cx="http://schemas.microsoft.com/office/drawing/2014/chartex" xmlns:cx1="http://schemas.microsoft.com/office/drawing/2015/9/8/chartex" xmlns:cx2="http://schemas.microsoft.com/office/drawing/2015/10/21/chartex" xmlns:cx3="http://schemas.microsoft.com/office/drawing/2016/5/9/chartex" xmlns:cx4="http://schemas.microsoft.com/office/drawing/2016/5/10/chartex" xmlns:cx5="http://schemas.microsoft.com/office/drawing/2016/5/11/chartex" xmlns:cx6="http://schemas.microsoft.com/office/drawing/2016/5/12/chartex" xmlns:cx7="http://schemas.microsoft.com/office/drawing/2016/5/13/chartex" xmlns:cx8="http://schemas.microsoft.com/office/drawing/2016/5/14/chartex" xmlns:mc="http://schemas.openxmlformats.org/markup-compatibility/2006" xmlns:aink="http://schemas.microsoft.com/office/drawing/2016/ink" xmlns:am3d="http://schemas.microsoft.com/office/drawing/2017/model3d" xmlns:o="urn:schemas-microsoft-com:office:office" xmlns:oel="http://schemas.microsoft.com/office/2019/extlst" xmlns:r="http://schemas.openxmlformats.org/officeDocument/2006/relationships" xmlns:m="http://schemas.openxmlformats.org/officeDocument/2006/math" xmlns:v="urn:schemas-microsoft-com:vml" xmlns:wp14="http://schemas.microsoft.com/office/word/2010/wordprocessingDrawing" xmlns:wp="http://schemas.openxmlformats.org/drawingml/2006/wordprocessingDrawing" xmlns:w10="urn:schemas-microsoft-com:office:word" xmlns:w="http://schemas.openxmlformats.org/wordprocessingml/2006/main" xmlns:w14="http://schemas.microsoft.com/office/word/2010/wordml" xmlns:w15="http://schemas.microsoft.com/office/word/2012/wordml" xmlns:w16cex="http://schemas.microsoft.com/office/word/2018/wordml/cex" xmlns:w16cid="http://schemas.microsoft.com/office/word/2016/wordml/cid" xmlns:w16="http://schemas.microsoft.com/office/word/2018/wordml" xmlns:w16du="http://schemas.microsoft.com/office/word/2023/wordml/word16du" xmlns:w16sdtdh="http://schemas.microsoft.com/office/word/2020/wordml/sdtdatahash" xmlns:w16sdtfl="http://schemas.microsoft.com/office/word/2024/wordml/sdtformatlock" xmlns:w16se="http://schemas.microsoft.com/office/word/2015/wordml/symex" xmlns:wpg="http://schemas.microsoft.com/office/word/2010/wordprocessingGroup" xmlns:wpi="http://schemas.microsoft.com/office/word/2010/wordprocessingInk" xmlns:wne="http://schemas.microsoft.com/office/word/2006/wordml" xmlns:wps="http://schemas.microsoft.com/office/word/2010/wordprocessingShape" mc:Ignorable="w14 w15 w16se w16cid w16 w16cex w16sdtdh w16sdtfl w16du wp14">
+<w:numbering xmlns:wpc="http://schemas.microsoft.com/office/word/2010/wordprocessingCanvas" xmlns:cx="http://schemas.microsoft.com/office/drawing/2014/chartex" xmlns:cx1="http://schemas.microsoft.com/office/drawing/2015/9/8/chartex" xmlns:cx2="http://schemas.microsoft.com/office/drawing/2015/10/21/chartex" xmlns:cx3="http://schemas.microsoft.com/office/drawing/2016/5/9/chartex" xmlns:cx4="http://schemas.microsoft.com/office/drawing/2016/5/10/chartex" xmlns:cx5="http://schemas.microsoft.com/office/drawing/2016/5/11/chartex" xmlns:cx6="http://schemas.microsoft.com/office/drawing/2016/5/12/chartex" xmlns:cx7="http://schemas.microsoft.com/office/drawing/2016/5/13/chartex" xmlns:cx8="http://schemas.microsoft.com/office/drawing/2016/5/14/chartex" xmlns:mc="http://schemas.openxmlformats.org/markup-compatibility/2006" xmlns:aink="http://schemas.microsoft.com/office/drawing/2016/ink" xmlns:am3d="http://schemas.microsoft.com/office/drawing/2017/model3d" xmlns:o="urn:schemas-microsoft-com:office:office" xmlns:oel="http://schemas.microsoft.com/office/2019/extlst" xmlns:r="http://schemas.openxmlformats.org/officeDocument/2006/relationships" xmlns:m="http://schemas.openxmlformats.org/officeDocument/2006/math" xmlns:v="urn:schemas-microsoft-com:vml" xmlns:wp14="http://schemas.microsoft.com/office/word/2010/wordprocessingDrawing" xmlns:wp="http://schemas.openxmlformats.org/drawingml/2006/wordprocessingDrawing" xmlns:w10="urn:schemas-microsoft-com:office:word" xmlns:w="http://schemas.openxmlformats.org/wordprocessingml/2006/main" xmlns:w14="http://schemas.microsoft.com/office/word/2010/wordml" xmlns:w15="http://schemas.microsoft.com/office/word/2012/wordml" xmlns:w16cei="http://schemas.microsoft.com/office/word/2026/wordml/cei" xmlns:w16cex="http://schemas.microsoft.com/office/word/2018/wordml/cex" xmlns:w16cid="http://schemas.microsoft.com/office/word/2016/wordml/cid" xmlns:w16="http://schemas.microsoft.com/office/word/2018/wordml" xmlns:w16du="http://schemas.microsoft.com/office/word/2023/wordml/word16du" xmlns:w16sdtdh="http://schemas.microsoft.com/office/word/2020/wordml/sdtdatahash" xmlns:w16sdtfl="http://schemas.microsoft.com/office/word/2024/wordml/sdtformatlock" xmlns:w16se="http://schemas.microsoft.com/office/word/2015/wordml/symex" xmlns:wpg="http://schemas.microsoft.com/office/word/2010/wordprocessingGroup" xmlns:wpi="http://schemas.microsoft.com/office/word/2010/wordprocessingInk" xmlns:wne="http://schemas.microsoft.com/office/word/2006/wordml" xmlns:wps="http://schemas.microsoft.com/office/word/2010/wordprocessingShape" mc:Ignorable="w14 w15 w16se w16cid w16 w16cex w16sdtdh w16sdtfl w16du wp14">
   <w:abstractNum w:abstractNumId="0" w15:restartNumberingAfterBreak="0">
     <w:nsid w:val="027F602A"/>
     <w:multiLevelType w:val="multilevel"/>

</xml_diff>